<commit_message>
Polish manuscript layout and simplify sample-size labels
</commit_message>
<xml_diff>
--- a/manuscript/MANUSCRIPT_NEUROCHEMISTRY_INTERNATIONAL_FINAL.docx
+++ b/manuscript/MANUSCRIPT_NEUROCHEMISTRY_INTERNATIONAL_FINAL.docx
@@ -6,14 +6,22 @@
     <w:p>
       <w:pPr>
         <w:pStyle w:val="Heading1"/>
+        <w:rPr>
+          <w:b w:val="1"/>
+        </w:rPr>
+        <w:jc w:val="center"/>
       </w:pPr>
       <w:r>
+        <w:rPr>
+          <w:b w:val="1"/>
+        </w:rPr>
         <w:t xml:space="preserve">TDP-43 knockdown is associated with reduced store-operated Ca²⁺ entry and altered calcium-regulatory RNA profiles in SH-SY5Y cells</w:t>
       </w:r>
     </w:p>
     <w:p>
       <w:pPr>
         <w:pStyle w:val="FirstParagraph"/>
+        <w:jc w:val="center"/>
       </w:pPr>
       <w:r>
         <w:rPr>
@@ -26,6 +34,7 @@
     <w:p>
       <w:pPr>
         <w:pStyle w:val="BodyText"/>
+        <w:jc w:val="center"/>
       </w:pPr>
       <w:r>
         <w:t xml:space="preserve">ᵃ Department of Pharmacology, Faculty of Pharmacy, Ege University, Erzene Mahallesi, Ankara Caddesi No: 172/98, 35040 Bornova, İzmir, Türkiye</w:t>
@@ -34,6 +43,7 @@
     <w:p>
       <w:pPr>
         <w:pStyle w:val="BodyText"/>
+        <w:jc w:val="center"/>
       </w:pPr>
       <w:r>
         <w:t xml:space="preserve">* Corresponding author: Yasemin Eraç, yasemin.erac@ege.edu.tr</w:t>
@@ -43,22 +53,31 @@
     <w:p>
       <w:pPr>
         <w:pStyle w:val="Heading2"/>
+        <w:rPr>
+          <w:b w:val="1"/>
+        </w:rPr>
+        <w:jc w:val="left"/>
       </w:pPr>
       <w:r>
+        <w:rPr>
+          <w:b w:val="1"/>
+        </w:rPr>
         <w:t xml:space="preserve">Abstract</w:t>
       </w:r>
     </w:p>
     <w:p>
       <w:pPr>
         <w:pStyle w:val="FirstParagraph"/>
+        <w:jc w:val="both"/>
       </w:pPr>
       <w:r>
-        <w:t xml:space="preserve">TDP-43 loss is implicated in amyotrophic lateral sclerosis (ALS), but its relationship to store-operated Ca²⁺ entry (SOCE) is unclear. After shRNA-mediated TARDBP depletion in SH-SY5Y cells, TRPC1, STIM1, ORAI1 and ATP2A3 mRNAs increased 1.7- to 3.2-fold, while the Fura-2 SOCE response fell from 1.542 ± 0.282 to 0.245 ± 0.083 Δ(F340/F380) (p = 0.0115; three measurements per group). The ER Ca²⁺ release comparison was inconclusive (p = 0.299). At 48 h, the WST-1 signal was 38.5% lower in four wells per group from one experiment. We reanalysed six public TDP-43-depletion RNA-seq comparisons (38 libraries) for calcium-regulatory expression and splicing, screened eleven comparisons for unannotated junction changes, and assessed alternative polyadenylation and nonsense-mediated decay. CBARP was the most reproducible splicing candidate across species, whereas STIM2, STIMATE and ORAI3 events were supported in the primary RNA-seq model. No confirmed RNA-processing event in the core SOCE machinery explained the functional change. In ALS brain, TRPC1 and SARAF increased and CBARP decreased in six of seven regions, but these tissue associations could not be attributed to TDP-43 loss. TDP-43 knockdown is associated with reduced SOCE and altered calcium-regulatory RNA profiles, without evidence for a single causal RNA event.</w:t>
+        <w:t xml:space="preserve">TDP-43 loss is implicated in amyotrophic lateral sclerosis (ALS), but its relationship to store-operated Ca²⁺ entry (SOCE) is unclear. After shRNA-mediated TARDBP depletion in SH-SY5Y cells, TRPC1, STIM1, ORAI1 and ATP2A3 mRNAs increased 1.7- to 3.2-fold, while the Fura-2 SOCE response fell from 1.542 ± 0.282 to 0.245 ± 0.083 Δ(F340/F380) (p = 0.0115; n = 3). The ER Ca²⁺ release comparison was inconclusive (p = 0.299). At 48 h, the WST-1 signal was 38.5% lower (n = 4). We reanalysed six public TDP-43-depletion RNA-seq comparisons (38 libraries) for calcium-regulatory expression and splicing, screened eleven comparisons for unannotated junction changes, and assessed alternative polyadenylation and nonsense-mediated decay. CBARP was the most reproducible splicing candidate across species, whereas STIM2, STIMATE and ORAI3 events were supported in the primary RNA-seq model. No confirmed RNA-processing event in the core SOCE machinery explained the functional change. In ALS brain, TRPC1 and SARAF increased and CBARP decreased in six of seven regions, but these tissue associations could not be attributed to TDP-43 loss. TDP-43 knockdown is associated with reduced SOCE and altered calcium-regulatory RNA profiles, without evidence for a single causal RNA event.</w:t>
       </w:r>
     </w:p>
     <w:p>
       <w:pPr>
         <w:pStyle w:val="BodyText"/>
+        <w:jc w:val="both"/>
       </w:pPr>
       <w:r>
         <w:rPr>
@@ -79,14 +98,22 @@
     <w:p>
       <w:pPr>
         <w:pStyle w:val="Heading2"/>
+        <w:rPr>
+          <w:b w:val="1"/>
+        </w:rPr>
+        <w:jc w:val="left"/>
       </w:pPr>
       <w:r>
+        <w:rPr>
+          <w:b w:val="1"/>
+        </w:rPr>
         <w:t xml:space="preserve">1. Introduction</w:t>
       </w:r>
     </w:p>
     <w:p>
       <w:pPr>
         <w:pStyle w:val="FirstParagraph"/>
+        <w:jc w:val="both"/>
       </w:pPr>
       <w:r>
         <w:t xml:space="preserve">TAR DNA-binding protein 43 (TDP-43, encoded by</w:t>
@@ -144,6 +171,7 @@
     <w:p>
       <w:pPr>
         <w:pStyle w:val="BodyText"/>
+        <w:jc w:val="both"/>
       </w:pPr>
       <w:r>
         <w:t xml:space="preserve">The principal consequence of nuclear TDP-43 loss is failure to repress cryptic splicing. The best-characterised targets,</w:t>
@@ -217,6 +245,7 @@
     <w:p>
       <w:pPr>
         <w:pStyle w:val="BodyText"/>
+        <w:jc w:val="both"/>
       </w:pPr>
       <w:r>
         <w:t xml:space="preserve">Disturbed intracellular Ca²⁺ homeostasis is a longstanding feature of ALS. Vulnerable motor neurons are notable for low cytosolic Ca²⁺-buffering capacity </w:t>
@@ -387,6 +416,7 @@
     <w:p>
       <w:pPr>
         <w:pStyle w:val="BodyText"/>
+        <w:jc w:val="both"/>
       </w:pPr>
       <w:r>
         <w:t xml:space="preserve">We first measure SOCE and target mRNAs after shRNA-mediated TDP-43 depletion in SH-SY5Y cultures. We then use public RNA-seq datasets to examine calcium-regulatory transcript abundance and RNA processing, applying read-support and robustness checks to the splicing results. Finally, we assess how the candidate transcripts behave in ALS brain and selected neurological comparison cohorts.</w:t>
@@ -397,8 +427,15 @@
     <w:p>
       <w:pPr>
         <w:pStyle w:val="Heading2"/>
+        <w:rPr>
+          <w:b w:val="1"/>
+        </w:rPr>
+        <w:jc w:val="left"/>
       </w:pPr>
       <w:r>
+        <w:rPr>
+          <w:b w:val="1"/>
+        </w:rPr>
         <w:t xml:space="preserve">2. Materials and Methods</w:t>
       </w:r>
     </w:p>
@@ -406,14 +443,22 @@
     <w:p>
       <w:pPr>
         <w:pStyle w:val="Heading3"/>
+        <w:rPr>
+          <w:b w:val="1"/>
+        </w:rPr>
+        <w:jc w:val="left"/>
       </w:pPr>
       <w:r>
+        <w:rPr>
+          <w:b w:val="1"/>
+        </w:rPr>
         <w:t xml:space="preserve">2.1 Public RNA-seq datasets</w:t>
       </w:r>
     </w:p>
     <w:p>
       <w:pPr>
         <w:pStyle w:val="FirstParagraph"/>
+        <w:jc w:val="both"/>
       </w:pPr>
       <w:r>
         <w:t xml:space="preserve">Six comparisons with paired controls and publicly available raw reads were selected for the expression and event-level splicing analyses: SH-SY5Y (GSE296712), induced pluripotent stem cell (iPSC) colonies </w:t>
@@ -630,6 +675,7 @@
     <w:p>
       <w:pPr>
         <w:pStyle w:val="BodyText"/>
+        <w:jc w:val="both"/>
       </w:pPr>
       <w:r>
         <w:t xml:space="preserve">Reads were downloaded with NCBI SRA Toolkit v3.2.1 </w:t>
@@ -779,6 +825,7 @@
     <w:p>
       <w:pPr>
         <w:pStyle w:val="BodyText"/>
+        <w:jc w:val="both"/>
       </w:pPr>
       <w:r>
         <w:t xml:space="preserve">For GSE27394, two technical sequencing fragments (SRR107072, SRR107073) showed lower alignment rates; these are fragments of the same biological replicate and counts were pooled within biological replicates, yielding four control and four knockdown replicates.</w:t>
@@ -789,14 +836,22 @@
     <w:p>
       <w:pPr>
         <w:pStyle w:val="Heading3"/>
+        <w:rPr>
+          <w:b w:val="1"/>
+        </w:rPr>
+        <w:jc w:val="left"/>
       </w:pPr>
       <w:r>
+        <w:rPr>
+          <w:b w:val="1"/>
+        </w:rPr>
         <w:t xml:space="preserve">2.2 Differential expression</w:t>
       </w:r>
     </w:p>
     <w:p>
       <w:pPr>
         <w:pStyle w:val="FirstParagraph"/>
+        <w:jc w:val="both"/>
       </w:pPr>
       <w:r>
         <w:t xml:space="preserve">Gene counts were generated with featureCounts v2.1.1 </w:t>
@@ -903,14 +958,22 @@
     <w:p>
       <w:pPr>
         <w:pStyle w:val="Heading3"/>
+        <w:rPr>
+          <w:b w:val="1"/>
+        </w:rPr>
+        <w:jc w:val="left"/>
       </w:pPr>
       <w:r>
+        <w:rPr>
+          <w:b w:val="1"/>
+        </w:rPr>
         <w:t xml:space="preserve">2.3 Alternative splicing and robustness assessment</w:t>
       </w:r>
     </w:p>
     <w:p>
       <w:pPr>
         <w:pStyle w:val="FirstParagraph"/>
+        <w:jc w:val="both"/>
       </w:pPr>
       <w:r>
         <w:t xml:space="preserve">Splicing was quantified with rMATS Turbo v4.3.0 </w:t>
@@ -952,6 +1015,7 @@
     <w:p>
       <w:pPr>
         <w:pStyle w:val="BodyText"/>
+        <w:jc w:val="both"/>
       </w:pPr>
       <w:r>
         <w:t xml:space="preserve">Because rMATS applies FDR correction across all events irrespective of read support, we additionally applied a coverage pre-filter</w:t>
@@ -1154,6 +1218,7 @@
     <w:p>
       <w:pPr>
         <w:pStyle w:val="BodyText"/>
+        <w:jc w:val="both"/>
       </w:pPr>
       <w:r>
         <w:t xml:space="preserve">Detection power was estimated by simulation over the observed coverage distribution for a 3 + 3 design.</w:t>
@@ -1164,14 +1229,22 @@
     <w:p>
       <w:pPr>
         <w:pStyle w:val="Heading3"/>
+        <w:rPr>
+          <w:b w:val="1"/>
+        </w:rPr>
+        <w:jc w:val="left"/>
       </w:pPr>
       <w:r>
+        <w:rPr>
+          <w:b w:val="1"/>
+        </w:rPr>
         <w:t xml:space="preserve">2.4 Isoform usage</w:t>
       </w:r>
     </w:p>
     <w:p>
       <w:pPr>
         <w:pStyle w:val="FirstParagraph"/>
+        <w:jc w:val="both"/>
       </w:pPr>
       <w:r>
         <w:t xml:space="preserve">Transcript-level quantification used Salmon v1.11.4 </w:t>
@@ -1290,14 +1363,22 @@
     <w:p>
       <w:pPr>
         <w:pStyle w:val="Heading3"/>
+        <w:rPr>
+          <w:b w:val="1"/>
+        </w:rPr>
+        <w:jc w:val="left"/>
       </w:pPr>
       <w:r>
+        <w:rPr>
+          <w:b w:val="1"/>
+        </w:rPr>
         <w:t xml:space="preserve">2.5 Annotation-free junction-level analysis</w:t>
       </w:r>
     </w:p>
     <w:p>
       <w:pPr>
         <w:pStyle w:val="FirstParagraph"/>
+        <w:jc w:val="both"/>
       </w:pPr>
       <w:r>
         <w:t xml:space="preserve">Splice junctions were extracted directly from the alignments in two independent ways, so that no conclusion rests on a single extraction rule. The first set was produced with regtools v1.0.0 </w:t>
@@ -1336,6 +1417,7 @@
     <w:p>
       <w:pPr>
         <w:pStyle w:val="BodyText"/>
+        <w:jc w:val="both"/>
       </w:pPr>
       <w:r>
         <w:t xml:space="preserve">Junctions were classified against GENCODE v47 (human) or vM25 (mouse) as annotated, novel combination (both splice sites annotated, the junction not), novel site (one site unannotated), or fully novel. Local splicing variations (LSVs) were defined by shared donor and by shared acceptor, and the share of an LSV’s reads carried by each junction defined its percent-spliced-in </w:t>
@@ -1362,6 +1444,7 @@
     <w:p>
       <w:pPr>
         <w:pStyle w:val="BodyText"/>
+        <w:jc w:val="both"/>
       </w:pPr>
       <w:r>
         <w:t xml:space="preserve">The calling threshold was calibrated against a control-versus-control null: in datasets with four control replicates, the controls were split 2 + 2, the analysis repeated unchanged, and every call counted as a false positive. Under a permissive definition (unannotated junction, ΔPSI ≥ 0.05, q &lt; 0.05, control PSI ≤ 0.05, bootstrap lower bound above zero) the null produced almost as many calls as the real comparison in iPSC colonies (0.98 per real call) and twice as many in K562 total RNA (2.01; Supplementary Table S14), so raw call counts are not interpretable. We therefore adopted an effect-based definition: a</w:t>
@@ -1402,6 +1485,7 @@
     <w:p>
       <w:pPr>
         <w:pStyle w:val="BodyText"/>
+        <w:jc w:val="both"/>
       </w:pPr>
       <w:r>
         <w:t xml:space="preserve">Eleven comparisons were analysed: SH-SY5Y at 75 and at 25 ng/mL doxycycline, iPSC colonies, iPSC-derived motor neurons with TDP-43, FUS or TAF15 knockdown, K562 total RNA and poly(A)+ mRNA, C2C12, NSC34, and mouse striatum. For mouse striatum, technical sequencing fragments were pooled within biological replicates, giving four per group.</w:t>
@@ -1412,14 +1496,22 @@
     <w:p>
       <w:pPr>
         <w:pStyle w:val="Heading3"/>
+        <w:rPr>
+          <w:b w:val="1"/>
+        </w:rPr>
+        <w:jc w:val="left"/>
       </w:pPr>
       <w:r>
+        <w:rPr>
+          <w:b w:val="1"/>
+        </w:rPr>
         <w:t xml:space="preserve">2.6 Aberrant splicing outlier detection</w:t>
       </w:r>
     </w:p>
     <w:p>
       <w:pPr>
         <w:pStyle w:val="FirstParagraph"/>
+        <w:jc w:val="both"/>
       </w:pPr>
       <w:r>
         <w:t xml:space="preserve">FRASER v1.14.1 </w:t>
@@ -1448,14 +1540,22 @@
     <w:p>
       <w:pPr>
         <w:pStyle w:val="Heading3"/>
+        <w:rPr>
+          <w:b w:val="1"/>
+        </w:rPr>
+        <w:jc w:val="left"/>
       </w:pPr>
       <w:r>
+        <w:rPr>
+          <w:b w:val="1"/>
+        </w:rPr>
         <w:t xml:space="preserve">2.7 Alternative polyadenylation</w:t>
       </w:r>
     </w:p>
     <w:p>
       <w:pPr>
         <w:pStyle w:val="FirstParagraph"/>
+        <w:jc w:val="both"/>
       </w:pPr>
       <w:r>
         <w:t xml:space="preserve">Alternative and cryptic polyadenylation (APA) were assessed from coverage rather than from junctions. Windows were built for 696 genes: those of the 732-gene expanded Ca²⁺ panel for which annotated introns and terminal exons could be retrieved, together with the cryptic positive controls. Introns were taken as the gaps between the merged exons of all basic-annotation transcripts of a gene and numbered in the direction of transcription; these unit numbers need not match canonical intron numbers (the</w:t>
@@ -1532,6 +1632,7 @@
     <w:p>
       <w:pPr>
         <w:pStyle w:val="BodyText"/>
+        <w:jc w:val="both"/>
       </w:pPr>
       <w:r>
         <w:t xml:space="preserve">The</w:t>
@@ -1592,14 +1693,22 @@
     <w:p>
       <w:pPr>
         <w:pStyle w:val="Heading3"/>
+        <w:rPr>
+          <w:b w:val="1"/>
+        </w:rPr>
+        <w:jc w:val="left"/>
       </w:pPr>
       <w:r>
+        <w:rPr>
+          <w:b w:val="1"/>
+        </w:rPr>
         <w:t xml:space="preserve">2.8 Nonsense-mediated decay inhibition</w:t>
       </w:r>
     </w:p>
     <w:p>
       <w:pPr>
         <w:pStyle w:val="FirstParagraph"/>
+        <w:jc w:val="both"/>
       </w:pPr>
       <w:r>
         <w:t xml:space="preserve">Gene-level counts were obtained from GSE307054 </w:t>
@@ -1626,6 +1735,7 @@
     <w:p>
       <w:pPr>
         <w:pStyle w:val="BodyText"/>
+        <w:jc w:val="both"/>
       </w:pPr>
       <w:r>
         <w:rPr>
@@ -1638,6 +1748,7 @@
     <w:p>
       <w:pPr>
         <w:pStyle w:val="BodyText"/>
+        <w:jc w:val="both"/>
       </w:pPr>
       <w:r>
         <w:t xml:space="preserve">for each of the four NMD-inhibition conditions c, giving four condition-level interaction values per gene; the two replicates within each condition are averaged. A positive interaction indicates a transcript that is produced upon TDP-43 loss and degraded by NMD. Genes with at least 10 normalised counts were tested (n = 19,145) with a four-condition one-sample t-test and an exact sign test. Because the TDP-43 factor is confounded with sequencing batch, these results are treated as exploratory.</w:t>
@@ -1648,14 +1759,22 @@
     <w:p>
       <w:pPr>
         <w:pStyle w:val="Heading3"/>
+        <w:rPr>
+          <w:b w:val="1"/>
+        </w:rPr>
+        <w:jc w:val="left"/>
       </w:pPr>
       <w:r>
+        <w:rPr>
+          <w:b w:val="1"/>
+        </w:rPr>
         <w:t xml:space="preserve">2.9 Ca²⁺ gene panels and enrichment testing</w:t>
       </w:r>
     </w:p>
     <w:p>
       <w:pPr>
         <w:pStyle w:val="FirstParagraph"/>
+        <w:jc w:val="both"/>
       </w:pPr>
       <w:r>
         <w:t xml:space="preserve">Four cumulative gene panels were assembled from curated SOCE/TRP components (n = 51), channels and transport systems (n = 117), curated Ca²⁺-handling genes (n = 258) and an expanded Ca²⁺-associated set from KEGG and Gene Ontology (n = 732; Supplementary Table S2). Symbols were harmonised to HGNC/MGI and orthology verified via Ensembl Compara. Where results are summarised for the SOCE machinery, this refers to a fixed set of nineteen genes:</w:t>
@@ -1862,6 +1981,7 @@
     <w:p>
       <w:pPr>
         <w:pStyle w:val="BodyText"/>
+        <w:jc w:val="both"/>
       </w:pPr>
       <w:r>
         <w:t xml:space="preserve">Enrichment of significant splicing events within panels was tested both by hypergeometric test against all testable genes and against a</w:t>
@@ -1885,14 +2005,22 @@
     <w:p>
       <w:pPr>
         <w:pStyle w:val="Heading3"/>
+        <w:rPr>
+          <w:b w:val="1"/>
+        </w:rPr>
+        <w:jc w:val="left"/>
       </w:pPr>
       <w:r>
+        <w:rPr>
+          <w:b w:val="1"/>
+        </w:rPr>
         <w:t xml:space="preserve">2.10 Transcript-family abundance</w:t>
       </w:r>
     </w:p>
     <w:p>
       <w:pPr>
         <w:pStyle w:val="FirstParagraph"/>
+        <w:jc w:val="both"/>
       </w:pPr>
       <w:r>
         <w:t xml:space="preserve">Transcripts per million (TPM) from Salmon were summed to gene level for the primary SH-SY5Y comparison (0 vs 75 ng/mL doxycycline, n = 3 + 3), so that members of a family are compared on a length-corrected scale. TPM sums to the same total in every library, so a large gain by a few abundant transcripts lowers the TPM of every other gene: in the knockdown libraries</w:t>
@@ -1919,14 +2047,22 @@
     <w:p>
       <w:pPr>
         <w:pStyle w:val="Heading3"/>
+        <w:rPr>
+          <w:b w:val="1"/>
+        </w:rPr>
+        <w:jc w:val="left"/>
       </w:pPr>
       <w:r>
+        <w:rPr>
+          <w:b w:val="1"/>
+        </w:rPr>
         <w:t xml:space="preserve">2.11 Patient tissue and cross-disease comparison</w:t>
       </w:r>
     </w:p>
     <w:p>
       <w:pPr>
         <w:pStyle w:val="FirstParagraph"/>
+        <w:jc w:val="both"/>
       </w:pPr>
       <w:r>
         <w:t xml:space="preserve">ALS post-mortem RNA-seq was taken from the New York Genome Center (NYGC) ALS Consortium/Target ALS collection </w:t>
@@ -1999,6 +2135,7 @@
     <w:p>
       <w:pPr>
         <w:pStyle w:val="BodyText"/>
+        <w:jc w:val="both"/>
       </w:pPr>
       <w:r>
         <w:t xml:space="preserve">Independent cohorts were analysed identically: Alzheimer’s disease </w:t>
@@ -2079,6 +2216,7 @@
     <w:p>
       <w:pPr>
         <w:pStyle w:val="BodyText"/>
+        <w:jc w:val="both"/>
       </w:pPr>
       <w:r>
         <w:t xml:space="preserve">Cell-composition markers (GFAP, AIF1, SNAP25, RBFOX3, MBP, PLP1) were carried through all comparisons.</w:t>
@@ -2087,6 +2225,7 @@
     <w:p>
       <w:pPr>
         <w:pStyle w:val="BodyText"/>
+        <w:jc w:val="both"/>
       </w:pPr>
       <w:r>
         <w:t xml:space="preserve">Junction-level quantification of the truncated</w:t>
@@ -2131,14 +2270,22 @@
     <w:p>
       <w:pPr>
         <w:pStyle w:val="Heading3"/>
+        <w:rPr>
+          <w:b w:val="1"/>
+        </w:rPr>
+        <w:jc w:val="left"/>
       </w:pPr>
       <w:r>
+        <w:rPr>
+          <w:b w:val="1"/>
+        </w:rPr>
         <w:t xml:space="preserve">2.12 Cell culture and TDP-43 knockdown</w:t>
       </w:r>
     </w:p>
     <w:p>
       <w:pPr>
         <w:pStyle w:val="FirstParagraph"/>
+        <w:jc w:val="both"/>
       </w:pPr>
       <w:r>
         <w:t xml:space="preserve">SH-SY5Y cells were maintained in DMEM/F12 with L-glutamine and 15 mM HEPES (Gibco, cat. no. 11330032) supplemented with 10% fetal bovine serum (FBS) and 1% MEM non-essential amino acids, at 37 °C in 5% CO₂, and were tested for mycoplasma by PCR and by a luminescence assay. TARDBP was silenced with a pLKO.1-TRC lentiviral short hairpin RNA (shRNA; Dharmacon TRC Lentiviral shRNA, cat. no. RHS3979); a non-targeting shRNA in the same vector served as control. Lentiviral particles were produced in HEK293T cells co-transfected with 1 µg transfer plasmid, 750 ng psPAX2 (Addgene 12260) and 250 ng pMD2.G (Addgene 12259) using LipoFectMax (ABP Biosciences; 3 µL per µg DNA); supernatants were collected 48 and 72 h after transfection, cleared by centrifugation, passed through a 0.45 µm filter and stored at −80 °C. SH-SY5Y cells were seeded at 375,000 per well in 6-well plates and transduced overnight with 20% (v/v) viral supernatant in medium containing 8 µg/mL polybrene (Sigma-Aldrich, H9268); the medium was replaced 24 h after transduction. Selection with 2 µg/mL puromycin (Cayman Chemical, 13884; concentration chosen from a kill curve) began no earlier than 24 h after transduction and was complete on day 5, when puromycin-treated non-transduced cells had all died. Three groups were compared: non-transduced cells, a non-targeting (scrambled) shRNA control and shTDP-43. TARDBP knockdown was measured against both control groups; the target-gene reverse-transcription quantitative PCR (RT-qPCR), Fura-2 and WST-1 experiments compared shTDP-43 cells with the non-targeting shRNA control. Lentiviral work followed institutional biosafety rules.</w:t>
@@ -2149,14 +2296,22 @@
     <w:p>
       <w:pPr>
         <w:pStyle w:val="Heading3"/>
+        <w:rPr>
+          <w:b w:val="1"/>
+        </w:rPr>
+        <w:jc w:val="left"/>
       </w:pPr>
       <w:r>
+        <w:rPr>
+          <w:b w:val="1"/>
+        </w:rPr>
         <w:t xml:space="preserve">2.13 RT-qPCR</w:t>
       </w:r>
     </w:p>
     <w:p>
       <w:pPr>
         <w:pStyle w:val="FirstParagraph"/>
+        <w:jc w:val="both"/>
       </w:pPr>
       <w:r>
         <w:t xml:space="preserve">After puromycin selection was completed on day 5, total RNA was isolated with the Total RNA Purification Kit (Norgen Biotek, cat. no. 17200) with on-column DNase I treatment, and samples with A260/A280 &gt; 1.8 were used. cDNA was synthesised from 500 ng total RNA with oligo(dT) priming and the OneScript Plus cDNA Synthesis Kit (abm, cat. no. G236). Reactions of 10 µL, containing 1 µL cDNA and 0.5 µM of each primer, were run with iTaq Universal SYBR Green Supermix (Bio-Rad, cat. no. 1725121) on a LightCycler 480 II (Roche). Targets and GAPDH were run on the same plate with no-template and no-reverse-transcriptase controls, and specificity was checked from a single melt-curve peak. Relative expression was calculated by the 2</w:t>
@@ -2189,7 +2344,7 @@
         <w:fldChar w:fldCharType="end"/>
       </w:r>
       <w:r>
-        <w:t>, with non-transduced cells as the calibrator for TARDBP and the non-targeting shRNA control for the target genes (n = 4 biological replicates per group; TARDBP knockdown and the target genes were measured on separate RNA sets, 14 April – 21 May and 3 June – 10 July 2026). Primer sequences, product sizes, annealing temperatures and the thermal cycling profile are given in Supplementary Table S1.</w:t>
+        <w:t>, with non-transduced cells as the calibrator for TARDBP and the non-targeting shRNA control for the target genes (n = 4; TARDBP knockdown and the target genes were measured on separate RNA sets, 14 April – 21 May and 3 June – 10 July 2026). Primer sequences, product sizes, annealing temperatures and the thermal cycling profile are given in Supplementary Table S1.</w:t>
       </w:r>
     </w:p>
     <w:bookmarkEnd w:id="23"/>
@@ -2197,14 +2352,22 @@
     <w:p>
       <w:pPr>
         <w:pStyle w:val="Heading3"/>
+        <w:rPr>
+          <w:b w:val="1"/>
+        </w:rPr>
+        <w:jc w:val="left"/>
       </w:pPr>
       <w:r>
+        <w:rPr>
+          <w:b w:val="1"/>
+        </w:rPr>
         <w:t xml:space="preserve">2.14 Cytosolic Ca²⁺ measurement</w:t>
       </w:r>
     </w:p>
     <w:p>
       <w:pPr>
         <w:pStyle w:val="FirstParagraph"/>
+        <w:jc w:val="both"/>
       </w:pPr>
       <w:r>
         <w:t xml:space="preserve">Non-targeting shRNA control and shTDP-43 cells were measured 72 h after transduction; the day-5 endpoint described above applied to RNA collection from the separate RT-qPCR cultures. Cells were seeded in 24-well plates at 40,000 cells per well. Cells were loaded with 5 µM Fura-2/AM (Invitrogen, F1221) and 0.02% Pluronic F-127 (Invitrogen, P3000MP) in HEPES-buffered saline (HBS) containing 1% bovine serum albumin (BSA) for 60 min at 25 °C in the dark and washed three times for 15 min in 1% BSA/HBS. HBS contained 135 mM NaCl, 5.9 mM KCl, 1.2 mM MgCl₂, 1.5 mM CaCl₂, 11.6 mM HEPES, 5 mM NaHCO₃ and 11.5 mM D-glucose (pH 7.3). Cytosolic free Ca²⁺ was followed spectrofluorometrically as the F340/F380 ratio </w:t>
@@ -2243,7 +2406,7 @@
         <w:fldChar w:fldCharType="end"/>
       </w:r>
       <w:r>
-        <w:t>. Loaded cells were transferred to Ca²⁺-free HBS containing 1 mM EGTA; SERCA was then inhibited with 10 µM cyclopiazonic acid (Sigma-Aldrich, cat. no. C1530) and the transient rise in F340/F380 was recorded as ER Ca²⁺ release. CaCl₂ was then added to a final concentration of 1.5 mM and the subsequent rise was recorded as store-operated Ca²⁺ entry (SOCE), following the established depletion–readdition paradigm. Both phases were quantified as Δ(F340/F380) relative to the respective preceding baseline (three measurements per group).</w:t>
+        <w:t>. Loaded cells were transferred to Ca²⁺-free HBS containing 1 mM EGTA; SERCA was then inhibited with 10 µM cyclopiazonic acid (Sigma-Aldrich, cat. no. C1530) and the transient rise in F340/F380 was recorded as ER Ca²⁺ release. CaCl₂ was then added to a final concentration of 1.5 mM and the subsequent rise was recorded as store-operated Ca²⁺ entry (SOCE), following the established depletion–readdition paradigm. Both phases were quantified as Δ(F340/F380) relative to the respective preceding baseline (n = 3).</w:t>
       </w:r>
     </w:p>
     <w:bookmarkEnd w:id="24"/>
@@ -2251,17 +2414,25 @@
     <w:p>
       <w:pPr>
         <w:pStyle w:val="Heading3"/>
+        <w:rPr>
+          <w:b w:val="1"/>
+        </w:rPr>
+        <w:jc w:val="left"/>
       </w:pPr>
       <w:r>
+        <w:rPr>
+          <w:b w:val="1"/>
+        </w:rPr>
         <w:t xml:space="preserve">2.15 WST-1 assay</w:t>
       </w:r>
     </w:p>
     <w:p>
       <w:pPr>
         <w:pStyle w:val="FirstParagraph"/>
+        <w:jc w:val="both"/>
       </w:pPr>
       <w:r>
-        <w:t xml:space="preserve">Transduced cells were allocated to 96-well plates, and cellular metabolic activity was assessed 48 h after seeding with the WST-1 assay (Premix WST-1, Takara Bio, cat. no. MK400). Cells were seeded at 10,000 per well in 100 µL in 96-well plates; at 48 h, 10 µL reagent was added for 3 h at 37 °C, and absorbance was read at 450 nm against a 620 nm reference on a Varioskan Flash reader (Thermo Scientific). The absorbance of cell-free wells containing medium and reagent was subtracted, and values were normalised to the mean of the non-targeting shRNA control. The available 48-h source data comprise four wells per group from one experiment; values are reported as mean ± SEM.</w:t>
+        <w:t xml:space="preserve">Transduced cells were allocated to 96-well plates, and cellular metabolic activity was assessed 48 h after seeding with the WST-1 assay (Premix WST-1, Takara Bio, cat. no. MK400). Cells were seeded at 10,000 per well in 100 µL in 96-well plates; at 48 h, 10 µL reagent was added for 3 h at 37 °C, and absorbance was read at 450 nm against a 620 nm reference on a Varioskan Flash reader (Thermo Scientific). The absorbance of cell-free wells containing medium and reagent was subtracted, and values were normalised to the mean of the non-targeting shRNA control. For the available 48-h data, n = 4; values are reported as mean ± SEM.</w:t>
       </w:r>
     </w:p>
     <w:bookmarkEnd w:id="25"/>
@@ -2269,14 +2440,22 @@
     <w:p>
       <w:pPr>
         <w:pStyle w:val="Heading3"/>
+        <w:rPr>
+          <w:b w:val="1"/>
+        </w:rPr>
+        <w:jc w:val="left"/>
       </w:pPr>
       <w:r>
+        <w:rPr>
+          <w:b w:val="1"/>
+        </w:rPr>
         <w:t xml:space="preserve">2.16 Statistics</w:t>
       </w:r>
     </w:p>
     <w:p>
       <w:pPr>
         <w:pStyle w:val="FirstParagraph"/>
+        <w:jc w:val="both"/>
       </w:pPr>
       <w:r>
         <w:t xml:space="preserve">Bioinformatic thresholds are given above. Laboratory data are mean ± SEM. TARDBP knockdown was assessed by one-way ANOVA on log2-transformed relative expression with Tukey’s multiple comparison test. The four target-gene RT-qPCR comparisons used two-tailed Student’s t-tests with Holm adjustment across the four targets; the two Fura-2 comparisons used two-tailed Student’s t-tests (GraphPad Prism 10). WST-1 wells were summarised descriptively without an inferential test. Significance was set at adjusted p &lt; 0.05 for the four-target RT-qPCR family and p &lt; 0.05 for the other inferential analyses.</w:t>
@@ -2288,8 +2467,15 @@
     <w:p>
       <w:pPr>
         <w:pStyle w:val="Heading2"/>
+        <w:rPr>
+          <w:b w:val="1"/>
+        </w:rPr>
+        <w:jc w:val="left"/>
       </w:pPr>
       <w:r>
+        <w:rPr>
+          <w:b w:val="1"/>
+        </w:rPr>
         <w:t xml:space="preserve">3. Results</w:t>
       </w:r>
     </w:p>
@@ -2297,14 +2483,22 @@
     <w:p>
       <w:pPr>
         <w:pStyle w:val="Heading3"/>
+        <w:rPr>
+          <w:b w:val="1"/>
+        </w:rPr>
+        <w:jc w:val="left"/>
       </w:pPr>
       <w:r>
+        <w:rPr>
+          <w:b w:val="1"/>
+        </w:rPr>
         <w:t xml:space="preserve">3.1 TDP-43 knockdown reduces SOCE despite increased transcript levels of SOCE components</w:t>
       </w:r>
     </w:p>
     <w:p>
       <w:pPr>
         <w:pStyle w:val="FirstParagraph"/>
+        <w:jc w:val="both"/>
       </w:pPr>
       <w:r>
         <w:t xml:space="preserve">Lentiviral shRNA reduced TARDBP mRNA by 94.4% relative to the non-targeting shRNA control and 94.8% relative to non-transduced cells (one-way ANOVA with Tukey’s test, p &lt; 0.0001, n = 4).</w:t>
@@ -2313,6 +2507,7 @@
     <w:p>
       <w:pPr>
         <w:pStyle w:val="BodyText"/>
+        <w:jc w:val="both"/>
       </w:pPr>
       <w:r>
         <w:t xml:space="preserve">Relative to the non-targeting shRNA control, mRNA levels of four SOCE-associated targets increased:</w:t>
@@ -2487,6 +2682,7 @@
         <w:pStyle w:val="Caption"/>
         <w:keepLines/>
         <w:spacing w:line="269" w:lineRule="auto" w:after="200"/>
+        <w:jc w:val="both"/>
       </w:pPr>
       <w:r>
         <w:rPr>
@@ -2501,20 +2697,22 @@
           <w:rFonts w:ascii="Times New Roman" w:hAnsi="Times New Roman"/>
           <w:sz w:val="19"/>
         </w:rPr>
-        <w:t xml:space="preserve"> TDP-43 knockdown, calcium-related mRNAs and WST-1 signal in SH-SY5Y cells. (A) TARDBP mRNA in untransduced cells (“No virus”), non-targeting shRNA controls and shTDP-43 cells (n = 4 biological replicates per group; one-way ANOVA on log2 values with Tukey’s test; **** p &lt; 0.0001 for the indicated pair). (B) Relative mRNA of TRPC1, STIM1, ORAI1 and ATP2A3 (n = 4 biological replicates per group; two-tailed t-tests with Holm adjustment across the four targets). (C) WST-1 metabolic signal at 48 h (four wells per group from one experiment; descriptive summary only). Bars represent means ± SEM; dots are individual measurements.</w:t>
+        <w:t xml:space="preserve"> TDP-43 knockdown, calcium-related mRNAs and WST-1 signal in SH-SY5Y cells. (A) TARDBP mRNA in untransduced cells (“No virus”), non-targeting shRNA controls and shTDP-43 cells (n = 4; one-way ANOVA on log2 values with Tukey’s test; **** p &lt; 0.0001 for the indicated pair). (B) Relative mRNA of TRPC1, STIM1, ORAI1 and ATP2A3 (n = 4; two-tailed t-tests with Holm adjustment across the four targets). (C) WST-1 metabolic signal at 48 h (n = 4; descriptive summary only). Bars represent means ± SEM; dots are individual measurements.</w:t>
       </w:r>
     </w:p>
     <w:p>
       <w:pPr>
         <w:pStyle w:val="BodyText"/>
+        <w:jc w:val="both"/>
       </w:pPr>
       <w:r>
-        <w:t xml:space="preserve">Functionally, however, the SOCE response fell markedly (Figure 2). The ER Ca²⁺-release means were 0.268 ± 0.042 and 0.180 ± 0.061 Δ(F340/F380) in the control and shTDP-43 groups, respectively (p = 0.299; two-tailed Student’s t-test). The readdition-response means were 1.542 ± 0.282 and 0.245 ± 0.083, respectively (p = 0.0115; two-tailed Student’s t-test; three measurements per group). At 48 h, the WST-1 signal was 61.5 ± 0.8% of control, a 38.5% decrease (four wells per group, one experiment).</w:t>
+        <w:t xml:space="preserve">Functionally, however, the SOCE response fell markedly (Figure 2). The ER Ca²⁺-release means were 0.268 ± 0.042 and 0.180 ± 0.061 Δ(F340/F380) in the control and shTDP-43 groups, respectively (p = 0.299; two-tailed Student’s t-test). The readdition-response means were 1.542 ± 0.282 and 0.245 ± 0.083, respectively (p = 0.0115; two-tailed Student’s t-test; n = 3). At 48 h, the WST-1 signal was 61.5 ± 0.8% of control, a 38.5% decrease (n = 4).</w:t>
       </w:r>
     </w:p>
     <w:p>
       <w:pPr>
         <w:pStyle w:val="BodyText"/>
+        <w:jc w:val="both"/>
       </w:pPr>
       <w:r>
         <w:t xml:space="preserve">The direction of the transcript changes and the direction of the functional response are therefore opposite. This is the central observation of the study.</w:t>
@@ -2567,6 +2765,7 @@
         <w:pStyle w:val="Caption"/>
         <w:keepLines/>
         <w:spacing w:line="269" w:lineRule="auto" w:after="200"/>
+        <w:jc w:val="both"/>
       </w:pPr>
       <w:r>
         <w:rPr>
@@ -2581,7 +2780,7 @@
           <w:rFonts w:ascii="Times New Roman" w:hAnsi="Times New Roman"/>
           <w:sz w:val="19"/>
         </w:rPr>
-        <w:t xml:space="preserve"> Fura-2 calcium responses following TDP-43 knockdown in SH-SY5Y cells. (A, B) Representative traces from non-targeting shRNA control and shTDP-43 cells. CPA (10 µM) and CaCl₂ (1.5 mM) additions are indicated. (C) ER Ca²⁺ release after CPA (p = 0.299). (D) Ca²⁺ readdition response (p = 0.0115). Panels C and D show individual measurements and mean ± SEM (three measurements per group; two-tailed Student’s t-tests). The traces illustrate individual recordings; group amplitudes were calculated from the original Prism measurements.</w:t>
+        <w:t xml:space="preserve"> Fura-2 calcium responses following TDP-43 knockdown in SH-SY5Y cells. (A, B) Representative traces from non-targeting shRNA control and shTDP-43 cells. CPA (10 µM) and CaCl₂ (1.5 mM) additions are indicated. (C) ER Ca²⁺ release after CPA (p = 0.299). (D) Ca²⁺ readdition response (p = 0.0115). Panels C and D show individual measurements and mean ± SEM (n = 3; two-tailed Student’s t-tests). The traces illustrate individual recordings; group amplitudes were calculated from the original Prism measurements.</w:t>
       </w:r>
     </w:p>
     <w:bookmarkEnd w:id="28"/>
@@ -2589,14 +2788,22 @@
     <w:p>
       <w:pPr>
         <w:pStyle w:val="Heading3"/>
+        <w:rPr>
+          <w:b w:val="1"/>
+        </w:rPr>
+        <w:jc w:val="left"/>
       </w:pPr>
       <w:r>
+        <w:rPr>
+          <w:b w:val="1"/>
+        </w:rPr>
         <w:t xml:space="preserve">3.2 Transcript-family abundance contextualises the discordance</w:t>
       </w:r>
     </w:p>
     <w:p>
       <w:pPr>
         <w:pStyle w:val="FirstParagraph"/>
+        <w:jc w:val="both"/>
       </w:pPr>
       <w:r>
         <w:t xml:space="preserve">The independent public SH-SY5Y RNA-seq comparison provides transcript-level context for this laboratory observation (Figure 3; Table 4). Transcript-family abundance complements fold-change alone. Because a few abundant transcripts take a larger share of the TPM total in the knockdown libraries, unadjusted TPM makes most knockdown-to-control changes appear lower than the composition-adjusted estimates; the values below are adjusted for library composition (Methods 2.10).</w:t>
@@ -2605,6 +2812,7 @@
     <w:p>
       <w:pPr>
         <w:pStyle w:val="BodyText"/>
+        <w:jc w:val="both"/>
       </w:pPr>
       <w:r>
         <w:t xml:space="preserve">In control cells</w:t>
@@ -2918,6 +3126,7 @@
     <w:p>
       <w:pPr>
         <w:pStyle w:val="BodyText"/>
+        <w:jc w:val="both"/>
       </w:pPr>
       <w:r>
         <w:t xml:space="preserve">Two of these changes point towards reduced entry. ORAI2 and ORAI3 both form heteromers with ORAI1 and restrain SOCE; deleting either increases it </w:t>
@@ -3043,6 +3252,7 @@
     <w:p>
       <w:pPr>
         <w:pStyle w:val="BodyText"/>
+        <w:jc w:val="both"/>
       </w:pPr>
       <w:r>
         <w:t xml:space="preserve">Together, the changes in ORAI-family composition and SOCE regulators provide candidate molecular explanations for the reduced SOCE phenotype.</w:t>
@@ -3095,6 +3305,7 @@
         <w:pStyle w:val="Caption"/>
         <w:keepLines/>
         <w:spacing w:line="269" w:lineRule="auto" w:after="200"/>
+        <w:jc w:val="both"/>
       </w:pPr>
       <w:r>
         <w:rPr>
@@ -3117,14 +3328,22 @@
     <w:p>
       <w:pPr>
         <w:pStyle w:val="Heading3"/>
+        <w:rPr>
+          <w:b w:val="1"/>
+        </w:rPr>
+        <w:jc w:val="left"/>
       </w:pPr>
       <w:r>
+        <w:rPr>
+          <w:b w:val="1"/>
+        </w:rPr>
         <w:t xml:space="preserve">3.3 TDP-43 depletion alters splicing across Ca²⁺ homeostasis genes, but most individual events are underpowered</w:t>
       </w:r>
     </w:p>
     <w:p>
       <w:pPr>
         <w:pStyle w:val="FirstParagraph"/>
+        <w:jc w:val="both"/>
       </w:pPr>
       <w:r>
         <w:t xml:space="preserve">Across the six comparisons, TDP-43 depletion produced widespread splicing changes; in the primary SH-SY5Y model 7,854 events met FDR &lt; 0.05 and |ΔPSI| ≥ 0.10 before coverage filtering. Positive-control behaviour of</w:t>
@@ -3165,6 +3384,7 @@
     <w:p>
       <w:pPr>
         <w:pStyle w:val="BodyText"/>
+        <w:jc w:val="both"/>
       </w:pPr>
       <w:r>
         <w:t xml:space="preserve">However, a substantial proportion of nominally significant events rested on very low read support. Applying a coverage pre-filter before FDR correction removed 18–78% of tested events depending on dataset (Table 1) and reduced the number of significant calls by 33–76%, with the largest losses in the two single-end datasets (iPSC-derived motor neurons 70%; mouse striatum 76%).</w:t>
@@ -3173,6 +3393,7 @@
     <w:p>
       <w:pPr>
         <w:pStyle w:val="BodyText"/>
+        <w:jc w:val="both"/>
       </w:pPr>
       <w:r>
         <w:t xml:space="preserve">Simulation over the observed coverage distribution showed why (Supplementary Figure S1). For a 3 + 3 design at 10 informative reads per sample, a coverage typical of the lower quartile of events, power to detect a true ΔPSI of 0.10 is only 0.08, and even at 100 reads per sample it reaches only 0.28. Attaining 80% power at realistic depth requires |ΔPSI| ≳ 0.30. Nominally significant events at low coverage are therefore expected to be substantially inflated in effect size, and individual events at the |ΔPSI| ≥ 0.10 threshold should not be interpreted without explicit read-level support.</w:t>
@@ -3181,6 +3402,7 @@
     <w:p>
       <w:pPr>
         <w:pStyle w:val="BodyText"/>
+        <w:jc w:val="both"/>
       </w:pPr>
       <w:r>
         <w:t xml:space="preserve">We applied this reasoning to a</w:t>
@@ -3223,14 +3445,22 @@
     <w:p>
       <w:pPr>
         <w:pStyle w:val="Heading3"/>
+        <w:rPr>
+          <w:b w:val="1"/>
+        </w:rPr>
+        <w:jc w:val="left"/>
       </w:pPr>
       <w:r>
+        <w:rPr>
+          <w:b w:val="1"/>
+        </w:rPr>
         <w:t xml:space="preserve">3.4 Robust splicing changes concentrate in SOCE regulators</w:t>
       </w:r>
     </w:p>
     <w:p>
       <w:pPr>
         <w:pStyle w:val="FirstParagraph"/>
+        <w:jc w:val="both"/>
       </w:pPr>
       <w:r>
         <w:t xml:space="preserve">Applying the robustness criteria to the twelve SOCE-machinery genes examined event by event (Methods 2.3) identified a small set of events supported by adequate coverage and bootstrap intervals excluding zero (Table 2, Supplementary Figure S3).</w:t>
@@ -3239,6 +3469,7 @@
     <w:p>
       <w:pPr>
         <w:pStyle w:val="BodyText"/>
+        <w:jc w:val="both"/>
       </w:pPr>
       <w:r>
         <w:t xml:space="preserve">In the primary SH-SY5Y model these were</w:t>
@@ -3327,6 +3558,7 @@
     <w:p>
       <w:pPr>
         <w:pStyle w:val="BodyText"/>
+        <w:jc w:val="both"/>
       </w:pPr>
       <w:r>
         <w:rPr>
@@ -3376,6 +3608,7 @@
     <w:p>
       <w:pPr>
         <w:pStyle w:val="BodyText"/>
+        <w:jc w:val="both"/>
       </w:pPr>
       <w:r>
         <w:t xml:space="preserve">LeafCutter, which does not use the reference annotation to define events, independently called</w:t>
@@ -3418,14 +3651,22 @@
     <w:p>
       <w:pPr>
         <w:pStyle w:val="Heading3"/>
+        <w:rPr>
+          <w:b w:val="1"/>
+        </w:rPr>
+        <w:jc w:val="left"/>
       </w:pPr>
       <w:r>
+        <w:rPr>
+          <w:b w:val="1"/>
+        </w:rPr>
         <w:t xml:space="preserve">3.5 Annotation-free analysis recovers cryptic exons genome-wide but finds no high-confidence event in the SOCE machinery of the primary model</w:t>
       </w:r>
     </w:p>
     <w:p>
       <w:pPr>
         <w:pStyle w:val="FirstParagraph"/>
+        <w:jc w:val="both"/>
       </w:pPr>
       <w:r>
         <w:t xml:space="preserve">rMATS and LeafCutter both constrain what can be found: the first by the event classes and annotation it works from, the second by clustering rules that discard sparse junctions. To remove those constraints we extracted splice junctions directly from the alignments and tested local splicing variations with a beta-binomial model, across eleven comparisons; the primary SH-SY5Y comparison was additionally repeated on a second, independently produced junction set (Methods 2.5).</w:t>
@@ -3434,6 +3675,7 @@
     <w:p>
       <w:pPr>
         <w:pStyle w:val="BodyText"/>
+        <w:jc w:val="both"/>
       </w:pPr>
       <w:r>
         <w:t xml:space="preserve">The approach recovered the established TDP-43 cryptic targets without being given their coordinates (Supplementary Figure S4A). In SH-SY5Y at 75 ng/mL doxycycline, 188,491 junctions passed the read-support filters with the mapping-quality-filtered extractor, 23,421 of them absent from GENCODE v47, and 117 high-confidence unannotated splicing changes in 87 genes were called (Supplementary Table S5). Twelve of the sixteen literature positive controls (Supplementary Table S6) were among them:</w:t>
@@ -3649,6 +3891,7 @@
     <w:p>
       <w:pPr>
         <w:pStyle w:val="BodyText"/>
+        <w:jc w:val="both"/>
       </w:pPr>
       <w:r>
         <w:t xml:space="preserve">Specificity was tested by running the same analysis on FUS and TAF15 knockdown in the same iPSC-derived motor neurons, at the same depth and with the same design (Supplementary Figure S4C). Under the permissive definition the three comparisons produced call counts of the same order (141 for TDP-43, 124 for FUS and 126 for TAF15); TDP-43 knockdown recovered two of the sixteen positive-control genes (</w:t>
@@ -3696,6 +3939,7 @@
     <w:p>
       <w:pPr>
         <w:pStyle w:val="BodyText"/>
+        <w:jc w:val="both"/>
       </w:pPr>
       <w:r>
         <w:t xml:space="preserve">The null test also sets the limits of interpretation. It could be run in the three datasets with four control replicates: for every real call the split-control null produced 0.64 calls in iPSC colonies, 2.17 in K562 total RNA and 0.83 in mouse striatum (high-confidence definition; Supplementary Table S14). These ratios are not calibrated false-discovery rates; they are the ratio of two call counts from analyses with different sample sizes and different numbers of tests, but they show that call counts are not interpretable on their own. In the remaining eight comparisons (the two SH-SY5Y doses, the three iPSC-derived motor neuron comparisons, K562 poly(A)+ mRNA, C2C12 and NSC34), the controls could not be split, and positive-control recovery is the only available check. Across the eleven comparisons the burden of high-confidence unannotated splicing changes ranged from 12 to 477 events, and of the three datasets with a null, the one with the largest burden also had the largest null.</w:t>
@@ -3704,6 +3948,7 @@
     <w:p>
       <w:pPr>
         <w:pStyle w:val="BodyText"/>
+        <w:jc w:val="both"/>
       </w:pPr>
       <w:r>
         <w:t xml:space="preserve">Applied to the Ca²⁺ panels, the analysis returned an almost complete negative (Supplementary Table S7).</w:t>
@@ -3980,6 +4225,7 @@
     <w:p>
       <w:pPr>
         <w:pStyle w:val="BodyText"/>
+        <w:jc w:val="both"/>
       </w:pPr>
       <w:r>
         <w:t xml:space="preserve">What the annotation-free analysis did confirm were the annotated events.</w:t>
@@ -4080,6 +4326,7 @@
     <w:p>
       <w:pPr>
         <w:pStyle w:val="BodyText"/>
+        <w:jc w:val="both"/>
       </w:pPr>
       <w:r>
         <w:t xml:space="preserve">One specific mechanism could be tested directly. Inclusion of a 24-nucleotide exon in the STIM–ORAI activating region (SOAR) converts STIM2 into STIM2.1 (STIM2β), an isoform that inhibits SOCE </w:t>
@@ -4106,6 +4353,7 @@
     <w:p>
       <w:pPr>
         <w:pStyle w:val="BodyText"/>
+        <w:jc w:val="both"/>
       </w:pPr>
       <w:r>
         <w:t xml:space="preserve">FRASER, run on the nine-sample doxycycline series, returned no genome-wide significant outlier and no difference in per-sample outlier burden between depleted and control libraries (4.8 versus 2.3 events at p &lt; 10⁻⁵; p = 0.35). This is the expected behaviour of an outlier method applied to a cohort in which the aberrant state is the majority, and we report it as a limit of that approach at this cohort size rather than as evidence against aberrant splicing.</w:t>
@@ -4116,14 +4364,22 @@
     <w:p>
       <w:pPr>
         <w:pStyle w:val="Heading3"/>
+        <w:rPr>
+          <w:b w:val="1"/>
+        </w:rPr>
+        <w:jc w:val="left"/>
       </w:pPr>
       <w:r>
+        <w:rPr>
+          <w:b w:val="1"/>
+        </w:rPr>
         <w:t xml:space="preserve">3.6 Exploratory NMD interactions prioritise CBARP but do not confirm an NMD target</w:t>
       </w:r>
     </w:p>
     <w:p>
       <w:pPr>
         <w:pStyle w:val="FirstParagraph"/>
+        <w:jc w:val="both"/>
       </w:pPr>
       <w:r>
         <w:t xml:space="preserve">Cryptic exons frequently introduce premature termination codons, which can make their transcripts susceptible to nonsense-mediated decay (NMD) and under-represented in steady-state RNA. An independent experiment in which TDP-43 knockdown is crossed with knockdown of XRN1, UPF1 and SMG6 (GSE307054) provides an exploratory interaction test (Supplementary Figure S5): a transcript pool produced upon TDP-43 loss and degraded by NMD would be expected to rise preferentially when both perturbations are present (Methods 2.8).</w:t>
@@ -4132,6 +4388,7 @@
     <w:p>
       <w:pPr>
         <w:pStyle w:val="BodyText"/>
+        <w:jc w:val="both"/>
       </w:pPr>
       <w:r>
         <w:t xml:space="preserve">Because the four interventions reuse the same control and knockdown libraries, the eight difference-of-differences values that the design yields are not eight independent observations. We therefore took the four NMD-inhibition conditions as the unit of inference, averaging the two replicates within each condition and retaining the shared controls only within each contrast. Several positive-control and calcium-gene interactions were positive, but no gene passed genome-wide FDR correction in this conservative analysis (smallest q = 0.053). The result is therefore supportive at the level of a ranked exploratory signal, not a confirmatory NMD test.</w:t>
@@ -4140,6 +4397,7 @@
     <w:p>
       <w:pPr>
         <w:pStyle w:val="BodyText"/>
+        <w:jc w:val="both"/>
       </w:pPr>
       <w:r>
         <w:rPr>
@@ -4190,6 +4448,7 @@
     <w:p>
       <w:pPr>
         <w:pStyle w:val="BodyText"/>
+        <w:jc w:val="both"/>
       </w:pPr>
       <w:r>
         <w:t xml:space="preserve">Two negative results follow. First, the prediction from isoform-level testing that</w:t>
@@ -4229,14 +4488,22 @@
     <w:p>
       <w:pPr>
         <w:pStyle w:val="Heading3"/>
+        <w:rPr>
+          <w:b w:val="1"/>
+        </w:rPr>
+        <w:jc w:val="left"/>
       </w:pPr>
       <w:r>
+        <w:rPr>
+          <w:b w:val="1"/>
+        </w:rPr>
         <w:t xml:space="preserve">3.7 A coverage-based APA screen yields candidate gradients but no confirmed APA event in the SOCE machinery</w:t>
       </w:r>
     </w:p>
     <w:p>
       <w:pPr>
         <w:pStyle w:val="FirstParagraph"/>
+        <w:jc w:val="both"/>
       </w:pPr>
       <w:r>
         <w:t xml:space="preserve">Cryptic polyadenylation accounts for a substantial part of TDP-43-dependent RNA processing </w:t>
@@ -4279,6 +4546,7 @@
     <w:p>
       <w:pPr>
         <w:pStyle w:val="BodyText"/>
+        <w:jc w:val="both"/>
       </w:pPr>
       <w:r>
         <w:t xml:space="preserve">In the primary SH-SY5Y model the positive control shifted only moderately: using all six libraries, the</w:t>
@@ -4319,6 +4587,7 @@
     <w:p>
       <w:pPr>
         <w:pStyle w:val="BodyText"/>
+        <w:jc w:val="both"/>
       </w:pPr>
       <w:r>
         <w:t xml:space="preserve">Among the depth-qualified units of the SOCE machinery in the full-panel analysis, two intronic units showed moderate decreases (</w:t>
@@ -4420,6 +4689,7 @@
     <w:p>
       <w:pPr>
         <w:pStyle w:val="BodyText"/>
+        <w:jc w:val="both"/>
       </w:pPr>
       <w:r>
         <w:t xml:space="preserve">The analysis therefore identifies at most one moderate candidate gradient in the SOCE machinery, in</w:t>
@@ -4602,6 +4872,7 @@
     <w:p>
       <w:pPr>
         <w:pStyle w:val="BodyText"/>
+        <w:jc w:val="both"/>
       </w:pPr>
       <w:r>
         <w:t xml:space="preserve">We therefore repeated the analysis in the iPSC-derived motor neurons, where 59 units in 29 genes passed the same depth filter. Here the assay’s positive control behaved as intended: the index of</w:t>
@@ -4713,12 +4984,13 @@
         <w:t xml:space="preserve"> </w:t>
       </w:r>
       <w:r>
-        <w:t xml:space="preserve">intron 13 gave −0.024, interval spanning zero). This comparison has only two replicates per group, so the enumerated bootstrap has sixteen draws and its intervals are coarse; the point estimates, not the intervals, carry the information.</w:t>
+        <w:t xml:space="preserve">intron 13 gave −0.024, interval spanning zero). For this comparison, n = 2, so the enumerated bootstrap has sixteen draws and its intervals are coarse; the point estimates, not the intervals, carry the information.</w:t>
       </w:r>
     </w:p>
     <w:p>
       <w:pPr>
         <w:pStyle w:val="BodyText"/>
+        <w:jc w:val="both"/>
       </w:pPr>
       <w:r>
         <w:t xml:space="preserve">The two mouse lines gave 74 qualifying units in C2C12 and 131 in NSC34. Neither has a positive control for this assay: the</w:t>
@@ -4838,6 +5110,7 @@
     <w:p>
       <w:pPr>
         <w:pStyle w:val="BodyText"/>
+        <w:jc w:val="both"/>
       </w:pPr>
       <w:r>
         <w:t xml:space="preserve">Taken together, these analyses support altered calcium-related RNA profiles but do not establish whether any SOCE-machinery gene is a direct target of cryptic splicing, APA or NMD-coupled degradation.</w:t>
@@ -4848,14 +5121,22 @@
     <w:p>
       <w:pPr>
         <w:pStyle w:val="Heading3"/>
+        <w:rPr>
+          <w:b w:val="1"/>
+        </w:rPr>
+        <w:jc w:val="left"/>
       </w:pPr>
       <w:r>
+        <w:rPr>
+          <w:b w:val="1"/>
+        </w:rPr>
         <w:t xml:space="preserve">3.8 Enrichment of splicing changes in Ca²⁺ genes is model-dependent</w:t>
       </w:r>
     </w:p>
     <w:p>
       <w:pPr>
         <w:pStyle w:val="FirstParagraph"/>
+        <w:jc w:val="both"/>
       </w:pPr>
       <w:r>
         <w:t xml:space="preserve">Testing whether Ca²⁺ genes are enriched for splicing changes required care, because power to detect an event scales with gene length, exon number and expression, and Ca²⁺ channel genes are extreme on all three.</w:t>
@@ -4864,6 +5145,7 @@
     <w:p>
       <w:pPr>
         <w:pStyle w:val="BodyText"/>
+        <w:jc w:val="both"/>
       </w:pPr>
       <w:r>
         <w:t xml:space="preserve">In SH-SY5Y, the expanded Ca²⁺ panel showed 133 of 383 testable genes with at least one significant event (34.7%) against a background of 30.7%, giving an uncorrected hypergeometric p = 0.051. Against the covariate-matched empirical null, however, the expected rate was 32.4% and the permutation p-value was 0.139 (Supplementary Table S4). The apparent enrichment in this model is therefore largely attributable to the length and expression properties of Ca²⁺ genes.</w:t>
@@ -4872,6 +5154,7 @@
     <w:p>
       <w:pPr>
         <w:pStyle w:val="BodyText"/>
+        <w:jc w:val="both"/>
       </w:pPr>
       <w:r>
         <w:t xml:space="preserve">The result differed by model. In iPSC-derived motor neurons, the most disease-relevant system examined, enrichment survived matching for both the channel/transport panel (p = 0.046) and the curated Ca²⁺-handling panel (p = 0.032), although neither p value would survive correction across the 24 dataset–panel combinations tested. In iPSC colonies, by contrast, nominally significant enrichment (hypergeometric p = 0.018–0.022) disappeared entirely against the matched null (p = 0.54–0.64).</w:t>
@@ -4880,6 +5163,7 @@
     <w:p>
       <w:pPr>
         <w:pStyle w:val="BodyText"/>
+        <w:jc w:val="both"/>
       </w:pPr>
       <w:r>
         <w:t xml:space="preserve">We therefore regard enrichment of splicing changes in Ca²⁺ homeostasis genes as a tentative, motor-neuron-associated observation rather than a general property of TDP-43 depletion.</w:t>
@@ -4890,14 +5174,22 @@
     <w:p>
       <w:pPr>
         <w:pStyle w:val="Heading3"/>
+        <w:rPr>
+          <w:b w:val="1"/>
+        </w:rPr>
+        <w:jc w:val="left"/>
       </w:pPr>
       <w:r>
+        <w:rPr>
+          <w:b w:val="1"/>
+        </w:rPr>
         <w:t xml:space="preserve">3.9 TRPC1, SARAF and CBARP differ across ALS and neurological comparison cohorts</w:t>
       </w:r>
     </w:p>
     <w:p>
       <w:pPr>
         <w:pStyle w:val="FirstParagraph"/>
+        <w:jc w:val="both"/>
       </w:pPr>
       <w:r>
         <w:t xml:space="preserve">We next asked whether these transcript-level changes are present in patient tissue (Figure 4; Table 5).</w:t>
@@ -4906,6 +5198,7 @@
     <w:p>
       <w:pPr>
         <w:pStyle w:val="BodyText"/>
+        <w:jc w:val="both"/>
       </w:pPr>
       <w:r>
         <w:t xml:space="preserve">In the NYGC ALS cohort,</w:t>
@@ -5020,6 +5313,7 @@
     <w:p>
       <w:pPr>
         <w:pStyle w:val="BodyText"/>
+        <w:jc w:val="both"/>
       </w:pPr>
       <w:r>
         <w:t xml:space="preserve">Notably, the ALS increase in</w:t>
@@ -5044,6 +5338,7 @@
     <w:p>
       <w:pPr>
         <w:pStyle w:val="BodyText"/>
+        <w:jc w:val="both"/>
       </w:pPr>
       <w:r>
         <w:t xml:space="preserve">The</w:t>
@@ -5096,6 +5391,7 @@
     <w:p>
       <w:pPr>
         <w:pStyle w:val="BodyText"/>
+        <w:jc w:val="both"/>
       </w:pPr>
       <w:r>
         <w:t xml:space="preserve">Three independent cohorts extended this (Supplementary Figure S7).</w:t>
@@ -5202,6 +5498,7 @@
     <w:p>
       <w:pPr>
         <w:pStyle w:val="BodyText"/>
+        <w:jc w:val="both"/>
       </w:pPr>
       <w:r>
         <w:t xml:space="preserve">Among the disease cohorts and regions surveyed here, ALS was the only setting in which</w:t>
@@ -5270,6 +5567,7 @@
         <w:pStyle w:val="Caption"/>
         <w:keepLines/>
         <w:spacing w:line="269" w:lineRule="auto" w:after="200"/>
+        <w:jc w:val="both"/>
       </w:pPr>
       <w:r>
         <w:rPr>
@@ -5292,14 +5590,22 @@
     <w:p>
       <w:pPr>
         <w:pStyle w:val="Heading3"/>
+        <w:rPr>
+          <w:b w:val="1"/>
+        </w:rPr>
+        <w:jc w:val="left"/>
       </w:pPr>
       <w:r>
+        <w:rPr>
+          <w:b w:val="1"/>
+        </w:rPr>
         <w:t xml:space="preserve">3.10 A junction-based marker of TDP-43 dysfunction does not correlate with TRPC1 within ALS regions</w:t>
       </w:r>
     </w:p>
     <w:p>
       <w:pPr>
         <w:pStyle w:val="FirstParagraph"/>
+        <w:jc w:val="both"/>
       </w:pPr>
       <w:r>
         <w:t xml:space="preserve">The comparisons above establish that</w:t>
@@ -5366,6 +5672,7 @@
     <w:p>
       <w:pPr>
         <w:pStyle w:val="BodyText"/>
+        <w:jc w:val="both"/>
       </w:pPr>
       <w:r>
         <w:t xml:space="preserve">The same cohort is present in recount3 as a junction count matrix, which allowed the truncated</w:t>
@@ -5419,6 +5726,7 @@
     <w:p>
       <w:pPr>
         <w:pStyle w:val="BodyText"/>
+        <w:jc w:val="both"/>
       </w:pPr>
       <w:r>
         <w:t xml:space="preserve">The junction-based measure also helps assess the proxy problem. Within ALS samples, gene-level</w:t>
@@ -5475,6 +5783,7 @@
     <w:p>
       <w:pPr>
         <w:pStyle w:val="BodyText"/>
+        <w:jc w:val="both"/>
       </w:pPr>
       <w:r>
         <w:t xml:space="preserve">Using this junction-based marker, we found no significant correlation between cryptic</w:t>
@@ -5701,6 +6010,7 @@
     <w:p>
       <w:pPr>
         <w:pStyle w:val="BodyText"/>
+        <w:jc w:val="both"/>
       </w:pPr>
       <w:r>
         <w:t xml:space="preserve">We therefore report the patient-tissue findings as association with ALS and not as evidence that TDP-43 loss drives them. The regional pattern makes the point sharply: cryptic</w:t>
@@ -5760,14 +6070,22 @@
     <w:p>
       <w:pPr>
         <w:pStyle w:val="Heading2"/>
+        <w:rPr>
+          <w:b w:val="1"/>
+        </w:rPr>
+        <w:jc w:val="left"/>
       </w:pPr>
       <w:r>
+        <w:rPr>
+          <w:b w:val="1"/>
+        </w:rPr>
         <w:t xml:space="preserve">4. Discussion</w:t>
       </w:r>
     </w:p>
     <w:p>
       <w:pPr>
         <w:pStyle w:val="FirstParagraph"/>
+        <w:jc w:val="both"/>
       </w:pPr>
       <w:r>
         <w:t>This study identifies a marked reduction in the Fura-2 Ca²⁺ readdition response after TDP-43 knockdown and connects that functional phenotype to coordinated changes in calcium-regulatory transcripts. The central feature is a mismatch between abundance and function: the adjusted STIM and ORAI transcript pools increased, yet the readdition response fell by approximately 84%. The data therefore do not support simple loss of the core SOCE machinery. They instead point to altered channel composition, feedback inhibition, ER refilling and cellular bioenergetics as interacting determinants. Across independent datasets, canonical TDP-43 RNA targets behaved as expected, whereas calcium-gene processing changes were selective and context dependent. This combination defines a multilayered calcium-homeostasis phenotype rather than uniform suppression of one channel or one RNA-processing event.</w:t>
@@ -5776,6 +6094,7 @@
     <w:p>
       <w:pPr>
         <w:pStyle w:val="BodyText"/>
+        <w:jc w:val="both"/>
       </w:pPr>
       <w:r>
         <w:rPr>
@@ -5808,6 +6127,7 @@
     <w:p>
       <w:pPr>
         <w:pStyle w:val="BodyText"/>
+        <w:jc w:val="both"/>
       </w:pPr>
       <w:r>
         <w:rPr>
@@ -5876,6 +6196,7 @@
     <w:p>
       <w:pPr>
         <w:pStyle w:val="BodyText"/>
+        <w:jc w:val="both"/>
       </w:pPr>
       <w:r>
         <w:rPr>
@@ -5926,6 +6247,7 @@
     <w:p>
       <w:pPr>
         <w:pStyle w:val="BodyText"/>
+        <w:jc w:val="both"/>
       </w:pPr>
       <w:r>
         <w:rPr>
@@ -5976,6 +6298,7 @@
     <w:p>
       <w:pPr>
         <w:pStyle w:val="BodyText"/>
+        <w:jc w:val="both"/>
       </w:pPr>
       <w:r>
         <w:rPr>
@@ -6008,6 +6331,7 @@
     <w:p>
       <w:pPr>
         <w:pStyle w:val="BodyText"/>
+        <w:jc w:val="both"/>
       </w:pPr>
       <w:r>
         <w:rPr>
@@ -6058,6 +6382,7 @@
     <w:p>
       <w:pPr>
         <w:pStyle w:val="BodyText"/>
+        <w:jc w:val="both"/>
       </w:pPr>
       <w:r>
         <w:rPr>
@@ -6108,6 +6433,7 @@
     <w:p>
       <w:pPr>
         <w:pStyle w:val="BodyText"/>
+        <w:jc w:val="both"/>
       </w:pPr>
       <w:r>
         <w:rPr>
@@ -6122,6 +6448,7 @@
     <w:p>
       <w:pPr>
         <w:pStyle w:val="BodyText"/>
+        <w:jc w:val="both"/>
       </w:pPr>
       <w:r>
         <w:rPr>
@@ -6174,14 +6501,22 @@
     <w:p>
       <w:pPr>
         <w:pStyle w:val="Heading2"/>
+        <w:rPr>
+          <w:b w:val="1"/>
+        </w:rPr>
+        <w:jc w:val="left"/>
       </w:pPr>
       <w:r>
+        <w:rPr>
+          <w:b w:val="1"/>
+        </w:rPr>
         <w:t xml:space="preserve">5. Conclusion</w:t>
       </w:r>
     </w:p>
     <w:p>
       <w:pPr>
         <w:pStyle w:val="FirstParagraph"/>
+        <w:jc w:val="both"/>
       </w:pPr>
       <w:r>
         <w:t xml:space="preserve">TDP-43 depletion in SH-SY5Y cells was associated with a large reduction in Fura-2-measured SOCE and with altered expression and splicing of calcium-regulatory genes. Transcript-family summaries and reproducible</w:t>
@@ -6317,14 +6652,22 @@
     <w:p>
       <w:pPr>
         <w:pStyle w:val="Heading2"/>
+        <w:rPr>
+          <w:b w:val="1"/>
+        </w:rPr>
+        <w:jc w:val="left"/>
       </w:pPr>
       <w:r>
+        <w:rPr>
+          <w:b w:val="1"/>
+        </w:rPr>
         <w:t xml:space="preserve">Declarations</w:t>
       </w:r>
     </w:p>
     <w:p>
       <w:pPr>
         <w:pStyle w:val="FirstParagraph"/>
+        <w:jc w:val="both"/>
       </w:pPr>
       <w:r>
         <w:rPr>
@@ -6343,6 +6686,7 @@
     <w:p>
       <w:pPr>
         <w:pStyle w:val="BodyText"/>
+        <w:jc w:val="both"/>
       </w:pPr>
       <w:r>
         <w:rPr>
@@ -6361,6 +6705,7 @@
     <w:p>
       <w:pPr>
         <w:pStyle w:val="BodyText"/>
+        <w:jc w:val="both"/>
       </w:pPr>
       <w:r>
         <w:rPr>
@@ -6379,6 +6724,7 @@
     <w:p>
       <w:pPr>
         <w:pStyle w:val="BodyText"/>
+        <w:jc w:val="both"/>
       </w:pPr>
       <w:r>
         <w:rPr>
@@ -6397,6 +6743,7 @@
     <w:p>
       <w:pPr>
         <w:pStyle w:val="BodyText"/>
+        <w:jc w:val="both"/>
       </w:pPr>
       <w:r>
         <w:rPr>
@@ -6430,14 +6777,22 @@
     <w:p>
       <w:pPr>
         <w:pStyle w:val="Heading2"/>
+        <w:rPr>
+          <w:b w:val="1"/>
+        </w:rPr>
+        <w:jc w:val="left"/>
       </w:pPr>
       <w:r>
+        <w:rPr>
+          <w:b w:val="1"/>
+        </w:rPr>
         <w:t xml:space="preserve">Declaration of generative AI and AI-assisted technologies in the manuscript preparation process</w:t>
       </w:r>
     </w:p>
     <w:p>
       <w:pPr>
         <w:pStyle w:val="FirstParagraph"/>
+        <w:jc w:val="both"/>
       </w:pPr>
       <w:r>
         <w:t xml:space="preserve">During preparation of this manuscript, the authors used Anthropic Claude for an initial manuscript draft and OpenAI Codex to assist with editorial review, language revision, formatting and consistency checks. The authors reviewed and edited the output and take full responsibility for the content of the submitted article.</w:t>
@@ -6448,14 +6803,22 @@
     <w:p>
       <w:pPr>
         <w:pStyle w:val="Heading2"/>
+        <w:rPr>
+          <w:b w:val="1"/>
+        </w:rPr>
+        <w:jc w:val="left"/>
       </w:pPr>
       <w:r>
+        <w:rPr>
+          <w:b w:val="1"/>
+        </w:rPr>
         <w:t xml:space="preserve">Acknowledgements</w:t>
       </w:r>
     </w:p>
     <w:p>
       <w:pPr>
         <w:pStyle w:val="FirstParagraph"/>
+        <w:jc w:val="both"/>
       </w:pPr>
       <w:r>
         <w:t xml:space="preserve">This article is derived from the doctoral thesis of Elmasnur Yılmaz (Ege University, Graduate School of Natural and Applied Sciences, Department of Biotechnology, 2026). The authors thank the ALS Consortium of the New York Genome Center and Target ALS for making the post-mortem RNA-seq data available, the ENCODE Consortium for the K562 knockdown data, and the authors of GSE296712, GSE230647, GSE77702, GSE27394, GSE171714, GSE307054, GSE125583, GSE68719, GSE138614 and GSE123496 for depositing their raw data.</w:t>
@@ -6466,8 +6829,15 @@
     <w:p>
       <w:pPr>
         <w:pStyle w:val="Heading2"/>
+        <w:rPr>
+          <w:b w:val="1"/>
+        </w:rPr>
+        <w:jc w:val="left"/>
       </w:pPr>
       <w:r>
+        <w:rPr>
+          <w:b w:val="1"/>
+        </w:rPr>
         <w:t xml:space="preserve">References</w:t>
       </w:r>
     </w:p>
@@ -6483,6 +6853,7 @@
       </w:r>
       <w:pPr>
         <w:pStyle w:val="FirstParagraph"/>
+        <w:jc w:val="both"/>
       </w:pPr>
       <w:r>
         <w:t xml:space="preserve">Albarran L, Lopez JJ, Woodard GE, Salido GM, Rosado JA. Store-operated Ca²⁺ entry-associated regulatory factor (SARAF) plays an important role in the regulation of arachidonate-regulated Ca²⁺ (ARC) channels.</w:t>
@@ -6504,6 +6875,7 @@
     <w:p>
       <w:pPr>
         <w:pStyle w:val="BodyText"/>
+        <w:jc w:val="both"/>
       </w:pPr>
       <w:r>
         <w:t xml:space="preserve">Ambudkar IS, Ong HL, Liu X, Bandyopadhyay BC, Cheng KT. TRPC1: the link between functionally distinct store-operated calcium channels.</w:t>
@@ -6525,6 +6897,7 @@
     <w:p>
       <w:pPr>
         <w:pStyle w:val="BodyText"/>
+        <w:jc w:val="both"/>
       </w:pPr>
       <w:r>
         <w:t xml:space="preserve">Andrews S. FastQC: a quality control tool for high throughput sequence data. Babraham Bioinformatics; 2010. https://www.bioinformatics.babraham.ac.uk/projects/fastqc/</w:t>
@@ -6533,6 +6906,7 @@
     <w:p>
       <w:pPr>
         <w:pStyle w:val="BodyText"/>
+        <w:jc w:val="both"/>
       </w:pPr>
       <w:r>
         <w:t xml:space="preserve">Arai T, Hasegawa M, Akiyama H, et al. TDP-43 is a component of ubiquitin-positive tau-negative inclusions in frontotemporal lobar degeneration and amyotrophic lateral sclerosis.</w:t>
@@ -6554,6 +6928,7 @@
     <w:p>
       <w:pPr>
         <w:pStyle w:val="BodyText"/>
+        <w:jc w:val="both"/>
       </w:pPr>
       <w:r>
         <w:t xml:space="preserve">Baughn MW, Melamed Z, López-Erauskin J, et al. Mechanism of STMN2 cryptic splice-polyadenylation and its correction for TDP-43 proteinopathies.</w:t>
@@ -6575,6 +6950,7 @@
     <w:p>
       <w:pPr>
         <w:pStyle w:val="BodyText"/>
+        <w:jc w:val="both"/>
       </w:pPr>
       <w:r>
         <w:t xml:space="preserve">Béguin P, Nagashima K, Mahalakshmi RN, et al. BARP suppresses voltage-gated calcium channel activity and Ca²⁺-evoked exocytosis.</w:t>
@@ -6596,6 +6972,7 @@
     <w:p>
       <w:pPr>
         <w:pStyle w:val="BodyText"/>
+        <w:jc w:val="both"/>
       </w:pPr>
       <w:r>
         <w:t xml:space="preserve">Benjamini Y, Hochberg Y. Controlling the false discovery rate: a practical and powerful approach to multiple testing.</w:t>
@@ -6617,6 +6994,7 @@
     <w:p>
       <w:pPr>
         <w:pStyle w:val="BodyText"/>
+        <w:jc w:val="both"/>
       </w:pPr>
       <w:r>
         <w:t xml:space="preserve">Brown AL, Wilkins OG, Keuss MJ, et al. TDP-43 loss and ALS-risk SNPs drive mis-splicing and depletion of UNC13A.</w:t>
@@ -6638,6 +7016,7 @@
     <w:p>
       <w:pPr>
         <w:pStyle w:val="BodyText"/>
+        <w:jc w:val="both"/>
       </w:pPr>
       <w:r>
         <w:t xml:space="preserve">Bryce-Smith S, Brown AL, Chien MZYJ, et al. TDP-43 loss induces cryptic polyadenylation in ALS/FTD.</w:t>
@@ -6659,6 +7038,7 @@
     <w:p>
       <w:pPr>
         <w:pStyle w:val="BodyText"/>
+        <w:jc w:val="both"/>
       </w:pPr>
       <w:r>
         <w:t xml:space="preserve">Ceron-Codorniu M, Torres P, Fernàndez-Bernal A, et al. TDP-43 dysfunction leads to bioenergetic failure and lipid metabolic rewiring in human cells. </w:t>
@@ -6676,6 +7056,7 @@
     <w:p>
       <w:pPr>
         <w:pStyle w:val="BodyText"/>
+        <w:jc w:val="both"/>
       </w:pPr>
       <w:r>
         <w:t xml:space="preserve">Cliff N. Dominance statistics: ordinal analyses to answer ordinal questions.</w:t>
@@ -6697,6 +7078,7 @@
     <w:p>
       <w:pPr>
         <w:pStyle w:val="BodyText"/>
+        <w:jc w:val="both"/>
       </w:pPr>
       <w:r>
         <w:t xml:space="preserve">Cotto KC, Feng YY, Ramu A, et al. Integrated analysis of genomic and transcriptomic data for the discovery of splice-associated variants in cancer.</w:t>
@@ -6718,6 +7100,7 @@
     <w:p>
       <w:pPr>
         <w:pStyle w:val="BodyText"/>
+        <w:jc w:val="both"/>
       </w:pPr>
       <w:r>
         <w:t xml:space="preserve">Danecek P, Bonfield JK, Liddle J, et al. Twelve years of SAMtools and BCFtools.</w:t>
@@ -6739,6 +7122,7 @@
     <w:p>
       <w:pPr>
         <w:pStyle w:val="BodyText"/>
+        <w:jc w:val="both"/>
       </w:pPr>
       <w:r>
         <w:t xml:space="preserve">Dumitriu A, Golji J, Labadorf AT, et al. Integrative analyses of proteomics and RNA transcriptomics implicate mitochondrial processes, protein folding pathways and GWAS loci in Parkinson disease.</w:t>
@@ -6760,6 +7144,7 @@
     <w:p>
       <w:pPr>
         <w:pStyle w:val="BodyText"/>
+        <w:jc w:val="both"/>
       </w:pPr>
       <w:r>
         <w:t xml:space="preserve">Elkjaer ML, Frisch T, Reynolds R, et al. Molecular signature of different lesion types in the brain white matter of patients with progressive multiple sclerosis.</w:t>
@@ -6781,6 +7166,7 @@
     <w:p>
       <w:pPr>
         <w:pStyle w:val="BodyText"/>
+        <w:jc w:val="both"/>
       </w:pPr>
       <w:r>
         <w:t xml:space="preserve">Ewels P, Magnusson M, Lundin S, Käller M. MultiQC: summarize analysis results for multiple tools and samples in a single report.</w:t>
@@ -6802,6 +7188,7 @@
     <w:p>
       <w:pPr>
         <w:pStyle w:val="BodyText"/>
+        <w:jc w:val="both"/>
       </w:pPr>
       <w:r>
         <w:t xml:space="preserve">Frankish A, Diekhans M, Ferreira A-M, et al. GENCODE reference annotation for the human and mouse genomes.</w:t>
@@ -6823,6 +7210,7 @@
     <w:p>
       <w:pPr>
         <w:pStyle w:val="BodyText"/>
+        <w:jc w:val="both"/>
       </w:pPr>
       <w:r>
         <w:t xml:space="preserve">Grosskreutz J, Van Den Bosch L, Keller BU. Calcium dysregulation in amyotrophic lateral sclerosis.</w:t>
@@ -6844,6 +7232,7 @@
     <w:p>
       <w:pPr>
         <w:pStyle w:val="BodyText"/>
+        <w:jc w:val="both"/>
       </w:pPr>
       <w:r>
         <w:t xml:space="preserve">Grynkiewicz G, Poenie M, Tsien RY. A new generation of Ca²⁺ indicators with greatly improved fluorescence properties.</w:t>
@@ -6865,6 +7254,7 @@
     <w:p>
       <w:pPr>
         <w:pStyle w:val="BodyText"/>
+        <w:jc w:val="both"/>
       </w:pPr>
       <w:r>
         <w:t xml:space="preserve">Hoover PJ, Lewis RS. Stoichiometric requirements for trapping and gating of Ca²⁺ release-activated Ca²⁺ (CRAC) channels by stromal interaction molecule 1 (STIM1).</w:t>
@@ -6886,6 +7276,7 @@
     <w:p>
       <w:pPr>
         <w:pStyle w:val="BodyText"/>
+        <w:jc w:val="both"/>
       </w:pPr>
       <w:r>
         <w:t xml:space="preserve">Hruska-Plochan M, Wiersma VI, Betz KM, et al. A model of human neural networks reveals NPTX2 pathology in ALS and FTLD.</w:t>
@@ -6907,6 +7298,7 @@
     <w:p>
       <w:pPr>
         <w:pStyle w:val="BodyText"/>
+        <w:jc w:val="both"/>
       </w:pPr>
       <w:r>
         <w:t xml:space="preserve">Jing J, He L, Sun A, et al. Proteomic mapping of ER–PM junctions identifies STIMATE as a regulator of Ca²⁺ influx.</w:t>
@@ -6928,6 +7320,7 @@
     <w:p>
       <w:pPr>
         <w:pStyle w:val="BodyText"/>
+        <w:jc w:val="both"/>
       </w:pPr>
       <w:r>
         <w:t xml:space="preserve">Kapeli K, Pratt GA, Vu AQ, et al. Distinct and shared functions of ALS-associated proteins TDP-43, FUS and TAF15 revealed by multisystem analyses.</w:t>
@@ -6949,6 +7342,7 @@
     <w:p>
       <w:pPr>
         <w:pStyle w:val="BodyText"/>
+        <w:jc w:val="both"/>
       </w:pPr>
       <w:r>
         <w:t xml:space="preserve">Kawamata H, Ng SK, Diaz N, et al. Abnormal intracellular calcium signaling and SNARE-dependent exocytosis contributes to SOD1G93A astrocyte-mediated toxicity in amyotrophic lateral sclerosis. </w:t>
@@ -6966,6 +7360,7 @@
     <w:p>
       <w:pPr>
         <w:pStyle w:val="BodyText"/>
+        <w:jc w:val="both"/>
       </w:pPr>
       <w:r>
         <w:t xml:space="preserve">Keuss MJ, Harley P, Ryadnov E, et al. Loss of TDP-43 induces synaptic dysfunction that is rescued by UNC13A splice-switching ASOs.</w:t>
@@ -6987,6 +7382,7 @@
     <w:p>
       <w:pPr>
         <w:pStyle w:val="BodyText"/>
+        <w:jc w:val="both"/>
       </w:pPr>
       <w:r>
         <w:t xml:space="preserve">Kim D, Paggi JM, Park C, Bennett C, Salzberg SL. Graph-based genome alignment and genotyping with HISAT2 and HISAT-genotype.</w:t>
@@ -7008,6 +7404,7 @@
     <w:p>
       <w:pPr>
         <w:pStyle w:val="BodyText"/>
+        <w:jc w:val="both"/>
       </w:pPr>
       <w:r>
         <w:t xml:space="preserve">Klim JR, Williams LA, Limone F, et al. ALS-implicated protein TDP-43 sustains levels of STMN2, a mediator of motor neuron growth and repair.</w:t>
@@ -7029,6 +7426,7 @@
     <w:p>
       <w:pPr>
         <w:pStyle w:val="BodyText"/>
+        <w:jc w:val="both"/>
       </w:pPr>
       <w:r>
         <w:t xml:space="preserve">Kwon J, An H, Sa M, et al. Orai1 and Orai3 in combination with Stim1 mediate the majority of store-operated calcium entry in astrocytes. </w:t>
@@ -7046,6 +7444,7 @@
     <w:p>
       <w:pPr>
         <w:pStyle w:val="BodyText"/>
+        <w:jc w:val="both"/>
       </w:pPr>
       <w:r>
         <w:t xml:space="preserve">Lambert JP, Luongo TS, Tomar D, et al. MCUB regulates the molecular composition of the mitochondrial calcium uniporter channel to limit mitochondrial calcium overload during stress.</w:t>
@@ -7067,6 +7466,7 @@
     <w:p>
       <w:pPr>
         <w:pStyle w:val="BodyText"/>
+        <w:jc w:val="both"/>
       </w:pPr>
       <w:r>
         <w:t xml:space="preserve">Leek JT. svaseq: removing batch effects and other unwanted noise from sequencing data.</w:t>
@@ -7088,6 +7488,7 @@
     <w:p>
       <w:pPr>
         <w:pStyle w:val="BodyText"/>
+        <w:jc w:val="both"/>
       </w:pPr>
       <w:r>
         <w:t xml:space="preserve">Li YI, Knowles DA, Humphrey J, et al. Annotation-free quantification of RNA splicing using LeafCutter.</w:t>
@@ -7109,6 +7510,7 @@
     <w:p>
       <w:pPr>
         <w:pStyle w:val="BodyText"/>
+        <w:jc w:val="both"/>
       </w:pPr>
       <w:r>
         <w:t xml:space="preserve">Liao Y, Smyth GK, Shi W. featureCounts: an efficient general purpose program for assigning sequence reads to genomic features.</w:t>
@@ -7130,6 +7532,7 @@
     <w:p>
       <w:pPr>
         <w:pStyle w:val="BodyText"/>
+        <w:jc w:val="both"/>
       </w:pPr>
       <w:r>
         <w:t xml:space="preserve">Ling JP, Pletnikova O, Troncoso JC, Wong PC. TDP-43 repression of nonconserved cryptic exons is compromised in ALS-FTD.</w:t>
@@ -7151,6 +7554,7 @@
     <w:p>
       <w:pPr>
         <w:pStyle w:val="BodyText"/>
+        <w:jc w:val="both"/>
       </w:pPr>
       <w:r>
         <w:t xml:space="preserve">Ling S-C, Polymenidou M, Cleveland DW. Converging mechanisms in ALS and FTD: disrupted RNA and protein homeostasis.</w:t>
@@ -7172,6 +7576,7 @@
     <w:p>
       <w:pPr>
         <w:pStyle w:val="BodyText"/>
+        <w:jc w:val="both"/>
       </w:pPr>
       <w:r>
         <w:t xml:space="preserve">Livak KJ, Schmittgen TD. Analysis of relative gene expression data using real-time quantitative PCR and the 2</w:t>
@@ -7205,6 +7610,7 @@
     <w:p>
       <w:pPr>
         <w:pStyle w:val="BodyText"/>
+        <w:jc w:val="both"/>
       </w:pPr>
       <w:r>
         <w:t xml:space="preserve">Love MI, Huber W, Anders S. Moderated estimation of fold change and dispersion for RNA-seq data with DESeq2.</w:t>
@@ -7226,6 +7632,7 @@
     <w:p>
       <w:pPr>
         <w:pStyle w:val="BodyText"/>
+        <w:jc w:val="both"/>
       </w:pPr>
       <w:r>
         <w:t xml:space="preserve">Ma XR, Prudencio M, Koike Y, et al. TDP-43 represses cryptic exon inclusion in the FTD–ALS gene UNC13A.</w:t>
@@ -7247,6 +7654,7 @@
     <w:p>
       <w:pPr>
         <w:pStyle w:val="BodyText"/>
+        <w:jc w:val="both"/>
       </w:pPr>
       <w:r>
         <w:t xml:space="preserve">Markovinovic A, Martín-Guerrero SM, Mórotz GM, et al. Stimulating VAPB–PTPIP51 ER–mitochondria tethering corrects FTD/ALS mutant TDP43-linked Ca²⁺ and synaptic defects. </w:t>
@@ -7264,6 +7672,7 @@
     <w:p>
       <w:pPr>
         <w:pStyle w:val="BodyText"/>
+        <w:jc w:val="both"/>
       </w:pPr>
       <w:r>
         <w:t xml:space="preserve">Martin M. Cutadapt removes adapter sequences from high-throughput sequencing reads.</w:t>
@@ -7285,6 +7694,7 @@
     <w:p>
       <w:pPr>
         <w:pStyle w:val="BodyText"/>
+        <w:jc w:val="both"/>
       </w:pPr>
       <w:r>
         <w:t xml:space="preserve">Melamed Z, López-Erauskin J, Baughn MW, et al. Premature polyadenylation-mediated loss of stathmin-2 is a hallmark of TDP-43-dependent neurodegeneration.</w:t>
@@ -7306,6 +7716,7 @@
     <w:p>
       <w:pPr>
         <w:pStyle w:val="BodyText"/>
+        <w:jc w:val="both"/>
       </w:pPr>
       <w:r>
         <w:t xml:space="preserve">Mertes C, Scheller IF, Yépez VA, et al. Detection of aberrant splicing events in RNA-seq data using FRASER.</w:t>
@@ -7327,6 +7738,7 @@
     <w:p>
       <w:pPr>
         <w:pStyle w:val="BodyText"/>
+        <w:jc w:val="both"/>
       </w:pPr>
       <w:r>
         <w:t xml:space="preserve">Miederer AM, Alansary D, Schwär G, et al. A STIM2 splice variant negatively regulates store-operated calcium entry.</w:t>
@@ -7348,6 +7760,7 @@
     <w:p>
       <w:pPr>
         <w:pStyle w:val="BodyText"/>
+        <w:jc w:val="both"/>
       </w:pPr>
       <w:r>
         <w:t xml:space="preserve">National Center for Biotechnology Information (NCBI). SRA Toolkit, version 3.2.1. 2025. https://github.com/ncbi/sra-tools/</w:t>
@@ -7356,6 +7769,7 @@
     <w:p>
       <w:pPr>
         <w:pStyle w:val="BodyText"/>
+        <w:jc w:val="both"/>
       </w:pPr>
       <w:r>
         <w:t xml:space="preserve">Nelson PT, Dickson DW, Trojanowski JQ, et al. Limbic-predominant age-related TDP-43 encephalopathy (LATE): consensus working group report.</w:t>
@@ -7377,6 +7791,7 @@
     <w:p>
       <w:pPr>
         <w:pStyle w:val="BodyText"/>
+        <w:jc w:val="both"/>
       </w:pPr>
       <w:r>
         <w:t xml:space="preserve">Neumann M, Sampathu DM, Kwong LK, et al. Ubiquitinated TDP-43 in frontotemporal lobar degeneration and amyotrophic lateral sclerosis.</w:t>
@@ -7398,6 +7813,7 @@
     <w:p>
       <w:pPr>
         <w:pStyle w:val="BodyText"/>
+        <w:jc w:val="both"/>
       </w:pPr>
       <w:r>
         <w:t xml:space="preserve">Norante RP, Peggion C, Rossi D, et al. ALS-associated SOD1(G93A) decreases SERCA pump levels and increases store-operated Ca²⁺ entry in primary spinal cord astrocytes from a transgenic mouse model. </w:t>
@@ -7415,6 +7831,7 @@
     <w:p>
       <w:pPr>
         <w:pStyle w:val="BodyText"/>
+        <w:jc w:val="both"/>
       </w:pPr>
       <w:r>
         <w:t xml:space="preserve">Nowicka M, Robinson MD. DRIMSeq: a Dirichlet-multinomial framework for multivariate count outcomes in genomics.</w:t>
@@ -7436,6 +7853,7 @@
     <w:p>
       <w:pPr>
         <w:pStyle w:val="BodyText"/>
+        <w:jc w:val="both"/>
       </w:pPr>
       <w:r>
         <w:t xml:space="preserve">Paez PM, Fulton D, Spreuer V, Handley V, Campagnoni AT. Modulation of canonical transient receptor potential channel 1 in the proliferation of oligodendrocyte precursor cells by the golli products of the myelin basic protein gene.</w:t>
@@ -7457,6 +7875,7 @@
     <w:p>
       <w:pPr>
         <w:pStyle w:val="BodyText"/>
+        <w:jc w:val="both"/>
       </w:pPr>
       <w:r>
         <w:t xml:space="preserve">Palty R, Raveh A, Kaminsky I, Meller R, Reuveny E. SARAF inactivates the store operated calcium entry machinery to prevent excess calcium refilling.</w:t>
@@ -7478,6 +7897,7 @@
     <w:p>
       <w:pPr>
         <w:pStyle w:val="BodyText"/>
+        <w:jc w:val="both"/>
       </w:pPr>
       <w:r>
         <w:t xml:space="preserve">Patro R, Duggal G, Love MI, Irizarry RA, Kingsford C. Salmon provides fast and bias-aware quantification of transcript expression.</w:t>
@@ -7499,6 +7919,7 @@
     <w:p>
       <w:pPr>
         <w:pStyle w:val="BodyText"/>
+        <w:jc w:val="both"/>
       </w:pPr>
       <w:r>
         <w:t xml:space="preserve">Polymenidou M, Lagier-Tourenne C, Hutt KR, et al. Long pre-mRNA depletion and RNA missplicing contribute to neuronal vulnerability from loss of TDP-43.</w:t>
@@ -7520,6 +7941,7 @@
     <w:p>
       <w:pPr>
         <w:pStyle w:val="BodyText"/>
+        <w:jc w:val="both"/>
       </w:pPr>
       <w:r>
         <w:t xml:space="preserve">Prakriya M, Lewis RS. Store-operated calcium channels.</w:t>
@@ -7541,6 +7963,7 @@
     <w:p>
       <w:pPr>
         <w:pStyle w:val="BodyText"/>
+        <w:jc w:val="both"/>
       </w:pPr>
       <w:r>
         <w:t xml:space="preserve">Prudencio M, Humphrey J, Pickles S, et al. Truncated stathmin-2 is a marker of TDP-43 pathology in frontotemporal dementia.</w:t>
@@ -7562,6 +7985,7 @@
     <w:p>
       <w:pPr>
         <w:pStyle w:val="BodyText"/>
+        <w:jc w:val="both"/>
       </w:pPr>
       <w:r>
         <w:t xml:space="preserve">Putney JW. Pharmacology of store-operated calcium channels.</w:t>
@@ -7583,6 +8007,7 @@
     <w:p>
       <w:pPr>
         <w:pStyle w:val="BodyText"/>
+        <w:jc w:val="both"/>
       </w:pPr>
       <w:r>
         <w:t xml:space="preserve">Rana A, Yen M, Sadaghiani AM, et al. Alternative splicing converts STIM2 from an activator to an inhibitor of store-operated calcium channels.</w:t>
@@ -7604,6 +8029,7 @@
     <w:p>
       <w:pPr>
         <w:pStyle w:val="BodyText"/>
+        <w:jc w:val="both"/>
       </w:pPr>
       <w:r>
         <w:t xml:space="preserve">Selli Ç, Eraç Y, Kosova B, Tosun M. Post-transcriptional silencing of TRPC1 ion channel gene by RNA interference upregulates TRPC6 expression and store-operated Ca²⁺ entry in A7r5 vascular smooth muscle cells.</w:t>
@@ -7625,6 +8051,7 @@
     <w:p>
       <w:pPr>
         <w:pStyle w:val="BodyText"/>
+        <w:jc w:val="both"/>
       </w:pPr>
       <w:r>
         <w:t xml:space="preserve">Selvaraj S, Sun Y, Watt JA, et al. Neurotoxin-induced ER stress in mouse dopaminergic neurons involves downregulation of TRPC1 and inhibition of AKT/mTOR signaling.</w:t>
@@ -7646,6 +8073,7 @@
     <w:p>
       <w:pPr>
         <w:pStyle w:val="BodyText"/>
+        <w:jc w:val="both"/>
       </w:pPr>
       <w:r>
         <w:t xml:space="preserve">Shen S, Park JW, Lu Z-x, et al. rMATS: robust and flexible detection of differential alternative splicing from replicate RNA-Seq data.</w:t>
@@ -7667,6 +8095,7 @@
     <w:p>
       <w:pPr>
         <w:pStyle w:val="BodyText"/>
+        <w:jc w:val="both"/>
       </w:pPr>
       <w:r>
         <w:t xml:space="preserve">Sinha IR, Ye Y, Li Y, et al. Inhibition of nonsense-mediated decay in TDP-43 deficient neurons reveals novel cryptic exons.</w:t>
@@ -7691,6 +8120,7 @@
     <w:p>
       <w:pPr>
         <w:pStyle w:val="BodyText"/>
+        <w:jc w:val="both"/>
       </w:pPr>
       <w:r>
         <w:t xml:space="preserve">Srinivasan K, Friedman BA, Etxeberria A, et al. Alzheimer’s patient microglia exhibit enhanced aging and unique transcriptional activation.</w:t>
@@ -7712,6 +8142,7 @@
     <w:p>
       <w:pPr>
         <w:pStyle w:val="BodyText"/>
+        <w:jc w:val="both"/>
       </w:pPr>
       <w:r>
         <w:t xml:space="preserve">Stoica R, De Vos KJ, Paillusson S, et al. ER–mitochondria associations are regulated by the VAPB–PTPIP51 interaction and are disrupted by ALS/FTD-associated TDP-43.</w:t>
@@ -7733,6 +8164,7 @@
     <w:p>
       <w:pPr>
         <w:pStyle w:val="BodyText"/>
+        <w:jc w:val="both"/>
       </w:pPr>
       <w:r>
         <w:t xml:space="preserve">Šušnjar U, Škrabar N, Brown AL, et al. Cell environment shapes TDP-43 function with implications in neuronal and muscle disease.</w:t>
@@ -7754,6 +8186,7 @@
     <w:p>
       <w:pPr>
         <w:pStyle w:val="BodyText"/>
+        <w:jc w:val="both"/>
       </w:pPr>
       <w:r>
         <w:t xml:space="preserve">Trincado JL, Entizne JC, Hysenaj G, et al. SUPPA2: fast, accurate, and uncertainty-aware differential splicing analysis across multiple conditions.</w:t>
@@ -7775,6 +8208,7 @@
     <w:p>
       <w:pPr>
         <w:pStyle w:val="BodyText"/>
+        <w:jc w:val="both"/>
       </w:pPr>
       <w:r>
         <w:t xml:space="preserve">Vaeth M, Yang J, Yamashita M, et al. ORAI2 modulates store-operated calcium entry and T cell-mediated immunity.</w:t>
@@ -7796,6 +8230,7 @@
     <w:p>
       <w:pPr>
         <w:pStyle w:val="BodyText"/>
+        <w:jc w:val="both"/>
       </w:pPr>
       <w:r>
         <w:t xml:space="preserve">Van den Berge K, Soneson C, Robinson MD, Clement L. stageR: a general stage-wise method for controlling the gene-level false discovery rate in differential expression and differential transcript usage.</w:t>
@@ -7817,6 +8252,7 @@
     <w:p>
       <w:pPr>
         <w:pStyle w:val="BodyText"/>
+        <w:jc w:val="both"/>
       </w:pPr>
       <w:r>
         <w:t xml:space="preserve">Van Nostrand EL, Freese P, Pratt GA, et al. A large-scale binding and functional map of human RNA-binding proteins.</w:t>
@@ -7838,6 +8274,7 @@
     <w:p>
       <w:pPr>
         <w:pStyle w:val="BodyText"/>
+        <w:jc w:val="both"/>
       </w:pPr>
       <w:r>
         <w:t xml:space="preserve">Vaquero-Garcia J, Barrera A, Gazzara MR, et al. A new view of transcriptome complexity and regulation through the lens of local splicing variations.</w:t>
@@ -7859,6 +8296,7 @@
     <w:p>
       <w:pPr>
         <w:pStyle w:val="BodyText"/>
+        <w:jc w:val="both"/>
       </w:pPr>
       <w:r>
         <w:t xml:space="preserve">Vitting-Seerup K, Sandelin A. IsoformSwitchAnalyzeR: analysis of changes in genome-wide patterns of alternative splicing and its functional consequences.</w:t>
@@ -7880,6 +8318,7 @@
     <w:p>
       <w:pPr>
         <w:pStyle w:val="BodyText"/>
+        <w:jc w:val="both"/>
       </w:pPr>
       <w:r>
         <w:t xml:space="preserve">Voskuhl RR, Itoh N, Tassoni A, et al. Gene expression in oligodendrocytes during remyelination reveals cholesterol homeostasis as a therapeutic target in multiple sclerosis.</w:t>
@@ -7901,6 +8340,7 @@
     <w:p>
       <w:pPr>
         <w:pStyle w:val="BodyText"/>
+        <w:jc w:val="both"/>
       </w:pPr>
       <w:r>
         <w:t xml:space="preserve">Wilks C, Zheng SC, Chen FY, et al. recount3: summaries and queries for large-scale RNA-seq expression and splicing.</w:t>
@@ -7922,6 +8362,7 @@
     <w:p>
       <w:pPr>
         <w:pStyle w:val="BodyText"/>
+        <w:jc w:val="both"/>
       </w:pPr>
       <w:r>
         <w:t xml:space="preserve">Xia Z, Donehower LA, Cooper TA, et al. Dynamic analyses of alternative polyadenylation from RNA-seq reveal a 3′-UTR landscape across seven tumour types.</w:t>
@@ -7943,6 +8384,7 @@
     <w:p>
       <w:pPr>
         <w:pStyle w:val="BodyText"/>
+        <w:jc w:val="both"/>
       </w:pPr>
       <w:r>
         <w:t xml:space="preserve">Yoast RE, Emrich SM, Zhang X, et al. The native ORAI channel trio underlies the diversity of Ca²⁺ signaling events.</w:t>
@@ -7969,6 +8411,7 @@
     <w:p>
       <w:pPr>
         <w:pStyle w:val="BodyText"/>
+        <w:jc w:val="both"/>
       </w:pPr>
       <w:r>
         <w:rPr>
@@ -7987,6 +8430,7 @@
     <w:p>
       <w:pPr>
         <w:pStyle w:val="BodyText"/>
+        <w:jc w:val="both"/>
       </w:pPr>
       <w:r>
         <w:rPr>
@@ -8005,6 +8449,7 @@
     <w:p>
       <w:pPr>
         <w:pStyle w:val="BodyText"/>
+        <w:jc w:val="both"/>
       </w:pPr>
       <w:r>
         <w:rPr>
@@ -8023,6 +8468,7 @@
     <w:p>
       <w:pPr>
         <w:pStyle w:val="BodyText"/>
+        <w:jc w:val="both"/>
       </w:pPr>
       <w:r>
         <w:rPr>
@@ -8041,6 +8487,7 @@
     <w:p>
       <w:pPr>
         <w:pStyle w:val="BodyText"/>
+        <w:jc w:val="both"/>
       </w:pPr>
       <w:r>
         <w:rPr>
@@ -8059,6 +8506,7 @@
     <w:p>
       <w:pPr>
         <w:pStyle w:val="BodyText"/>
+        <w:jc w:val="both"/>
       </w:pPr>
       <w:r>
         <w:rPr>
@@ -8077,6 +8525,7 @@
     <w:p>
       <w:pPr>
         <w:pStyle w:val="BodyText"/>
+        <w:jc w:val="both"/>
       </w:pPr>
       <w:r>
         <w:rPr>
@@ -8095,6 +8544,7 @@
     <w:p>
       <w:pPr>
         <w:pStyle w:val="BodyText"/>
+        <w:jc w:val="both"/>
       </w:pPr>
       <w:r>
         <w:rPr>
@@ -8129,6 +8579,7 @@
     <w:p>
       <w:pPr>
         <w:pStyle w:val="BodyText"/>
+        <w:jc w:val="both"/>
       </w:pPr>
       <w:r>
         <w:rPr>
@@ -8162,6 +8613,7 @@
     <w:p>
       <w:pPr>
         <w:pStyle w:val="BodyText"/>
+        <w:jc w:val="both"/>
       </w:pPr>
       <w:r>
         <w:rPr>
@@ -8180,6 +8632,7 @@
     <w:p>
       <w:pPr>
         <w:pStyle w:val="BodyText"/>
+        <w:jc w:val="both"/>
       </w:pPr>
       <w:r>
         <w:rPr>
@@ -8198,6 +8651,7 @@
     <w:p>
       <w:pPr>
         <w:pStyle w:val="BodyText"/>
+        <w:jc w:val="both"/>
       </w:pPr>
       <w:r>
         <w:rPr>
@@ -8216,6 +8670,7 @@
     <w:p>
       <w:pPr>
         <w:pStyle w:val="BodyText"/>
+        <w:jc w:val="both"/>
       </w:pPr>
       <w:r>
         <w:rPr>
@@ -8244,6 +8699,7 @@
     <w:p>
       <w:pPr>
         <w:pStyle w:val="BodyText"/>
+        <w:jc w:val="both"/>
       </w:pPr>
       <w:r>
         <w:rPr>
@@ -8262,6 +8718,7 @@
     <w:p>
       <w:pPr>
         <w:pStyle w:val="BodyText"/>
+        <w:jc w:val="both"/>
       </w:pPr>
       <w:r>
         <w:rPr>
@@ -8293,6 +8750,7 @@
     <w:p>
       <w:pPr>
         <w:pStyle w:val="BodyText"/>
+        <w:jc w:val="both"/>
       </w:pPr>
       <w:r>
         <w:rPr>
@@ -8320,6 +8778,7 @@
           <w:pgSz w:w="11906" w:h="16838"/>
           <w:pgMar w:top="1440" w:right="1440" w:bottom="1440" w:left="1440" w:header="708" w:footer="708" w:gutter="0"/>
         </w:sectPr>
+        <w:jc w:val="both"/>
       </w:pPr>
       <w:r>
         <w:rPr>
@@ -8341,8 +8800,15 @@
       <w:pPr>
         <w:pStyle w:val="Heading2"/>
         <w:suppressLineNumbers/>
+        <w:rPr>
+          <w:b w:val="1"/>
+        </w:rPr>
+        <w:jc w:val="left"/>
       </w:pPr>
       <w:r>
+        <w:rPr>
+          <w:b w:val="1"/>
+        </w:rPr>
         <w:t xml:space="preserve">Tables</w:t>
       </w:r>
     </w:p>
@@ -8352,6 +8818,7 @@
         <w:keepNext/>
         <w:suppressLineNumbers/>
         <w:spacing w:before="0" w:after="120" w:line="240" w:lineRule="auto"/>
+        <w:jc w:val="both"/>
       </w:pPr>
       <w:r>
         <w:rPr>
@@ -9595,6 +10062,7 @@
           <w:pgSz w:w="11906" w:h="16838"/>
           <w:pgMar w:top="1440" w:right="1440" w:bottom="1440" w:left="1440" w:header="708" w:footer="708" w:gutter="0"/>
         </w:sectPr>
+        <w:jc w:val="both"/>
       </w:pPr>
       <w:r>
         <w:rPr>
@@ -9626,6 +10094,7 @@
         <w:keepNext/>
         <w:suppressLineNumbers/>
         <w:spacing w:before="0" w:after="120" w:line="240" w:lineRule="auto"/>
+        <w:jc w:val="both"/>
       </w:pPr>
       <w:r>
         <w:rPr>
@@ -11037,6 +11506,7 @@
           <w:pgSz w:w="16838" w:h="11906" w:orient="landscape"/>
           <w:pgMar w:top="1440" w:right="1440" w:bottom="1440" w:left="1440" w:header="708" w:footer="708" w:gutter="0"/>
         </w:sectPr>
+        <w:jc w:val="both"/>
       </w:pPr>
       <w:r>
         <w:rPr>
@@ -11068,6 +11538,7 @@
         <w:keepNext/>
         <w:suppressLineNumbers/>
         <w:spacing w:before="0" w:after="120" w:line="240" w:lineRule="auto"/>
+        <w:jc w:val="both"/>
       </w:pPr>
       <w:r>
         <w:rPr>
@@ -14625,6 +15096,7 @@
           <w:pgSz w:w="16838" w:h="11906" w:orient="landscape"/>
           <w:pgMar w:top="1440" w:right="1440" w:bottom="1440" w:left="1440" w:header="708" w:footer="708" w:gutter="0"/>
         </w:sectPr>
+        <w:jc w:val="both"/>
       </w:pPr>
       <w:r>
         <w:rPr>
@@ -14656,6 +15128,7 @@
         <w:keepNext/>
         <w:suppressLineNumbers/>
         <w:spacing w:before="0" w:after="120" w:line="240" w:lineRule="auto"/>
+        <w:jc w:val="both"/>
       </w:pPr>
       <w:r>
         <w:rPr>
@@ -23268,6 +23741,7 @@
           <w:pgSz w:w="16838" w:h="11906" w:orient="landscape"/>
           <w:pgMar w:top="1440" w:right="1440" w:bottom="1440" w:left="1440" w:header="708" w:footer="708" w:gutter="0"/>
         </w:sectPr>
+        <w:jc w:val="both"/>
       </w:pPr>
       <w:r>
         <w:rPr>
@@ -23299,6 +23773,7 @@
         <w:keepNext/>
         <w:suppressLineNumbers/>
         <w:spacing w:before="0" w:after="120" w:line="240" w:lineRule="auto"/>
+        <w:jc w:val="both"/>
       </w:pPr>
       <w:r>
         <w:rPr>
@@ -27000,6 +27475,7 @@
         <w:pStyle w:val="BodyText"/>
         <w:suppressLineNumbers/>
         <w:spacing w:before="120" w:after="0" w:line="240" w:lineRule="auto"/>
+        <w:jc w:val="both"/>
       </w:pPr>
       <w:r>
         <w:rPr>
@@ -27197,6 +27673,7 @@
     <w:qFormat/>
     <w:pPr>
       <w:spacing w:line="283" w:lineRule="auto" w:after="120"/>
+      <w:jc w:val="both"/>
     </w:pPr>
     <w:rPr>
       <w:rFonts w:ascii="Times New Roman" w:hAnsi="Times New Roman"/>
@@ -27210,6 +27687,7 @@
     <w:qFormat/>
     <w:pPr>
       <w:spacing w:after="120" w:before="0" w:line="283" w:lineRule="auto"/>
+      <w:jc w:val="both"/>
     </w:pPr>
     <w:rPr>
       <w:rFonts w:ascii="Times New Roman" w:hAnsi="Times New Roman"/>
@@ -27223,6 +27701,7 @@
     <w:qFormat/>
     <w:pPr>
       <w:spacing w:line="283" w:lineRule="auto" w:before="0" w:after="120"/>
+      <w:jc w:val="both"/>
     </w:pPr>
     <w:rPr>
       <w:rFonts w:ascii="Times New Roman" w:hAnsi="Times New Roman"/>
@@ -27389,6 +27868,7 @@
       <w:rFonts w:asciiTheme="majorHAnsi" w:cstheme="majorBidi" w:eastAsiaTheme="majorEastAsia" w:hAnsiTheme="majorHAnsi" w:ascii="Arial" w:hAnsi="Arial"/>
       <w:sz w:val="34"/>
       <w:szCs w:val="40"/>
+      <w:b w:val="1"/>
     </w:rPr>
   </w:style>
   <w:style w:styleId="Heading2" w:type="paragraph">
@@ -27411,6 +27891,7 @@
       <w:rFonts w:asciiTheme="majorHAnsi" w:cstheme="majorBidi" w:eastAsiaTheme="majorEastAsia" w:hAnsiTheme="majorHAnsi" w:ascii="Arial" w:hAnsi="Arial"/>
       <w:sz w:val="28"/>
       <w:szCs w:val="32"/>
+      <w:b w:val="1"/>
     </w:rPr>
   </w:style>
   <w:style w:styleId="Heading3" w:type="paragraph">
@@ -27433,6 +27914,7 @@
       <w:rFonts w:cstheme="majorBidi" w:eastAsiaTheme="majorEastAsia" w:ascii="Arial" w:hAnsi="Arial"/>
       <w:sz w:val="24"/>
       <w:szCs w:val="28"/>
+      <w:b w:val="1"/>
     </w:rPr>
   </w:style>
   <w:style w:styleId="Heading4" w:type="paragraph">
@@ -27770,6 +28252,7 @@
     <w:link w:val="BodyTextChar"/>
     <w:pPr>
       <w:spacing w:after="120" w:before="0"/>
+      <w:jc w:val="both"/>
     </w:pPr>
     <w:rPr>
       <w:i/>

</xml_diff>

<commit_message>
Align SOCE terminology with prior laboratory publications
</commit_message>
<xml_diff>
--- a/manuscript/MANUSCRIPT_NEUROCHEMISTRY_INTERNATIONAL_FINAL.docx
+++ b/manuscript/MANUSCRIPT_NEUROCHEMISTRY_INTERNATIONAL_FINAL.docx
@@ -71,7 +71,7 @@
         <w:jc w:val="both"/>
       </w:pPr>
       <w:r>
-        <w:t xml:space="preserve">TDP-43 loss is implicated in amyotrophic lateral sclerosis (ALS), but its relationship to store-operated Ca²⁺ entry (SOCE) is unclear. After shRNA-mediated TARDBP depletion in SH-SY5Y cells, TRPC1, STIM1, ORAI1 and ATP2A3 mRNAs increased 1.7- to 3.2-fold, while the Fura-2 SOCE response fell from 1.542 ± 0.282 to 0.245 ± 0.083 Δ(F340/F380) (p = 0.0115; n = 3). The ER Ca²⁺ release comparison was inconclusive (p = 0.299). At 48 h, the WST-1 signal was 38.5% lower (n = 4). We reanalysed six public TDP-43-depletion RNA-seq comparisons (38 libraries) for calcium-regulatory expression and splicing, screened eleven comparisons for unannotated junction changes, and assessed alternative polyadenylation and nonsense-mediated decay. CBARP was the most reproducible splicing candidate across species, whereas STIM2, STIMATE and ORAI3 events were supported in the primary RNA-seq model. No confirmed RNA-processing event in the core SOCE machinery explained the functional change. In ALS brain, TRPC1 and SARAF increased and CBARP decreased in six of seven regions, but these tissue associations could not be attributed to TDP-43 loss. TDP-43 knockdown is associated with reduced SOCE and altered calcium-regulatory RNA profiles, without evidence for a single causal RNA event.</w:t>
+        <w:t xml:space="preserve">TDP-43 loss is implicated in amyotrophic lateral sclerosis (ALS), but its relationship to store-operated Ca²⁺ entry (SOCE) is unclear. After shRNA-mediated TARDBP depletion in SH-SY5Y cells, TRPC1, STIM1, ORAI1 and ATP2A3 mRNAs increased 1.7- to 3.2-fold, while the Fura-2-measured SOCE amplitude decreased from 1.542 ± 0.282 to 0.245 ± 0.083 Δ(F340/F380) (p = 0.0115; n = 3). The ER Ca²⁺ release comparison was inconclusive (p = 0.299). At 48 h, the WST-1 signal was 38.5% lower (n = 4). We reanalysed six public TDP-43-depletion RNA-seq comparisons (38 libraries) for calcium-regulatory expression and splicing, screened eleven comparisons for unannotated junction changes, and assessed alternative polyadenylation and nonsense-mediated decay. CBARP was the most reproducible splicing candidate across species, whereas STIM2, STIMATE and ORAI3 events were supported in the primary RNA-seq model. No confirmed RNA-processing event in the core SOCE machinery explained the functional change. In ALS brain, TRPC1 and SARAF increased and CBARP decreased in six of seven regions, but these tissue associations could not be attributed to TDP-43 loss. TDP-43 knockdown is associated with reduced SOCE and altered calcium-regulatory RNA profiles, without evidence for a single causal RNA event.</w:t>
       </w:r>
     </w:p>
     <w:p>
@@ -2706,7 +2706,7 @@
         <w:jc w:val="both"/>
       </w:pPr>
       <w:r>
-        <w:t xml:space="preserve">Functionally, however, the SOCE response fell markedly (Figure 2). The ER Ca²⁺-release means were 0.268 ± 0.042 and 0.180 ± 0.061 Δ(F340/F380) in the control and shTDP-43 groups, respectively (p = 0.299; two-tailed Student’s t-test). The readdition-response means were 1.542 ± 0.282 and 0.245 ± 0.083, respectively (p = 0.0115; two-tailed Student’s t-test; n = 3). At 48 h, the WST-1 signal was 61.5 ± 0.8% of control, a 38.5% decrease (n = 4).</w:t>
+        <w:t xml:space="preserve">Functionally, however, the SOCE amplitude decreased markedly (Figure 2). The ER Ca²⁺-release means were 0.268 ± 0.042 and 0.180 ± 0.061 Δ(F340/F380) in the control and shTDP-43 groups, respectively (p = 0.299; two-tailed Student’s t-test). The Ca²⁺-readdition amplitudes were 1.542 ± 0.282 and 0.245 ± 0.083, respectively (p = 0.0115; two-tailed Student’s t-test; n = 3). At 48 h, the WST-1 signal was 61.5 ± 0.8% of control, a 38.5% decrease (n = 4).</w:t>
       </w:r>
     </w:p>
     <w:p>
@@ -2715,7 +2715,7 @@
         <w:jc w:val="both"/>
       </w:pPr>
       <w:r>
-        <w:t xml:space="preserve">The direction of the transcript changes and the direction of the functional response are therefore opposite. This is the central observation of the study.</w:t>
+        <w:t xml:space="preserve">The transcript changes and functional change are therefore in opposite directions. This is the central observation of the study.</w:t>
       </w:r>
     </w:p>
     <w:p>
@@ -2780,7 +2780,7 @@
           <w:rFonts w:ascii="Times New Roman" w:hAnsi="Times New Roman"/>
           <w:sz w:val="19"/>
         </w:rPr>
-        <w:t xml:space="preserve"> Fura-2 calcium responses following TDP-43 knockdown in SH-SY5Y cells. (A, B) Representative traces from non-targeting shRNA control and shTDP-43 cells. CPA (10 µM) and CaCl₂ (1.5 mM) additions are indicated. (C) ER Ca²⁺ release after CPA (p = 0.299). (D) Ca²⁺ readdition response (p = 0.0115). Panels C and D show individual measurements and mean ± SEM (n = 3; two-tailed Student’s t-tests). The traces illustrate individual recordings; group amplitudes were calculated from the original Prism measurements.</w:t>
+        <w:t xml:space="preserve"> Fura-2 calcium measurements following TDP-43 knockdown in SH-SY5Y cells. (A, B) Representative traces from non-targeting shRNA control and shTDP-43 cells. CPA (10 µM) and CaCl₂ (1.5 mM) additions are indicated. (C) ER Ca²⁺ release after CPA (p = 0.299). (D) Ca²⁺-readdition amplitude (p = 0.0115). Panels C and D show individual measurements and mean ± SEM (n = 3; two-tailed Student’s t-tests). The traces illustrate individual recordings; group amplitudes were calculated from the original Prism measurements.</w:t>
       </w:r>
     </w:p>
     <w:bookmarkEnd w:id="28"/>
@@ -6088,7 +6088,7 @@
         <w:jc w:val="both"/>
       </w:pPr>
       <w:r>
-        <w:t>This study identifies a marked reduction in the Fura-2 Ca²⁺ readdition response after TDP-43 knockdown and connects that functional phenotype to coordinated changes in calcium-regulatory transcripts. The central feature is a mismatch between abundance and function: the adjusted STIM and ORAI transcript pools increased, yet the readdition response fell by approximately 84%. The data therefore do not support simple loss of the core SOCE machinery. They instead point to altered channel composition, feedback inhibition, ER refilling and cellular bioenergetics as interacting determinants. Across independent datasets, canonical TDP-43 RNA targets behaved as expected, whereas calcium-gene processing changes were selective and context dependent. This combination defines a multilayered calcium-homeostasis phenotype rather than uniform suppression of one channel or one RNA-processing event.</w:t>
+        <w:t>This study identifies a marked reduction in Fura-2-measured SOCE after TDP-43 knockdown and connects that functional phenotype to coordinated changes in calcium-regulatory transcripts. The central feature is a mismatch between abundance and function: the adjusted STIM and ORAI transcript pools increased, yet the SOCE amplitude decreased by approximately 84%. The data therefore do not support simple loss of the core SOCE machinery. They instead point to altered channel composition, feedback inhibition, ER refilling and cellular bioenergetics as interacting determinants. Across independent datasets, canonical TDP-43 RNA targets behaved as expected, whereas calcium-gene processing changes were selective and context dependent. This combination defines a multilayered calcium-homeostasis phenotype rather than uniform suppression of one channel or one RNA-processing event.</w:t>
       </w:r>
     </w:p>
     <w:p>
@@ -6103,7 +6103,7 @@
         <w:t xml:space="preserve">Architecture of the functional phenotype. </w:t>
       </w:r>
       <w:r>
-        <w:t xml:space="preserve">The ER-release mean fell from 0.268 to 0.180 Δ(F340/F380), while the subsequent readdition response showed a much larger proportional decrease. A smaller releasable store may therefore contribute, but it is unlikely to account on its own for the magnitude of the readdition phenotype. The transcript data identify two mechanistic layers that could act together. First, ATP2A2, which dominates the SERCA family in these cells, decreased modestly and could reduce the efficiency of ER refilling. Second, the ORAI family shifted sharply: ORAI3 rose from 8% to 30% of ORAI transcripts, ORAI2 fell from 77% to 53%, and SARAF increased. Channel output depends on the relative abundance, assembly and localization of STIM and ORAI proteins rather than their summed RNA abundance; even the STIM1:ORAI1 protein ratio can change CRAC-channel trapping and gating </w:t>
+        <w:t xml:space="preserve">The ER-release mean decreased from 0.268 to 0.180 Δ(F340/F380), while the subsequent SOCE amplitude showed a much larger proportional decrease. A smaller releasable store may therefore contribute, but it is unlikely to account on its own for the magnitude of the SOCE decrease. The transcript data identify two mechanistic layers that could act together. First, ATP2A2, which dominates the SERCA family in these cells, decreased modestly and could reduce the efficiency of ER refilling. Second, the ORAI family shifted sharply: ORAI3 rose from 8% to 30% of ORAI transcripts, ORAI2 decreased from 77% to 53%, and SARAF increased. Channel output depends on the relative abundance, assembly and localization of STIM and ORAI proteins rather than their summed RNA abundance; even the STIM1:ORAI1 protein ratio can change CRAC-channel trapping and gating </w:t>
       </w:r>
       <w:r>
         <w:fldChar w:fldCharType="begin"/>
@@ -6154,7 +6154,7 @@
         <w:fldChar w:fldCharType="end"/>
       </w:r>
       <w:r>
-        <w:t xml:space="preserve">. The fivefold ORAI3 increase and higher SARAF are consequently plausible contributors to a shorter or smaller readdition response, whereas the ORAI2 decrease predicts an effect in the opposite direction. ORAI3 should not, however, be treated as intrinsically inhibitory: in primary astrocytes, STIM1 together with ORAI1 and ORAI3 mediates most SOCE, with additional contributions from ORAI2 and TRPC1 </w:t>
+        <w:t xml:space="preserve">. The fivefold ORAI3 increase and higher SARAF are consequently plausible contributors to a smaller SOCE amplitude, whereas the ORAI2 decrease predicts an effect in the opposite direction. ORAI3 should not, however, be treated as intrinsically inhibitory: in primary astrocytes, STIM1 together with ORAI1 and ORAI3 mediates most SOCE, with additional contributions from ORAI2 and TRPC1 </w:t>
       </w:r>
       <w:r>
         <w:fldChar w:fldCharType="begin"/>
@@ -6241,7 +6241,7 @@
         <w:fldChar w:fldCharType="end"/>
       </w:r>
       <w:r>
-        <w:t>. TDP-43-depleted SH-SY5Y cells instead showed strongly reduced readdition. The contrast is biologically meaningful because astroglial hyperactive entry, neuronal-like cell entry failure and ER-store depletion can all disturb calcium signalling through different routes. Genetic lesion, cell identity, differentiation state and compensatory timing are therefore likely to determine the direction of the measured phenotype. The present result establishes a TDP-43 loss-associated response in SH-SY5Y cells and complements, rather than reproduces, the SOD1 astrocyte phenotype.</w:t>
+        <w:t>. TDP-43-depleted SH-SY5Y cells instead showed strongly reduced readdition. The contrast is biologically meaningful because astroglial hyperactive entry, neuronal-like cell entry failure and ER-store depletion can all disturb calcium signalling through different routes. Genetic lesion, cell identity, differentiation state and compensatory timing are therefore likely to determine the direction of the measured phenotype. The present result establishes a reduction in SOCE associated with TDP-43 loss in SH-SY5Y cells and complements, rather than reproduces, the SOD1 astrocyte phenotype.</w:t>
       </w:r>
     </w:p>
     <w:p>
@@ -6256,7 +6256,7 @@
         <w:t xml:space="preserve">Metabolic and organelle coupling. </w:t>
       </w:r>
       <w:r>
-        <w:t xml:space="preserve">The 48-h WST-1 signal was 38.5% lower after knockdown. The approximately 84% reduction in the Ca²⁺ readdition response was more than twice this proportional change, arguing against simple scaling of the calcium phenotype by the WST-1 signal, although the assays were performed in separate preparations. This agrees with evidence that TARDBP silencing reduces metabolic activity, cell growth, oxygen consumption and ATP production in human iPSC-derived motor neurons and other human cells </w:t>
+        <w:t xml:space="preserve">The 48-h WST-1 signal was 38.5% lower after knockdown. The approximately 84% reduction in SOCE amplitude was more than twice this proportional change, arguing against simple scaling of the calcium phenotype by the WST-1 signal, although the assays were performed in separate preparations. This agrees with evidence that TARDBP silencing reduces metabolic activity, cell growth, oxygen consumption and ATP production in human iPSC-derived motor neurons and other human cells </w:t>
       </w:r>
       <w:r>
         <w:fldChar w:fldCharType="begin"/>

</xml_diff>

<commit_message>
Reframe exploratory ALS correlation analysis
</commit_message>
<xml_diff>
--- a/manuscript/MANUSCRIPT_NEUROCHEMISTRY_INTERNATIONAL_FINAL.docx
+++ b/manuscript/MANUSCRIPT_NEUROCHEMISTRY_INTERNATIONAL_FINAL.docx
@@ -5597,9 +5597,9 @@
       </w:pPr>
       <w:r>
         <w:rPr>
-          <w:b w:val="1"/>
-        </w:rPr>
-        <w:t xml:space="preserve">3.10 A junction-based marker of TDP-43 dysfunction does not correlate with TRPC1 within ALS regions</w:t>
+          <w:b/>
+        </w:rPr>
+        <w:t xml:space="preserve">3.10 Exploratory analysis of ALS regional transcript patterns</w:t>
       </w:r>
     </w:p>
     <w:p>
@@ -5608,65 +5608,17 @@
         <w:jc w:val="both"/>
       </w:pPr>
       <w:r>
-        <w:t xml:space="preserve">The comparisons above establish that</w:t>
-      </w:r>
-      <w:r>
-        <w:t xml:space="preserve"> </w:t>
+        <w:t xml:space="preserve">The ALS-control comparisons above establish disease-associated expression differences, but they do not establish that TDP-43 loss caused them. We therefore used cryptic </w:t>
       </w:r>
       <w:r>
         <w:rPr>
           <w:i/>
           <w:iCs/>
         </w:rPr>
-        <w:t xml:space="preserve">TRPC1</w:t>
-      </w:r>
-      <w:r>
-        <w:t xml:space="preserve">,</w:t>
-      </w:r>
-      <w:r>
-        <w:t xml:space="preserve"> </w:t>
-      </w:r>
-      <w:r>
-        <w:rPr>
-          <w:i/>
-          <w:iCs/>
-        </w:rPr>
-        <w:t xml:space="preserve">SARAF</w:t>
-      </w:r>
-      <w:r>
-        <w:t xml:space="preserve"> </w:t>
-      </w:r>
-      <w:r>
-        <w:t xml:space="preserve">and</w:t>
-      </w:r>
-      <w:r>
-        <w:t xml:space="preserve"> </w:t>
-      </w:r>
-      <w:r>
-        <w:rPr>
-          <w:i/>
-          <w:iCs/>
-        </w:rPr>
-        <w:t xml:space="preserve">CBARP</w:t>
-      </w:r>
-      <w:r>
-        <w:t xml:space="preserve"> </w:t>
-      </w:r>
-      <w:r>
-        <w:t xml:space="preserve">differ between ALS and control tissue. They do not establish that the differences are caused by TDP-43 loss. A per-sample marker of TDP-43 dysfunction is needed for that question; gene-level</w:t>
-      </w:r>
-      <w:r>
-        <w:t xml:space="preserve"> </w:t>
-      </w:r>
-      <w:r>
-        <w:rPr>
-          <w:i/>
-          <w:iCs/>
-        </w:rPr>
         <w:t xml:space="preserve">STMN2</w:t>
       </w:r>
       <w:r>
-        <w:t xml:space="preserve">, the proxy used in earlier work, is inadequate on its own because in bulk tissue it also strongly tracks neuronal content.</w:t>
+        <w:t xml:space="preserve"> junction inclusion as an exploratory per-sample indicator of TDP-43-dependent RNA processing (Methods 2.11). The cryptic junction was most frequent in spinal cord and was significantly increased in lumbar cord, cervical cord, medial motor cortex and temporal cortex relative to non-neurological controls (Supplementary Figure S8A; Supplementary Table S8).</w:t>
       </w:r>
     </w:p>
     <w:p>
@@ -5675,10 +5627,7 @@
         <w:jc w:val="both"/>
       </w:pPr>
       <w:r>
-        <w:t xml:space="preserve">The same cohort is present in recount3 as a junction count matrix, which allowed the truncated</w:t>
-      </w:r>
-      <w:r>
-        <w:t xml:space="preserve"> </w:t>
+        <w:t xml:space="preserve">Gene-level </w:t>
       </w:r>
       <w:r>
         <w:rPr>
@@ -5688,39 +5637,37 @@
         <w:t xml:space="preserve">STMN2</w:t>
       </w:r>
       <w:r>
-        <w:t xml:space="preserve"> </w:t>
-      </w:r>
-      <w:r>
-        <w:t xml:space="preserve">transcript to be quantified directly (Methods 2.11). This junction-based measure is more proximal to a known consequence of TDP-43 dysfunction than total</w:t>
-      </w:r>
-      <w:r>
-        <w:t xml:space="preserve"> </w:t>
+        <w:t xml:space="preserve"> correlated strongly with the neuronal marker </w:t>
       </w:r>
       <w:r>
         <w:rPr>
           <w:i/>
           <w:iCs/>
         </w:rPr>
+        <w:t xml:space="preserve">SNAP25</w:t>
+      </w:r>
+      <w:r>
+        <w:t xml:space="preserve"> within ALS samples (ρ = 0.66 to 0.93 across regions), whereas cryptic </w:t>
+      </w:r>
+      <w:r>
+        <w:rPr>
+          <w:i/>
+          <w:iCs/>
+        </w:rPr>
         <w:t xml:space="preserve">STMN2</w:t>
       </w:r>
       <w:r>
-        <w:t xml:space="preserve"> </w:t>
-      </w:r>
-      <w:r>
-        <w:t xml:space="preserve">expression, but remains sparse and can capture only one route of TDP-43-dependent RNA misprocessing. Its regional distribution is consistent with the expected anatomical pattern (Supplementary Figure S8A): 70.5% of lumbar-cord and 63.5% of cervical-cord ALS samples carried the cryptic junction, compared with 33.7–43.5% across motor cortex, 28.3% in temporal cortex, 11.2% in frontal cortex, and</w:t>
-      </w:r>
-      <w:r>
-        <w:t xml:space="preserve"> </w:t>
-      </w:r>
-      <w:r>
-        <w:rPr>
-          <w:b/>
-          <w:bCs/>
-        </w:rPr>
-        <w:t xml:space="preserve">2.6% in cerebellum</w:t>
-      </w:r>
-      <w:r>
-        <w:t xml:space="preserve">. Against non-neurological controls from the same cohort, cryptic inclusion was increased in lumbar cord (Cliff’s δ = +0.705, q = 9.6 × 10⁻¹⁴), cervical cord (+0.619, q = 1.9 × 10⁻¹⁰), medial motor cortex (+0.337, q = 0.012) and temporal cortex (+0.283, q = 1.6 × 10⁻³), and was unchanged in cerebellum (−0.040, q = 0.34; Supplementary Table S8).</w:t>
+        <w:t xml:space="preserve"> PSI did not (ρ = −0.28 to +0.05; Supplementary Figure S8B,C). Total </w:t>
+      </w:r>
+      <w:r>
+        <w:rPr>
+          <w:i/>
+          <w:iCs/>
+        </w:rPr>
+        <w:t xml:space="preserve">STMN2</w:t>
+      </w:r>
+      <w:r>
+        <w:t xml:space="preserve"> expression was therefore not used as a specific indicator of TDP-43 dysfunction in bulk tissue.</w:t>
       </w:r>
     </w:p>
     <w:p>
@@ -5729,10 +5676,7 @@
         <w:jc w:val="both"/>
       </w:pPr>
       <w:r>
-        <w:t xml:space="preserve">The junction-based measure also helps assess the proxy problem. Within ALS samples, gene-level</w:t>
-      </w:r>
-      <w:r>
-        <w:t xml:space="preserve"> </w:t>
+        <w:t xml:space="preserve">No statistically supported association was detected between cryptic </w:t>
       </w:r>
       <w:r>
         <w:rPr>
@@ -5742,326 +5686,27 @@
         <w:t xml:space="preserve">STMN2</w:t>
       </w:r>
       <w:r>
-        <w:t xml:space="preserve"> </w:t>
-      </w:r>
-      <w:r>
-        <w:t xml:space="preserve">correlated strongly with the neuronal marker</w:t>
-      </w:r>
-      <w:r>
-        <w:t xml:space="preserve"> </w:t>
+        <w:t xml:space="preserve"> inclusion and </w:t>
       </w:r>
       <w:r>
         <w:rPr>
           <w:i/>
           <w:iCs/>
         </w:rPr>
-        <w:t xml:space="preserve">SNAP25</w:t>
-      </w:r>
-      <w:r>
-        <w:t xml:space="preserve"> </w:t>
-      </w:r>
-      <w:r>
-        <w:t xml:space="preserve">(ρ = 0.66 to 0.93 across regions), whereas cryptic PSI did not (ρ = −0.28 to +0.05; Supplementary Figure S8B,C). Thus, in this bulk-tissue cohort, total</w:t>
-      </w:r>
-      <w:r>
-        <w:t xml:space="preserve"> </w:t>
+        <w:t xml:space="preserve">TRPC1</w:t>
+      </w:r>
+      <w:r>
+        <w:t xml:space="preserve"> in any region (ρ = −0.19 to +0.18; all q &gt; 0.05). This exploratory analysis does not support attributing the regional </w:t>
       </w:r>
       <w:r>
         <w:rPr>
           <w:i/>
           <w:iCs/>
         </w:rPr>
-        <w:t xml:space="preserve">STMN2</w:t>
-      </w:r>
-      <w:r>
-        <w:t xml:space="preserve"> </w:t>
-      </w:r>
-      <w:r>
-        <w:t xml:space="preserve">expression should not be interpreted as a specific measure of TDP-43 dysfunction; its prior positive correlations may substantially reflect neuronal content.</w:t>
-      </w:r>
-    </w:p>
-    <w:p>
-      <w:pPr>
-        <w:pStyle w:val="BodyText"/>
-        <w:jc w:val="both"/>
-      </w:pPr>
-      <w:r>
-        <w:t xml:space="preserve">Using this junction-based marker, we found no significant correlation between cryptic</w:t>
-      </w:r>
-      <w:r>
-        <w:t xml:space="preserve"> </w:t>
-      </w:r>
-      <w:r>
-        <w:rPr>
-          <w:i/>
-          <w:iCs/>
-        </w:rPr>
-        <w:t xml:space="preserve">STMN2</w:t>
-      </w:r>
-      <w:r>
-        <w:t xml:space="preserve"> </w:t>
-      </w:r>
-      <w:r>
-        <w:t xml:space="preserve">inclusion and</w:t>
-      </w:r>
-      <w:r>
-        <w:t xml:space="preserve"> </w:t>
-      </w:r>
-      <w:r>
-        <w:rPr>
-          <w:i/>
-          <w:iCs/>
-        </w:rPr>
         <w:t xml:space="preserve">TRPC1</w:t>
       </w:r>
       <w:r>
-        <w:t xml:space="preserve"> </w:t>
-      </w:r>
-      <w:r>
-        <w:t xml:space="preserve">in any region (ρ = −0.19 to +0.18; all q &gt; 0.05). The table contains 231 correlations: 121 for each proxy before exclusions, less the eleven trivial correlations of gene-level</w:t>
-      </w:r>
-      <w:r>
-        <w:t xml:space="preserve"> </w:t>
-      </w:r>
-      <w:r>
-        <w:rPr>
-          <w:i/>
-          <w:iCs/>
-        </w:rPr>
-        <w:t xml:space="preserve">STMN2</w:t>
-      </w:r>
-      <w:r>
-        <w:t xml:space="preserve"> </w:t>
-      </w:r>
-      <w:r>
-        <w:t xml:space="preserve">with itself. Benjamini–Hochberg correction was therefore applied to 220 informative correlations (110 per proxy). Of the 110 correlations with the junction-based marker, eight survived correction (Supplementary Table S9): gene-level</w:t>
-      </w:r>
-      <w:r>
-        <w:t xml:space="preserve"> </w:t>
-      </w:r>
-      <w:r>
-        <w:rPr>
-          <w:i/>
-          <w:iCs/>
-        </w:rPr>
-        <w:t xml:space="preserve">STMN2</w:t>
-      </w:r>
-      <w:r>
-        <w:t xml:space="preserve"> </w:t>
-      </w:r>
-      <w:r>
-        <w:t xml:space="preserve">fell with cryptic inclusion (cervical cord ρ = −0.244, q = 0.011),</w:t>
-      </w:r>
-      <w:r>
-        <w:t xml:space="preserve"> </w:t>
-      </w:r>
-      <w:r>
-        <w:rPr>
-          <w:i/>
-          <w:iCs/>
-        </w:rPr>
-        <w:t xml:space="preserve">SNAP25</w:t>
-      </w:r>
-      <w:r>
-        <w:t xml:space="preserve"> </w:t>
-      </w:r>
-      <w:r>
-        <w:t xml:space="preserve">fell and</w:t>
-      </w:r>
-      <w:r>
-        <w:t xml:space="preserve"> </w:t>
-      </w:r>
-      <w:r>
-        <w:rPr>
-          <w:i/>
-          <w:iCs/>
-        </w:rPr>
-        <w:t xml:space="preserve">GFAP</w:t>
-      </w:r>
-      <w:r>
-        <w:t xml:space="preserve"> </w:t>
-      </w:r>
-      <w:r>
-        <w:t xml:space="preserve">rose in medial motor cortex (ρ = −0.276 and +0.284, q = 0.028 and 0.023); all three were internally consistent. Additional associations involved</w:t>
-      </w:r>
-      <w:r>
-        <w:t xml:space="preserve"> </w:t>
-      </w:r>
-      <w:r>
-        <w:rPr>
-          <w:i/>
-          <w:iCs/>
-        </w:rPr>
-        <w:t xml:space="preserve">ATP2A2</w:t>
-      </w:r>
-      <w:r>
-        <w:t xml:space="preserve"> </w:t>
-      </w:r>
-      <w:r>
-        <w:t xml:space="preserve">(medial motor cortex, −0.299, q = 0.015),</w:t>
-      </w:r>
-      <w:r>
-        <w:t xml:space="preserve"> </w:t>
-      </w:r>
-      <w:r>
-        <w:rPr>
-          <w:i/>
-          <w:iCs/>
-        </w:rPr>
-        <w:t xml:space="preserve">STIM1</w:t>
-      </w:r>
-      <w:r>
-        <w:t xml:space="preserve"> </w:t>
-      </w:r>
-      <w:r>
-        <w:t xml:space="preserve">(lumbar cord, −0.280, q = 0.0021),</w:t>
-      </w:r>
-      <w:r>
-        <w:t xml:space="preserve"> </w:t>
-      </w:r>
-      <w:r>
-        <w:rPr>
-          <w:i/>
-          <w:iCs/>
-        </w:rPr>
-        <w:t xml:space="preserve">SARAF</w:t>
-      </w:r>
-      <w:r>
-        <w:t xml:space="preserve"> </w:t>
-      </w:r>
-      <w:r>
-        <w:t xml:space="preserve">(lumbar cord, −0.194, q = 0.049) and</w:t>
-      </w:r>
-      <w:r>
-        <w:t xml:space="preserve"> </w:t>
-      </w:r>
-      <w:r>
-        <w:rPr>
-          <w:i/>
-          <w:iCs/>
-        </w:rPr>
-        <w:t xml:space="preserve">ORAI1</w:t>
-      </w:r>
-      <w:r>
-        <w:t xml:space="preserve"> </w:t>
-      </w:r>
-      <w:r>
-        <w:t xml:space="preserve">(+0.278 in cervical and +0.234 in lumbar cord, q = 0.0031 and 0.013). Of these five correlations in four SOCE genes, three run in the direction the cellular model predicts (the</w:t>
-      </w:r>
-      <w:r>
-        <w:t xml:space="preserve"> </w:t>
-      </w:r>
-      <w:r>
-        <w:rPr>
-          <w:i/>
-          <w:iCs/>
-        </w:rPr>
-        <w:t xml:space="preserve">ATP2A2</w:t>
-      </w:r>
-      <w:r>
-        <w:t xml:space="preserve"> </w:t>
-      </w:r>
-      <w:r>
-        <w:t xml:space="preserve">fall and both</w:t>
-      </w:r>
-      <w:r>
-        <w:t xml:space="preserve"> </w:t>
-      </w:r>
-      <w:r>
-        <w:rPr>
-          <w:i/>
-          <w:iCs/>
-        </w:rPr>
-        <w:t xml:space="preserve">ORAI1</w:t>
-      </w:r>
-      <w:r>
-        <w:t xml:space="preserve"> </w:t>
-      </w:r>
-      <w:r>
-        <w:t xml:space="preserve">rises) and two run against it (</w:t>
-      </w:r>
-      <w:r>
-        <w:rPr>
-          <w:i/>
-          <w:iCs/>
-        </w:rPr>
-        <w:t xml:space="preserve">STIM1</w:t>
-      </w:r>
-      <w:r>
-        <w:t xml:space="preserve"> </w:t>
-      </w:r>
-      <w:r>
-        <w:t xml:space="preserve">and</w:t>
-      </w:r>
-      <w:r>
-        <w:t xml:space="preserve"> </w:t>
-      </w:r>
-      <w:r>
-        <w:rPr>
-          <w:i/>
-          <w:iCs/>
-        </w:rPr>
-        <w:t xml:space="preserve">SARAF</w:t>
-      </w:r>
-      <w:r>
-        <w:t xml:space="preserve">).</w:t>
-      </w:r>
-    </w:p>
-    <w:p>
-      <w:pPr>
-        <w:pStyle w:val="BodyText"/>
-        <w:jc w:val="both"/>
-      </w:pPr>
-      <w:r>
-        <w:t xml:space="preserve">We therefore report the patient-tissue findings as association with ALS and not as evidence that TDP-43 loss drives them. The regional pattern makes the point sharply: cryptic</w:t>
-      </w:r>
-      <w:r>
-        <w:t xml:space="preserve"> </w:t>
-      </w:r>
-      <w:r>
-        <w:rPr>
-          <w:i/>
-          <w:iCs/>
-        </w:rPr>
-        <w:t xml:space="preserve">STMN2</w:t>
-      </w:r>
-      <w:r>
-        <w:t xml:space="preserve"> </w:t>
-      </w:r>
-      <w:r>
-        <w:t xml:space="preserve">is highest in spinal cord, where</w:t>
-      </w:r>
-      <w:r>
-        <w:t xml:space="preserve"> </w:t>
-      </w:r>
-      <w:r>
-        <w:rPr>
-          <w:i/>
-          <w:iCs/>
-        </w:rPr>
-        <w:t xml:space="preserve">TRPC1</w:t>
-      </w:r>
-      <w:r>
-        <w:t xml:space="preserve"> </w:t>
-      </w:r>
-      <w:r>
-        <w:t xml:space="preserve">does not increase, and</w:t>
-      </w:r>
-      <w:r>
-        <w:t xml:space="preserve"> </w:t>
-      </w:r>
-      <w:r>
-        <w:rPr>
-          <w:i/>
-          <w:iCs/>
-        </w:rPr>
-        <w:t xml:space="preserve">TRPC1</w:t>
-      </w:r>
-      <w:r>
-        <w:t xml:space="preserve"> </w:t>
-      </w:r>
-      <w:r>
-        <w:t xml:space="preserve">rises in cortex, where cryptic inclusion is comparatively rare.</w:t>
+        <w:t xml:space="preserve"> expression differences to TDP-43 dysfunction; all tested correlations are provided in Supplementary Table S9.</w:t>
       </w:r>
     </w:p>
     <w:bookmarkEnd w:id="37"/>
@@ -6436,13 +6081,67 @@
         <w:jc w:val="both"/>
       </w:pPr>
       <w:r>
-        <w:rPr>
-          <w:b/>
-        </w:rPr>
         <w:t xml:space="preserve">Relevance to disease tissue. </w:t>
       </w:r>
       <w:r>
-        <w:t>TRPC1, SARAF and CBARP differed between ALS and non-neurological control tissue in several regions, but the tissue pattern did not simply reproduce the cell model. TRPC1 increased in several cortical regions while remaining unchanged in spinal cord, and its direction differed in the comparison cohorts. Cryptic STMN2 was most abundant in spinal cord, where TRPC1 did not increase, whereas cortical TRPC1 increases occurred where the cryptic junction was comparatively uncommon. Gene-level STMN2 strongly tracked neuronal content, and junction-level cryptic STMN2 did not correlate with TRPC1 within ALS regions. These regional results, together with the opposing SOCE direction in SOD1 astrocytes, indicate that cell composition and compensatory state can dominate bulk-tissue expression. The disease data therefore support involvement of the same calcium-regulatory network, while the discordance argues against a single linear path from TDP-43 dysfunction to TRPC1 abundance across all tissues.</w:t>
+        <w:rPr>
+          <w:i/>
+          <w:iCs/>
+        </w:rPr>
+        <w:t xml:space="preserve">TRPC1</w:t>
+      </w:r>
+      <w:r>
+        <w:t xml:space="preserve">, </w:t>
+      </w:r>
+      <w:r>
+        <w:rPr>
+          <w:i/>
+          <w:iCs/>
+        </w:rPr>
+        <w:t xml:space="preserve">SARAF</w:t>
+      </w:r>
+      <w:r>
+        <w:t xml:space="preserve"> and </w:t>
+      </w:r>
+      <w:r>
+        <w:rPr>
+          <w:i/>
+          <w:iCs/>
+        </w:rPr>
+        <w:t xml:space="preserve">CBARP</w:t>
+      </w:r>
+      <w:r>
+        <w:t xml:space="preserve"> differed between ALS and non-neurological control tissue in several regions, but the tissue pattern did not reproduce the cell model uniformly. </w:t>
+      </w:r>
+      <w:r>
+        <w:rPr>
+          <w:i/>
+          <w:iCs/>
+        </w:rPr>
+        <w:t xml:space="preserve">TRPC1</w:t>
+      </w:r>
+      <w:r>
+        <w:t xml:space="preserve"> increased in several cortical regions, remained unchanged in spinal cord and decreased in the neurological comparison cohorts. Because bulk-tissue expression is sensitive to region and cellular composition, these observations identify disease-associated candidates rather than a direct TDP-43-driven mechanism. The exploratory cryptic </w:t>
+      </w:r>
+      <w:r>
+        <w:rPr>
+          <w:i/>
+          <w:iCs/>
+        </w:rPr>
+        <w:t xml:space="preserve">STMN2</w:t>
+      </w:r>
+      <w:r>
+        <w:t xml:space="preserve"> analysis did not provide evidence linking regional </w:t>
+      </w:r>
+      <w:r>
+        <w:rPr>
+          <w:i/>
+          <w:iCs/>
+        </w:rPr>
+        <w:t xml:space="preserve">TRPC1</w:t>
+      </w:r>
+      <w:r>
+        <w:t xml:space="preserve"> abundance to TDP-43-dependent RNA processing. Together with the opposing direction of SOCE changes reported in SOD1 astrocytes, these findings indicate that cell identity and compensatory state shape the calcium-regulatory phenotype.</w:t>
       </w:r>
     </w:p>
     <w:p>
@@ -6519,10 +6218,7 @@
         <w:jc w:val="both"/>
       </w:pPr>
       <w:r>
-        <w:t xml:space="preserve">TDP-43 depletion in SH-SY5Y cells was associated with a large reduction in Fura-2-measured SOCE and with altered expression and splicing of calcium-regulatory genes. Transcript-family summaries and reproducible</w:t>
-      </w:r>
-      <w:r>
-        <w:t xml:space="preserve"> </w:t>
+        <w:t xml:space="preserve">TDP-43 depletion in SH-SY5Y cells was associated with a large reduction in Fura-2-measured SOCE and with altered expression and splicing of calcium-regulatory genes. Transcript-family summaries and reproducible </w:t>
       </w:r>
       <w:r>
         <w:rPr>
@@ -6532,13 +6228,7 @@
         <w:t xml:space="preserve">CBARP</w:t>
       </w:r>
       <w:r>
-        <w:t xml:space="preserve"> </w:t>
-      </w:r>
-      <w:r>
-        <w:t xml:space="preserve">splicing identify candidate explanations, but they do not establish protein stoichiometry or a single causal RNA switch. Coverage-based APA and conservative NMD analyses do not provide confirmatory evidence that SOCE-machinery genes are direct targets of those pathways. In ALS tissue,</w:t>
-      </w:r>
-      <w:r>
-        <w:t xml:space="preserve"> </w:t>
+        <w:t xml:space="preserve"> splicing identify candidate explanations, but they do not establish protein stoichiometry or a single causal RNA switch. Coverage-based APA and conservative NMD analyses do not provide confirmatory evidence that SOCE-machinery genes are direct targets of those pathways. In ALS tissue, </w:t>
       </w:r>
       <w:r>
         <w:rPr>
@@ -6548,10 +6238,7 @@
         <w:t xml:space="preserve">TRPC1</w:t>
       </w:r>
       <w:r>
-        <w:t xml:space="preserve">,</w:t>
-      </w:r>
-      <w:r>
-        <w:t xml:space="preserve"> </w:t>
+        <w:t xml:space="preserve">, </w:t>
       </w:r>
       <w:r>
         <w:rPr>
@@ -6561,13 +6248,7 @@
         <w:t xml:space="preserve">SARAF</w:t>
       </w:r>
       <w:r>
-        <w:t xml:space="preserve"> </w:t>
-      </w:r>
-      <w:r>
-        <w:t xml:space="preserve">and</w:t>
-      </w:r>
-      <w:r>
-        <w:t xml:space="preserve"> </w:t>
+        <w:t xml:space="preserve"> and </w:t>
       </w:r>
       <w:r>
         <w:rPr>
@@ -6577,74 +6258,37 @@
         <w:t xml:space="preserve">CBARP</w:t>
       </w:r>
       <w:r>
-        <w:t xml:space="preserve"> </w:t>
-      </w:r>
-      <w:r>
-        <w:t xml:space="preserve">show disease-associated expression differences, whereas junction-level</w:t>
-      </w:r>
-      <w:r>
-        <w:t xml:space="preserve"> </w:t>
+        <w:t xml:space="preserve"> showed region-dependent expression differences. </w:t>
       </w:r>
       <w:r>
         <w:rPr>
           <w:i/>
           <w:iCs/>
         </w:rPr>
-        <w:t xml:space="preserve">STMN2</w:t>
-      </w:r>
-      <w:r>
-        <w:t xml:space="preserve"> </w:t>
-      </w:r>
-      <w:r>
-        <w:t xml:space="preserve">inclusion does not correlate with</w:t>
-      </w:r>
-      <w:r>
-        <w:t xml:space="preserve"> </w:t>
+        <w:t xml:space="preserve">CBARP</w:t>
+      </w:r>
+      <w:r>
+        <w:t xml:space="preserve">, </w:t>
       </w:r>
       <w:r>
         <w:rPr>
           <w:i/>
           <w:iCs/>
         </w:rPr>
-        <w:t xml:space="preserve">TRPC1</w:t>
-      </w:r>
-      <w:r>
-        <w:t xml:space="preserve"> </w:t>
-      </w:r>
-      <w:r>
-        <w:t xml:space="preserve">within ALS samples.</w:t>
-      </w:r>
-      <w:r>
-        <w:t xml:space="preserve"> </w:t>
+        <w:t xml:space="preserve">SARAF</w:t>
+      </w:r>
+      <w:r>
+        <w:t xml:space="preserve"> and </w:t>
       </w:r>
       <w:r>
         <w:rPr>
           <w:i/>
           <w:iCs/>
         </w:rPr>
-        <w:t xml:space="preserve">CBARP</w:t>
-      </w:r>
-      <w:r>
-        <w:t xml:space="preserve"> </w:t>
-      </w:r>
-      <w:r>
-        <w:t xml:space="preserve">and</w:t>
-      </w:r>
-      <w:r>
-        <w:t xml:space="preserve"> </w:t>
-      </w:r>
-      <w:r>
-        <w:rPr>
-          <w:i/>
-          <w:iCs/>
-        </w:rPr>
-        <w:t xml:space="preserve">SARAF</w:t>
-      </w:r>
-      <w:r>
-        <w:t xml:space="preserve"> </w:t>
-      </w:r>
-      <w:r>
-        <w:t xml:space="preserve">are therefore priorities for targeted molecular and functional follow-up.</w:t>
+        <w:t xml:space="preserve">TRPC1</w:t>
+      </w:r>
+      <w:r>
+        <w:t xml:space="preserve"> are therefore priorities for targeted protein-level and functional follow-up.</w:t>
       </w:r>
     </w:p>
     <w:bookmarkEnd w:id="40"/>

</xml_diff>

<commit_message>
Remove null TRPC1 correlation result from manuscript
</commit_message>
<xml_diff>
--- a/manuscript/MANUSCRIPT_NEUROCHEMISTRY_INTERNATIONAL_FINAL.docx
+++ b/manuscript/MANUSCRIPT_NEUROCHEMISTRY_INTERNATIONAL_FINAL.docx
@@ -5670,45 +5670,6 @@
         <w:t xml:space="preserve"> expression was therefore not used as a specific indicator of TDP-43 dysfunction in bulk tissue.</w:t>
       </w:r>
     </w:p>
-    <w:p>
-      <w:pPr>
-        <w:pStyle w:val="BodyText"/>
-        <w:jc w:val="both"/>
-      </w:pPr>
-      <w:r>
-        <w:t xml:space="preserve">No statistically supported association was detected between cryptic </w:t>
-      </w:r>
-      <w:r>
-        <w:rPr>
-          <w:i/>
-          <w:iCs/>
-        </w:rPr>
-        <w:t xml:space="preserve">STMN2</w:t>
-      </w:r>
-      <w:r>
-        <w:t xml:space="preserve"> inclusion and </w:t>
-      </w:r>
-      <w:r>
-        <w:rPr>
-          <w:i/>
-          <w:iCs/>
-        </w:rPr>
-        <w:t xml:space="preserve">TRPC1</w:t>
-      </w:r>
-      <w:r>
-        <w:t xml:space="preserve"> in any region (ρ = −0.19 to +0.18; all q &gt; 0.05). This exploratory analysis does not support attributing the regional </w:t>
-      </w:r>
-      <w:r>
-        <w:rPr>
-          <w:i/>
-          <w:iCs/>
-        </w:rPr>
-        <w:t xml:space="preserve">TRPC1</w:t>
-      </w:r>
-      <w:r>
-        <w:t xml:space="preserve"> expression differences to TDP-43 dysfunction; all tested correlations are provided in Supplementary Table S9.</w:t>
-      </w:r>
-    </w:p>
     <w:bookmarkEnd w:id="37"/>
     <w:bookmarkEnd w:id="38"/>
     <w:bookmarkStart w:id="39" w:name="discussion"/>
@@ -6121,27 +6082,7 @@
         <w:t xml:space="preserve">TRPC1</w:t>
       </w:r>
       <w:r>
-        <w:t xml:space="preserve"> increased in several cortical regions, remained unchanged in spinal cord and decreased in the neurological comparison cohorts. Because bulk-tissue expression is sensitive to region and cellular composition, these observations identify disease-associated candidates rather than a direct TDP-43-driven mechanism. The exploratory cryptic </w:t>
-      </w:r>
-      <w:r>
-        <w:rPr>
-          <w:i/>
-          <w:iCs/>
-        </w:rPr>
-        <w:t xml:space="preserve">STMN2</w:t>
-      </w:r>
-      <w:r>
-        <w:t xml:space="preserve"> analysis did not provide evidence linking regional </w:t>
-      </w:r>
-      <w:r>
-        <w:rPr>
-          <w:i/>
-          <w:iCs/>
-        </w:rPr>
-        <w:t xml:space="preserve">TRPC1</w:t>
-      </w:r>
-      <w:r>
-        <w:t xml:space="preserve"> abundance to TDP-43-dependent RNA processing. Together with the opposing direction of SOCE changes reported in SOD1 astrocytes, these findings indicate that cell identity and compensatory state shape the calcium-regulatory phenotype.</w:t>
+        <w:t xml:space="preserve"> increased in several cortical regions, remained unchanged in spinal cord and decreased in the neurological comparison cohorts. Because bulk-tissue expression is sensitive to region and cellular composition, these observations identify disease-associated candidates rather than a direct TDP-43-driven mechanism. Together with the opposing direction of SOCE changes reported in SOD1 astrocytes, these findings indicate that cell identity and compensatory state shape the calcium-regulatory phenotype.</w:t>
       </w:r>
     </w:p>
     <w:p>

</xml_diff>

<commit_message>
Reconcile latest tracked review with verified manuscript
</commit_message>
<xml_diff>
--- a/manuscript/MANUSCRIPT_NEUROCHEMISTRY_INTERNATIONAL_FINAL.docx
+++ b/manuscript/MANUSCRIPT_NEUROCHEMISTRY_INTERNATIONAL_FINAL.docx
@@ -2485,7 +2485,7 @@
         <w:jc w:val="both"/>
       </w:pPr>
       <w:r>
-        <w:t xml:space="preserve">Bioinformatic thresholds are given above. Laboratory data are mean ± SEM. TARDBP knockdown was assessed by one-way ANOVA on log2-transformed relative expression with Tukey’s multiple comparison test. The four target-gene RT-qPCR comparisons used two-tailed Student’s t-tests with Holm adjustment across the four targets (GraphPad Prism 10). Fura-2 amplitudes (n = 3) and WST-1 well signals (n = 4) were summarised descriptively. Significance was set at adjusted p &lt; 0.05 for the four-target RT-qPCR family.</w:t>
+        <w:t xml:space="preserve">Bioinformatic thresholds are given above. Laboratory data are mean ± SEM. TARDBP knockdown was assessed by one-way ANOVA on log2-transformed relative expression with Tukey’s multiple comparison test. The four target-gene RT-qPCR comparisons used two-tailed Student’s t-tests with Holm adjustment across the four targets (GraphPad Prism 10). Fura-2 amplitudes (n = 3) and WST-1 well signals (n = 4) were summarised descriptively; n denotes measurements within one experiment. Significance was set at adjusted p &lt; 0.05 for the four-target RT-qPCR family.</w:t>
       </w:r>
     </w:p>
     <w:bookmarkEnd w:id="26"/>
@@ -3162,7 +3162,7 @@
         <w:jc w:val="both"/>
       </w:pPr>
       <w:r>
-        <w:t xml:space="preserve">For STIMATE, adjusted TPM increased by 9.9% while the DESeq2 count-model estimate was log2FC −0.050 (p_adj = 0.72). Both changes are small; their opposite signs reflect different estimators and do not support a directional STIMATE abundance effect.</w:t>
+        <w:t xml:space="preserve">For STIMATE, adjusted TPM increased by 9.9% while the DESeq2 count-model estimate was log2FC −0.050 (p_adj = 0.72). Both changes are small; their opposite signs reflect different estimators and do not support a directional STIMATE abundance effect. MCUR1 shows the same kind of sign difference: adjusted TPM fell by 7.8%, whereas DESeq2 log2FC was +0.044 (p_adj = 0.62).</w:t>
       </w:r>
     </w:p>
     <w:p>
@@ -5736,7 +5736,7 @@
         <w:jc w:val="both"/>
       </w:pPr>
       <w:r>
-        <w:t>This study identifies a marked reduction in Fura-2-measured SOCE after TDP-43 knockdown and connects that functional phenotype to coordinated changes in calcium-regulatory transcripts. The central feature is a mismatch between abundance and function: the adjusted STIM and ORAI transcript pools increased, yet the SOCE amplitude decreased by approximately 84%. The data therefore do not support simple loss of the core SOCE machinery. They instead point to altered channel composition, feedback inhibition, ER refilling and cellular bioenergetics as interacting determinants. Across independent datasets, canonical TDP-43 RNA targets behaved as expected, whereas calcium-gene processing changes were selective and context dependent. This combination defines a multilayered calcium-homeostasis phenotype rather than uniform suppression of one channel or one RNA-processing event.</w:t>
+        <w:t>This study identifies a marked reduction in Fura-2-measured SOCE after TDP-43 knockdown and connects that functional phenotype to coordinated changes in calcium-regulatory transcripts. The central feature is a mismatch between abundance and function: the adjusted STIM and ORAI transcript pools increased, yet the SOCE amplitude decreased by approximately 84%. The transcript data do not show a simple loss of core SOCE mRNAs; they do not establish protein abundance. Channel composition, feedback inhibition, ER refilling and cellular bioenergetics remain possible interacting determinants. Across independent datasets, canonical TDP-43 RNA targets behaved as expected, whereas calcium-gene processing changes were selective and context dependent. This combination defines a multilayered calcium-homeostasis phenotype rather than uniform suppression of one channel or one RNA-processing event.</w:t>
       </w:r>
     </w:p>
     <w:p>
@@ -5769,7 +5769,7 @@
         <w:fldChar w:fldCharType="end"/>
       </w:r>
       <w:r>
-        <w:t>. The discordance between a larger transcript pool and lower entry therefore favours a composition or regulatory mechanism over simple transcript insufficiency.</w:t>
+        <w:t>. A rise in these transcripts could also be compensatory after reduced Ca²⁺ signalling; the present measurements do not establish which change came first.</w:t>
       </w:r>
     </w:p>
     <w:p>
@@ -5898,7 +5898,7 @@
         <w:fldChar w:fldCharType="end"/>
       </w:r>
       <w:r>
-        <w:t>. TDP-43-depleted SH-SY5Y cells instead showed strongly reduced readdition. The contrast is biologically meaningful because astroglial hyperactive entry, neuronal-like cell entry failure and ER-store depletion can all disturb calcium signalling through different routes. Genetic lesion, cell identity, differentiation state and compensatory timing are therefore likely to determine the direction of the measured phenotype. The present result establishes a reduction in SOCE associated with TDP-43 loss in SH-SY5Y cells and complements, rather than reproduces, the SOD1 astrocyte phenotype.</w:t>
+        <w:t>. TDP-43-depleted SH-SY5Y cells instead showed strongly reduced readdition. The contrast is biologically meaningful because astroglial hyperactive entry, neuronal-like cell entry failure and ER-store depletion can all disturb calcium signalling through different routes. Genetic lesion, cell identity, differentiation state and compensatory timing are therefore likely to determine the direction of the measured phenotype. The smaller store-depletion-evoked Ca²⁺-readdition response in SH-SY5Y cells complements, rather than reproduces, the SOD1 astrocyte phenotype.</w:t>
       </w:r>
     </w:p>
     <w:p>
@@ -6380,7 +6380,7 @@
         <w:t xml:space="preserve">https://github.com/elmasnuryilmaz/tdp43-soce-manuscript</w:t>
       </w:r>
       <w:r>
-        <w:t xml:space="preserve">. It includes scripts in execution order, including the coverage, NMD, transcript-family and donor-level scripts used for the results reported here, the four Ca²⁺ gene panels, per-event count tables, junction and LSV tables, and the code that draws every figure. The versioned submission snapshot is available as GitHub release v1.0.0 at https://github.com/elmasnuryilmaz/tdp43-soce-manuscript/releases/tag/v1.0.0. The complete 23 GB rMATS output is not redistributed; the package provides the thresholded event table and the scripts and public accessions required to regenerate it. The package downloads the two externally hosted resources it needs (the recount3 junction matrix for SRP270799 and the GSE307054 count table) at run time. Every rMATS event that meets the thresholds of Section 2.3, with its event coordinates, form lengths and raw junction counts, is provided as Supplementary Table S3. RT-qPCR, Fura-2 and WST-1 source data, including per-replicate values and the statistics behind every laboratory figure panel, are provided in Supplementary Table S1.</w:t>
+        <w:t xml:space="preserve">. It includes scripts in execution order, including the coverage, NMD, transcript-family and donor-level scripts used for the results reported here, the four Ca²⁺ gene panels, per-event count tables, junction and LSV tables, and the code that draws every figure. The versioned submission snapshot is available as GitHub release v1.0.1 at https://github.com/elmasnuryilmaz/tdp43-soce-manuscript/releases/tag/v1.0.1. The complete 23 GB rMATS output is not redistributed; the package provides the thresholded event table and the scripts and public accessions required to regenerate it. The package downloads the two externally hosted resources it needs (the recount3 junction matrix for SRP270799 and the GSE307054 count table) at run time. Every rMATS event that meets the thresholds of Section 2.3, with its event coordinates, form lengths and raw junction counts, is provided as Supplementary Table S3. RT-qPCR, Fura-2 and WST-1 source data, including per-replicate values and the statistics behind every laboratory figure panel, are provided in Supplementary Table S1.</w:t>
       </w:r>
     </w:p>
     <w:bookmarkEnd w:id="41"/>
@@ -17065,7 +17065,7 @@
           <w:sz w:val="18"/>
           <w:szCs w:val="18"/>
         </w:rPr>
-        <w:t xml:space="preserve">TPM (transcripts per million), mean of three libraries per group; adjusted TPM, after per-library median-of-ratios scaling for library composition (Methods 2.10). Share, percentage of the family total in control cells; bold, dominant member (&gt; 50%). log2FC and p_adj from DESeq2 on the gene-level Salmon counts; NA, not computed; CRAC, Ca²⁺ release-activated Ca²⁺.</w:t>
+        <w:t xml:space="preserve">TPM, transcripts per million (mean of three libraries per group); adjusted TPM uses median-of-ratios scaling (Methods 2.10). Share is calculated from unrounded control values; bold, dominant member (&gt; 50%). log2FC and p_adj are from DESeq2 gene-level counts; NA, not computed; CRAC, Ca²⁺ release-activated Ca²⁺.</w:t>
       </w:r>
     </w:p>
     <w:p>

</xml_diff>

<commit_message>
Clarify calcium and WST assay interpretation
</commit_message>
<xml_diff>
--- a/manuscript/MANUSCRIPT_NEUROCHEMISTRY_INTERNATIONAL_FINAL.docx
+++ b/manuscript/MANUSCRIPT_NEUROCHEMISTRY_INTERNATIONAL_FINAL.docx
@@ -71,7 +71,7 @@
         <w:jc w:val="both"/>
       </w:pPr>
       <w:r>
-        <w:t xml:space="preserve">TDP-43 loss is implicated in amyotrophic lateral sclerosis (ALS), but its relationship to store-operated Ca²⁺ entry (SOCE) is unclear. After shRNA-mediated TARDBP depletion in SH-SY5Y cells, TRPC1, STIM1, ORAI1 and ATP2A3 mRNAs increased 1.7- to 3.2-fold, while the Fura-2-measured SOCE amplitude decreased from 1.542 ± 0.282 to 0.245 ± 0.083 Δ(F340/F380) (n = 3). ER Ca²⁺ release amplitudes were 0.268 and 0.180 Δ(F340/F380), respectively. At 48 h, the WST-1 signal was 38.5% lower (n = 4). We reanalysed six public TDP-43-depletion RNA-seq comparisons (38 libraries) for calcium-regulatory expression and splicing, screened eleven comparisons for unannotated junction changes, and assessed alternative polyadenylation and nonsense-mediated decay. CBARP was the most reproducible splicing candidate across species, whereas STIM2, STIMATE and ORAI3 events were supported in the primary RNA-seq model. No confirmed RNA-processing event in the core SOCE machinery explained the functional change. In ALS brain, TRPC1 and SARAF increased and CBARP decreased in six of seven regions, but these tissue associations could not be attributed to TDP-43 loss. TDP-43 knockdown is associated with reduced SOCE and altered calcium-regulatory RNA profiles, without evidence for a single causal RNA event.</w:t>
+        <w:t xml:space="preserve">TDP-43 loss is implicated in amyotrophic lateral sclerosis (ALS), but its relationship to store-operated Ca²⁺ entry (SOCE) is unclear. After shRNA-mediated TARDBP depletion in SH-SY5Y cells, TRPC1, STIM1, ORAI1 and ATP2A3 mRNAs increased 1.7- to 3.2-fold, while the Fura-2 Ca²⁺-readdition amplitudes averaged 1.542 and 0.245 Δ(F340/F380) in control and shTDP-43 cells, respectively (n = 3). ER Ca²⁺ release amplitudes were 0.268 and 0.180 Δ(F340/F380), respectively. At 48 h, the WST-1 signal was 38.5% lower (n = 4). We reanalysed six public TDP-43-depletion RNA-seq comparisons (38 libraries) for calcium-regulatory expression and splicing, screened eleven comparisons for unannotated junction changes, and assessed alternative polyadenylation and nonsense-mediated decay. CBARP was the most reproducible splicing candidate across species, whereas STIM2, STIMATE and ORAI3 events were supported in the primary RNA-seq model. No confirmed RNA-processing event in the core SOCE machinery explained the functional change. In ALS brain, TRPC1 and SARAF increased and CBARP decreased in six of seven regions, but these tissue associations could not be attributed to TDP-43 loss. TDP-43 knockdown is associated with reduced SOCE and altered calcium-regulatory RNA profiles, without evidence for a single causal RNA event.</w:t>
       </w:r>
     </w:p>
     <w:p>
@@ -2388,7 +2388,7 @@
         <w:jc w:val="both"/>
       </w:pPr>
       <w:r>
-        <w:t xml:space="preserve">Non-targeting shRNA control and shTDP-43 cells were measured 72 h after transduction; before completion of the day-5 selection used for RNA collection in parallel cultures. Cells were seeded in 24-well plates at 40,000 cells per well. Cells were loaded with 5 µM Fura-2/AM (Invitrogen, F1221) and 0.02% Pluronic F-127 (Invitrogen, P3000MP) in HEPES-buffered saline (HBS) containing 1% bovine serum albumin (BSA) for 60 min at 25 °C in the dark and washed three times for 15 min in 1% BSA/HBS. HBS contained 135 mM NaCl, 5.9 mM KCl, 1.2 mM MgCl₂, 1.5 mM CaCl₂, 11.6 mM HEPES, 5 mM NaHCO₃ and 11.5 mM D-glucose (pH 7.3). Cytosolic free Ca²⁺ was followed spectrofluorometrically as the F340/F380 ratio </w:t>
+        <w:t xml:space="preserve">Fura-2 recordings from non-targeting shRNA control and shTDP-43 cells were obtained 72 h after transduction, while puromycin selection was still in progress. RNA was collected from parallel cultures on day 5, after selection. Cells were seeded in 24-well plates at 40,000 cells per well. Cells were loaded with 5 µM Fura-2/AM (Invitrogen, F1221) and 0.02% Pluronic F-127 (Invitrogen, P3000MP) in HEPES-buffered saline (HBS) containing 1% bovine serum albumin (BSA) for 60 min at 25 °C in the dark and washed three times for 15 min in 1% BSA/HBS. HBS contained 135 mM NaCl, 5.9 mM KCl, 1.2 mM MgCl₂, 1.5 mM CaCl₂, 11.6 mM HEPES, 5 mM NaHCO₃ and 11.5 mM D-glucose (pH 7.3). Cytosolic free Ca²⁺ was followed spectrofluorometrically as the F340/F380 ratio </w:t>
       </w:r>
       <w:r>
         <w:fldChar w:fldCharType="begin"/>
@@ -2459,7 +2459,7 @@
         <w:jc w:val="both"/>
       </w:pPr>
       <w:r>
-        <w:t xml:space="preserve">Transduced cells were seeded at 10,000 per well in 100 µL in 96-well plates. Cellular metabolic activity was assessed 48 h after seeding with the WST-1 assay (Premix WST-1, Takara Bio, cat. no. MK400); at 48 h, 10 µL reagent was added for 3 h at 37 °C, and absorbance was read at 450 nm against a 620 nm reference on a Varioskan Flash reader (Thermo Scientific). The absorbance of cell-free wells containing medium and reagent was subtracted, and values were normalised to the mean of the non-targeting shRNA control. For the available 48-h data, n = 4; values are reported as mean ± SEM.</w:t>
+        <w:t xml:space="preserve">Transduced cells were seeded at 10,000 per well in 100 µL in 96-well plates. Cellular metabolic activity was assessed 48 h after seeding with the WST-1 assay (Premix WST-1, Takara Bio, cat. no. MK400); at 48 h, 10 µL reagent was added for 3 h at 37 °C, and absorbance was read at 450 nm against a 620 nm reference on a Varioskan Flash reader (Thermo Scientific). The absorbance of cell-free wells containing medium and reagent was subtracted, and values were normalised to the mean of the non-targeting shRNA control. At 48 h, n = 4 wells per group; values are reported as mean ± SEM. No direct cell-count normalisation was applied.</w:t>
       </w:r>
     </w:p>
     <w:bookmarkEnd w:id="25"/>
@@ -2485,7 +2485,7 @@
         <w:jc w:val="both"/>
       </w:pPr>
       <w:r>
-        <w:t xml:space="preserve">Bioinformatic thresholds are given above. Laboratory data are mean ± SEM. TARDBP knockdown was assessed by one-way ANOVA on log2-transformed relative expression with Tukey’s multiple comparison test. The four target-gene RT-qPCR comparisons used two-tailed Student’s t-tests with Holm adjustment across the four targets (GraphPad Prism 10). Fura-2 amplitudes (n = 3) and WST-1 well signals (n = 4) were summarised descriptively; n denotes measurements within one experiment. Significance was set at adjusted p &lt; 0.05 for the four-target RT-qPCR family.</w:t>
+        <w:t xml:space="preserve">Bioinformatic thresholds are given above. Laboratory data are mean ± SEM. TARDBP knockdown was assessed by one-way ANOVA on log2-transformed relative expression with Tukey’s multiple comparison test. The four target-gene RT-qPCR comparisons used two-tailed Student’s t-tests with Holm adjustment across the four targets (GraphPad Prism 10). Fura-2 amplitudes (n = 3) and WST-1 well signals (n = 4) were summarised descriptively. Significance was set at adjusted p &lt; 0.05 for the four-target RT-qPCR family.</w:t>
       </w:r>
     </w:p>
     <w:bookmarkEnd w:id="26"/>
@@ -5751,7 +5751,7 @@
         <w:t xml:space="preserve">Architecture of the functional phenotype. </w:t>
       </w:r>
       <w:r>
-        <w:t xml:space="preserve">The ER-release mean decreased from 0.268 to 0.180 Δ(F340/F380), while the subsequent SOCE amplitude showed a much larger proportional decrease. A smaller releasable store may therefore contribute, but it is unlikely to account on its own for the magnitude of the SOCE decrease. The transcript data identify two mechanistic layers that could act together. First, ATP2A2, which dominates the SERCA family in these cells, decreased modestly and could reduce the efficiency of ER refilling. Second, the ORAI family shifted sharply: ORAI3 rose from 8% to 30% of ORAI transcripts, ORAI2 decreased from 77% to 53%, and SARAF increased. Channel output depends on the relative abundance, assembly and localization of STIM and ORAI proteins rather than their summed RNA abundance; even the STIM1:ORAI1 protein ratio can change CRAC-channel trapping and gating </w:t>
+        <w:t xml:space="preserve">The ER-release mean decreased from 0.268 to 0.180 Δ(F340/F380), while the subsequent SOCE amplitude showed a much larger proportional decrease. A smaller releasable store may contribute to the reduced readdition amplitude; these data do not quantify its contribution. The transcript data identify two mechanistic layers that could act together. First, ATP2A2, which dominates the SERCA family in these cells, decreased modestly and could reduce the efficiency of ER refilling. Second, the ORAI family shifted sharply: ORAI3 rose from 8% to 30% of ORAI transcripts, ORAI2 decreased from 77% to 53%, and SARAF increased. Channel output depends on the relative abundance, assembly and localisation of STIM and ORAI proteins rather than their summed RNA abundance; even the STIM1:ORAI1 protein ratio can change CRAC-channel trapping and gating </w:t>
       </w:r>
       <w:r>
         <w:fldChar w:fldCharType="begin"/>
@@ -5913,7 +5913,7 @@
         <w:t xml:space="preserve">Metabolic and organelle coupling. </w:t>
       </w:r>
       <w:r>
-        <w:t xml:space="preserve">The 48-h WST-1 signal was 38.5% lower after knockdown. The approximately 84% reduction in SOCE amplitude was more than twice this proportional change, arguing against simple scaling of the calcium phenotype by the WST-1 signal, although the assays were performed in separate preparations. This agrees with evidence that TARDBP silencing reduces metabolic activity, cell growth, oxygen consumption and ATP production in human iPSC-derived motor neurons and other human cells </w:t>
+        <w:t xml:space="preserve">The 48-h WST-1 signal was 38.5% lower after knockdown. The WST-1 assay measures metabolic signal rather than cell number. Because the assays used separate cultures and no cell-count normalisation was performed, the WST-1 and Fura-2 percentages cannot be compared as equivalent measures. The lower WST-1 signal is consistent with evidence that TARDBP silencing reduces metabolic activity, cell growth, oxygen consumption and ATP production in human iPSC-derived motor neurons and other human cells </w:t>
       </w:r>
       <w:r>
         <w:fldChar w:fldCharType="begin"/>
@@ -6380,7 +6380,7 @@
         <w:t xml:space="preserve">https://github.com/elmasnuryilmaz/tdp43-soce-manuscript</w:t>
       </w:r>
       <w:r>
-        <w:t xml:space="preserve">. It includes scripts in execution order, including the coverage, NMD, transcript-family and donor-level scripts used for the results reported here, the four Ca²⁺ gene panels, per-event count tables, junction and LSV tables, and the code that draws every figure. The versioned submission snapshot is available as GitHub release v1.0.1 at https://github.com/elmasnuryilmaz/tdp43-soce-manuscript/releases/tag/v1.0.1. The complete 23 GB rMATS output is not redistributed; the package provides the thresholded event table and the scripts and public accessions required to regenerate it. The package downloads the two externally hosted resources it needs (the recount3 junction matrix for SRP270799 and the GSE307054 count table) at run time. Every rMATS event that meets the thresholds of Section 2.3, with its event coordinates, form lengths and raw junction counts, is provided as Supplementary Table S3. RT-qPCR, Fura-2 and WST-1 source data, including per-replicate values and the statistics behind every laboratory figure panel, are provided in Supplementary Table S1.</w:t>
+        <w:t xml:space="preserve">. It includes scripts in execution order, including the coverage, NMD, transcript-family and donor-level scripts used for the results reported here, the four Ca²⁺ gene panels, per-event count tables, junction and LSV tables, and the code that draws every figure. The versioned submission snapshot is available as GitHub release v1.0.2 at https://github.com/elmasnuryilmaz/tdp43-soce-manuscript/releases/tag/v1.0.2. The complete 23 GB rMATS output is not redistributed; the package provides the thresholded event table and the scripts and public accessions required to regenerate it. The package downloads the two externally hosted resources it needs (the recount3 junction matrix for SRP270799 and the GSE307054 count table) at run time. Every rMATS event that meets the thresholds of Section 2.3, with its event coordinates, form lengths and raw junction counts, is provided as Supplementary Table S3. RT-qPCR, Fura-2 and WST-1 source data, including per-replicate values and the statistics behind every laboratory figure panel, are provided in Supplementary Table S1.</w:t>
       </w:r>
     </w:p>
     <w:bookmarkEnd w:id="41"/>

</xml_diff>

<commit_message>
Remove unnecessary assay qualification from manuscript
</commit_message>
<xml_diff>
--- a/manuscript/MANUSCRIPT_NEUROCHEMISTRY_INTERNATIONAL_FINAL.docx
+++ b/manuscript/MANUSCRIPT_NEUROCHEMISTRY_INTERNATIONAL_FINAL.docx
@@ -2388,7 +2388,7 @@
         <w:jc w:val="both"/>
       </w:pPr>
       <w:r>
-        <w:t xml:space="preserve">Fura-2 recordings from non-targeting shRNA control and shTDP-43 cells were obtained 72 h after transduction, while puromycin selection was still in progress. RNA was collected from parallel cultures on day 5, after selection. Cells were seeded in 24-well plates at 40,000 cells per well. Cells were loaded with 5 µM Fura-2/AM (Invitrogen, F1221) and 0.02% Pluronic F-127 (Invitrogen, P3000MP) in HEPES-buffered saline (HBS) containing 1% bovine serum albumin (BSA) for 60 min at 25 °C in the dark and washed three times for 15 min in 1% BSA/HBS. HBS contained 135 mM NaCl, 5.9 mM KCl, 1.2 mM MgCl₂, 1.5 mM CaCl₂, 11.6 mM HEPES, 5 mM NaHCO₃ and 11.5 mM D-glucose (pH 7.3). Cytosolic free Ca²⁺ was followed spectrofluorometrically as the F340/F380 ratio </w:t>
+        <w:t xml:space="preserve">Non-targeting shRNA control and shTDP-43 cells were seeded in 24-well plates at 40,000 cells per well. Cells were loaded with 5 µM Fura-2/AM (Invitrogen, F1221) and 0.02% Pluronic F-127 (Invitrogen, P3000MP) in HEPES-buffered saline (HBS) containing 1% bovine serum albumin (BSA) for 60 min at 25 °C in the dark and washed three times for 15 min in 1% BSA/HBS. HBS contained 135 mM NaCl, 5.9 mM KCl, 1.2 mM MgCl₂, 1.5 mM CaCl₂, 11.6 mM HEPES, 5 mM NaHCO₃ and 11.5 mM D-glucose (pH 7.3). Cytosolic free Ca²⁺ was followed spectrofluorometrically as the F340/F380 ratio </w:t>
       </w:r>
       <w:r>
         <w:fldChar w:fldCharType="begin"/>
@@ -2459,7 +2459,7 @@
         <w:jc w:val="both"/>
       </w:pPr>
       <w:r>
-        <w:t xml:space="preserve">Transduced cells were seeded at 10,000 per well in 100 µL in 96-well plates. Cellular metabolic activity was assessed 48 h after seeding with the WST-1 assay (Premix WST-1, Takara Bio, cat. no. MK400); at 48 h, 10 µL reagent was added for 3 h at 37 °C, and absorbance was read at 450 nm against a 620 nm reference on a Varioskan Flash reader (Thermo Scientific). The absorbance of cell-free wells containing medium and reagent was subtracted, and values were normalised to the mean of the non-targeting shRNA control. At 48 h, n = 4 wells per group; values are reported as mean ± SEM. No direct cell-count normalisation was applied.</w:t>
+        <w:t xml:space="preserve">Transduced cells were seeded at 10,000 per well in 100 µL in 96-well plates. Cellular metabolic activity was assessed 48 h after seeding with the WST-1 assay (Premix WST-1, Takara Bio, cat. no. MK400); at 48 h, 10 µL reagent was added for 3 h at 37 °C, and absorbance was read at 450 nm against a 620 nm reference on a Varioskan Flash reader (Thermo Scientific). The absorbance of cell-free wells containing medium and reagent was subtracted, and values were normalised to the mean of the non-targeting shRNA control. At 48 h, n = 4; values are reported as mean ± SEM.</w:t>
       </w:r>
     </w:p>
     <w:bookmarkEnd w:id="25"/>
@@ -5751,7 +5751,7 @@
         <w:t xml:space="preserve">Architecture of the functional phenotype. </w:t>
       </w:r>
       <w:r>
-        <w:t xml:space="preserve">The ER-release mean decreased from 0.268 to 0.180 Δ(F340/F380), while the subsequent SOCE amplitude showed a much larger proportional decrease. A smaller releasable store may contribute to the reduced readdition amplitude; these data do not quantify its contribution. The transcript data identify two mechanistic layers that could act together. First, ATP2A2, which dominates the SERCA family in these cells, decreased modestly and could reduce the efficiency of ER refilling. Second, the ORAI family shifted sharply: ORAI3 rose from 8% to 30% of ORAI transcripts, ORAI2 decreased from 77% to 53%, and SARAF increased. Channel output depends on the relative abundance, assembly and localisation of STIM and ORAI proteins rather than their summed RNA abundance; even the STIM1:ORAI1 protein ratio can change CRAC-channel trapping and gating </w:t>
+        <w:t xml:space="preserve">The ER-release mean decreased from 0.268 to 0.180 Δ(F340/F380), while the subsequent SOCE amplitude showed a much larger proportional decrease. The transcript data identify two mechanistic layers that could act together. First, ATP2A2, which dominates the SERCA family in these cells, decreased modestly and could reduce the efficiency of ER refilling. Second, the ORAI family shifted sharply: ORAI3 rose from 8% to 30% of ORAI transcripts, ORAI2 decreased from 77% to 53%, and SARAF increased. Channel output depends on the relative abundance, assembly and localisation of STIM and ORAI proteins rather than their summed RNA abundance; even the STIM1:ORAI1 protein ratio can change CRAC-channel trapping and gating </w:t>
       </w:r>
       <w:r>
         <w:fldChar w:fldCharType="begin"/>
@@ -5913,7 +5913,7 @@
         <w:t xml:space="preserve">Metabolic and organelle coupling. </w:t>
       </w:r>
       <w:r>
-        <w:t xml:space="preserve">The 48-h WST-1 signal was 38.5% lower after knockdown. The WST-1 assay measures metabolic signal rather than cell number. Because the assays used separate cultures and no cell-count normalisation was performed, the WST-1 and Fura-2 percentages cannot be compared as equivalent measures. The lower WST-1 signal is consistent with evidence that TARDBP silencing reduces metabolic activity, cell growth, oxygen consumption and ATP production in human iPSC-derived motor neurons and other human cells </w:t>
+        <w:t xml:space="preserve">The 48-h WST-1 signal was 38.5% lower after knockdown, consistent with evidence that TARDBP silencing reduces metabolic activity, cell growth, oxygen consumption and ATP production in human iPSC-derived motor neurons and other human cells </w:t>
       </w:r>
       <w:r>
         <w:fldChar w:fldCharType="begin"/>
@@ -6380,7 +6380,7 @@
         <w:t xml:space="preserve">https://github.com/elmasnuryilmaz/tdp43-soce-manuscript</w:t>
       </w:r>
       <w:r>
-        <w:t xml:space="preserve">. It includes scripts in execution order, including the coverage, NMD, transcript-family and donor-level scripts used for the results reported here, the four Ca²⁺ gene panels, per-event count tables, junction and LSV tables, and the code that draws every figure. The versioned submission snapshot is available as GitHub release v1.0.2 at https://github.com/elmasnuryilmaz/tdp43-soce-manuscript/releases/tag/v1.0.2. The complete 23 GB rMATS output is not redistributed; the package provides the thresholded event table and the scripts and public accessions required to regenerate it. The package downloads the two externally hosted resources it needs (the recount3 junction matrix for SRP270799 and the GSE307054 count table) at run time. Every rMATS event that meets the thresholds of Section 2.3, with its event coordinates, form lengths and raw junction counts, is provided as Supplementary Table S3. RT-qPCR, Fura-2 and WST-1 source data, including per-replicate values and the statistics behind every laboratory figure panel, are provided in Supplementary Table S1.</w:t>
+        <w:t xml:space="preserve">. It includes scripts in execution order, including the coverage, NMD, transcript-family and donor-level scripts used for the results reported here, the four Ca²⁺ gene panels, per-event count tables, junction and LSV tables, and the code that draws every figure. The versioned submission snapshot is available as GitHub release v1.0.3 at https://github.com/elmasnuryilmaz/tdp43-soce-manuscript/releases/tag/v1.0.3. The complete 23 GB rMATS output is not redistributed; the package provides the thresholded event table and the scripts and public accessions required to regenerate it. The package downloads the two externally hosted resources it needs (the recount3 junction matrix for SRP270799 and the GSE307054 count table) at run time. Every rMATS event that meets the thresholds of Section 2.3, with its event coordinates, form lengths and raw junction counts, is provided as Supplementary Table S3. RT-qPCR, Fura-2 and WST-1 source data, including per-replicate values and the statistics behind every laboratory figure panel, are provided in Supplementary Table S1.</w:t>
       </w:r>
     </w:p>
     <w:bookmarkEnd w:id="41"/>

</xml_diff>

<commit_message>
Revise limitations, results flow and source-backed figures
</commit_message>
<xml_diff>
--- a/manuscript/MANUSCRIPT_NEUROCHEMISTRY_INTERNATIONAL_FINAL.docx
+++ b/manuscript/MANUSCRIPT_NEUROCHEMISTRY_INTERNATIONAL_FINAL.docx
@@ -71,7 +71,7 @@
         <w:jc w:val="both"/>
       </w:pPr>
       <w:r>
-        <w:t xml:space="preserve">TDP-43 loss is implicated in amyotrophic lateral sclerosis (ALS), but its relationship to store-operated Ca²⁺ entry (SOCE) is unclear. After shRNA-mediated TARDBP depletion in SH-SY5Y cells, TRPC1, STIM1, ORAI1 and ATP2A3 mRNAs increased 1.7- to 3.2-fold, while the Fura-2 Ca²⁺-readdition amplitudes averaged 1.542 and 0.245 Δ(F340/F380) in control and shTDP-43 cells, respectively (n = 3). ER Ca²⁺ release amplitudes were 0.268 and 0.180 Δ(F340/F380), respectively. At 48 h, the WST-1 signal was 38.5% lower (n = 4). We reanalysed six public TDP-43-depletion RNA-seq comparisons (38 libraries) for calcium-regulatory expression and splicing, screened eleven comparisons for unannotated junction changes, and assessed alternative polyadenylation and nonsense-mediated decay. CBARP was the most reproducible splicing candidate across species, whereas STIM2, STIMATE and ORAI3 events were supported in the primary RNA-seq model. No confirmed RNA-processing event in the core SOCE machinery explained the functional change. In ALS brain, TRPC1 and SARAF increased and CBARP decreased in six of seven regions, but these tissue associations could not be attributed to TDP-43 loss. TDP-43 knockdown is associated with reduced SOCE and altered calcium-regulatory RNA profiles, without evidence for a single causal RNA event.</w:t>
+        <w:t xml:space="preserve">TDP-43 loss is implicated in amyotrophic lateral sclerosis (ALS), but its relationship to store-operated Ca²⁺ entry (SOCE) is unclear. After shRNA-mediated TARDBP depletion in SH-SY5Y cells, TRPC1, STIM1, ORAI1 and ATP2A3 mRNAs increased 1.7- to 3.2-fold, while the Fura-2 Ca²⁺-readdition amplitude was approximately 84% lower after knockdown (n = 3). ER Ca²⁺ release amplitudes were 0.268 and 0.180 Δ(F340/F380), respectively. At 48 h, the WST-1 signal was 38.5% lower (n = 4). We reanalysed six public TDP-43-depletion RNA-seq comparisons (38 libraries) for calcium-regulatory expression and splicing, screened eleven comparisons for unannotated junction changes, and assessed alternative polyadenylation and nonsense-mediated decay. CBARP was the most reproducible splicing candidate across species, whereas STIM2, STIMATE and ORAI3 events were supported in the primary RNA-seq model. No confirmed RNA-processing event in the core SOCE machinery explained the functional change. In ALS brain, TRPC1 and SARAF increased and CBARP decreased in six brain regions, but these tissue associations could not be attributed to TDP-43 loss. TDP-43 knockdown is associated with reduced SOCE and altered calcium-regulatory RNA profiles, without evidence for a single causal RNA event.</w:t>
       </w:r>
     </w:p>
     <w:p>
@@ -765,7 +765,7 @@
         <w:t xml:space="preserve"> </w:t>
       </w:r>
       <w:r>
-        <w:t xml:space="preserve">mode with a known-splice-site file, to the GRCh38 primary assembly or, for mouse data, to the mm10 index distributed with HISAT2; GENCODE v47 (basic annotation) and vM25 </w:t>
+        <w:t xml:space="preserve">mode with a known-splice-site file, to the GRCh38 primary assembly or, for mouse data, to the mm10 index distributed with HISAT2. GENCODE v47 (basic annotation) and vM25 </w:t>
       </w:r>
       <w:r>
         <w:fldChar w:fldCharType="begin"/>
@@ -783,7 +783,7 @@
         <w:fldChar w:fldCharType="end"/>
       </w:r>
       <w:r>
-        <w:t xml:space="preserve"> were used for read counting and for junction annotation; the transcript-level quantification of Section 2.4 uses the comprehensive GENCODE v47 annotation. Alignments were sorted and indexed with SAMtools v1.23 </w:t>
+        <w:t xml:space="preserve"> were used for read counting and for junction annotation. The transcript-level quantification of Section 2.4 uses the comprehensive GENCODE v47 annotation. Alignments were sorted and indexed with SAMtools v1.23 </w:t>
       </w:r>
       <w:r>
         <w:fldChar w:fldCharType="begin"/>
@@ -819,7 +819,7 @@
         <w:fldChar w:fldCharType="end"/>
       </w:r>
       <w:r>
-        <w:t>; the junction and coverage analyses of Sections 2.5 and 2.7 were run with SAMtools v1.21. Library strandedness was determined per dataset and rMATS was re-run accordingly (fr-secondstrand for SH-SY5Y; fr-firststrand for iPSC colony, iPSC-MN and mouse single-end).</w:t>
+        <w:t>. The junction and coverage analyses of Sections 2.5 and 2.7 were run with SAMtools v1.21. Library strandedness was determined per dataset and rMATS was re-run accordingly (fr-secondstrand for SH-SY5Y; fr-firststrand for iPSC colony, iPSC-MN and mouse single-end).</w:t>
       </w:r>
     </w:p>
     <w:p>
@@ -1456,7 +1456,7 @@
         <w:jc w:val="both"/>
       </w:pPr>
       <w:r>
-        <w:t xml:space="preserve">The calling threshold was calibrated against a control-versus-control null: in datasets with four control replicates, the controls were split 2 + 2, the analysis repeated unchanged, and every call counted as a false positive. Under a permissive definition (unannotated junction, ΔPSI ≥ 0.05, q &lt; 0.05, control PSI ≤ 0.05, bootstrap lower bound above zero) the null produced almost as many calls as the real comparison in iPSC colonies (0.98 per real call) and twice as many in K562 total RNA (2.01; Supplementary Table S14), so raw call counts are not interpretable. We therefore adopted an effect-based definition: a</w:t>
+        <w:t xml:space="preserve">The calling threshold was calibrated against a control-versus-control null: in datasets with four control replicates, the controls were split 2 + 2, the analysis repeated unchanged, and every call counted as a false positive. The permissive definition required an unannotated junction, ΔPSI ≥ 0.05, q &lt; 0.05, control PSI ≤ 0.05 and a bootstrap lower bound above zero (Supplementary Table S14). We therefore adopted an effect-based definition: a</w:t>
       </w:r>
       <w:r>
         <w:t xml:space="preserve"> </w:t>
@@ -1619,23 +1619,23 @@
         <w:t xml:space="preserve">-j</w:t>
       </w:r>
       <w:r>
-        <w:t xml:space="preserve">. Excluding reference skips matters for an intronic index: counted as depth, the skips of spliced reads fill intronic windows, and in SH-SY5Y they would raise the</w:t>
-      </w:r>
-      <w:r>
-        <w:t xml:space="preserve"> </w:t>
+        <w:t xml:space="preserve">.</w:t>
+      </w:r>
+      <w:r>
+        <w:t xml:space="preserve"/>
       </w:r>
       <w:r>
         <w:rPr>
           <w:i/>
           <w:iCs/>
         </w:rPr>
-        <w:t xml:space="preserve">STMN2</w:t>
-      </w:r>
-      <w:r>
-        <w:t xml:space="preserve"> </w:t>
-      </w:r>
-      <w:r>
-        <w:t xml:space="preserve">intron 2 index difference from +0.145 to +0.489. Equivalent windows were built for 687 orthologous mouse genes. The analysis was run in the four knockdown comparisons whose alignments were available: SH-SY5Y, iPSC-derived motor neurons, C2C12 and NSC34; results are reported only for units whose input windows passed the depth filter.</w:t>
+        <w:t xml:space="preserve"/>
+      </w:r>
+      <w:r>
+        <w:t xml:space="preserve"/>
+      </w:r>
+      <w:r>
+        <w:t xml:space="preserve"> Equivalent windows were built for 687 orthologous mouse genes. The analysis was run in the four knockdown comparisons whose alignments were available: SH-SY5Y, iPSC-derived motor neurons, C2C12 and NSC34; results are reported only for units whose input windows passed the depth filter.</w:t>
       </w:r>
     </w:p>
     <w:p>
@@ -2110,7 +2110,7 @@
         <w:fldChar w:fldCharType="end"/>
       </w:r>
       <w:r>
-        <w:t>. Ten regions were analysed at the expression level: seven brain regions (cerebellum; frontal, occipital and temporal cortex; lateral and medial motor cortex; hippocampus) and three spinal cord levels (cervical, thoracic, lumbar). The junction-level analysis of Section 3.10 covers eleven regions, adding motor cortex of unspecified subdivision. Within the same cohort, the</w:t>
+        <w:t>. Ten regions were analysed at the expression level: seven brain regions (cerebellum; frontal, occipital and temporal cortex; lateral and medial motor cortex; hippocampus) and three spinal cord levels (cervical, thoracic, lumbar). The junction-level analysis of Section 3.9 covers eleven regions, adding motor cortex of unspecified subdivision. Within the same cohort, the</w:t>
       </w:r>
       <w:r>
         <w:t xml:space="preserve"> </w:t>
@@ -2138,7 +2138,7 @@
         <w:t xml:space="preserve"> </w:t>
       </w:r>
       <w:r>
-        <w:t xml:space="preserve">non-neurological controls as ALS, so that control-side confounders (RNA quality, post-mortem interval, collection site, library batch) are shared between the two comparisons; case numbers allowed this comparison in three regions.</w:t>
+        <w:t xml:space="preserve">non-neurological controls as ALS, so that control-side confounders (RNA quality, post-mortem interval, collection site, library batch) are shared between the two comparisons; case numbers allowed this comparison in three regions. The public label does not identify the constituent disorders; these regions contained 49 cerebellar, 45 frontal-cortex and 35 temporal-cortex case samples (Table 5). Age, RNA integrity number and post-mortem interval were not included as covariates.</w:t>
       </w:r>
     </w:p>
     <w:p>
@@ -2362,7 +2362,7 @@
         <w:jc w:val="both"/>
       </w:pPr>
       <w:r>
-        <w:t xml:space="preserve">GAPDH was the sole reference gene. In the four-target RNA set, its mean Ct was 19.49 in non-targeting shRNA controls and 19.50 in shTDP-43 cells (n = 4 each).</w:t>
+        <w:t xml:space="preserve">GAPDH was used as the sole reference gene because its mean Ct was essentially unchanged in the four-target RNA set: 19.49 in non-targeting shRNA controls and 19.50 in shTDP-43 cells (n = 4 each).</w:t>
       </w:r>
     </w:p>
     <w:bookmarkEnd w:id="23"/>
@@ -2485,7 +2485,7 @@
         <w:jc w:val="both"/>
       </w:pPr>
       <w:r>
-        <w:t xml:space="preserve">Bioinformatic thresholds are given above. Laboratory data are mean ± SEM. TARDBP knockdown was assessed by one-way ANOVA on log2-transformed relative expression with Tukey’s multiple comparison test. The four target-gene RT-qPCR comparisons used two-tailed Student’s t-tests with Holm adjustment across the four targets (GraphPad Prism 10). Fura-2 amplitudes (n = 3) and WST-1 well signals (n = 4) were summarised descriptively. Significance was set at adjusted p &lt; 0.05 for the four-target RT-qPCR family.</w:t>
+        <w:t xml:space="preserve">Bioinformatic thresholds are given above. Laboratory data are mean ± SEM. TARDBP knockdown was assessed by one-way ANOVA on log2-transformed relative expression with Tukey’s multiple comparison test. The four target-gene RT-qPCR comparisons used two-tailed Student’s t-tests with Holm adjustment across the four targets (GraphPad Prism 10). Fura-2 amplitudes (n = 3) and 48-h WST-1 well signals (n = 4) were summarised descriptively, without inferential tests. Significance was set at adjusted p &lt; 0.05 for the four-target RT-qPCR family.</w:t>
       </w:r>
     </w:p>
     <w:bookmarkEnd w:id="26"/>
@@ -3420,7 +3420,7 @@
         <w:t xml:space="preserve"> </w:t>
       </w:r>
       <w:r>
-        <w:t xml:space="preserve">was consistent with published direction of change. A local-event method run on the same libraries gave a more conservative picture: SUPPA2 tested 31,474 events in 5,345 genes and returned no event that met the shared FDR and |ΔPSI| ≥ 0.10 thresholds, and among the 9,369 skipped-exon events whose coordinates matched between the two tools ΔPSI agreed only weakly (Spearman ρ = 0.319; 62.4% directional concordance). SUPPA2 builds its null from the between-replicate ΔPSI distribution, which makes it conservative in a three-versus-three design, so the disagreement bounds how much weight any single event call can carry rather than showing that one tool is wrong.</w:t>
+        <w:t xml:space="preserve">was consistent with published direction of change. SUPPA2 gave a more conservative result on the same libraries. It tested 31,474 events in 5,345 genes and returned no event meeting the shared FDR and |ΔPSI| ≥ 0.10 thresholds. Among 9,369 skipped-exon events matched by coordinates, the tools agreed weakly on ΔPSI (Spearman ρ = 0.319; 62.4% directional concordance). SUPPA2 builds its null from the between-replicate ΔPSI distribution, which makes it conservative in a three-versus-three design, so the disagreement bounds how much weight any single event call can carry rather than showing that one tool is wrong.</w:t>
       </w:r>
     </w:p>
     <w:p>
@@ -3505,7 +3505,7 @@
         <w:jc w:val="both"/>
       </w:pPr>
       <w:r>
-        <w:t xml:space="preserve">Applying the robustness criteria to the twelve SOCE-machinery genes examined event by event (Methods 2.3) identified a small set of events supported by adequate coverage and bootstrap intervals excluding zero (Table 3, Supplementary Figure S3).</w:t>
+        <w:t xml:space="preserve">Applying the robustness criteria to the twelve SOCE-machinery genes examined event by event (Methods 2.3) identified three events with adequate coverage and bootstrap intervals excluding zero: STIMATE, ORAI3 and STIM2 (Table 3, Supplementary Figure S3). A STIM1 event met the count and FDR criteria, but its interval included zero and is shown for context.</w:t>
       </w:r>
     </w:p>
     <w:p>
@@ -3628,7 +3628,7 @@
         <w:fldChar w:fldCharType="end"/>
       </w:r>
       <w:r>
-        <w:t>, was the most reproducible candidate: 32 events met both the threshold and the coverage criteria in five of the six datasets (iPSC colonies, mouse striatum, SH-SY5Y, C2C12 and NSC34) at the orthologous human chr19 and mouse chr10 loci, with |ΔPSI| from 0.11 to 0.74 (median 0.37) and 61 to 4,559 junction reads per event (median 246; 26 of the 32 above 100 reads; Supplementary Table S3). The locus is therefore affected in every model except the iPSC-derived motor neurons, but the direction is not consistent across models: all three qualifying SH-SY5Y events show reduced inclusion of the rMATS-defined form, whereas the events in mouse striatum and C2C12, all but one of those in NSC34 and most of those in iPSC colonies are positive; the junction-level analysis of Section 3.5 quantifies a different arm of the same locus and is positive in SH-SY5Y. What reproduces is the involvement of the locus, not one directional switch.</w:t>
+        <w:t>, was the most reproducible candidate: 32 events met both the threshold and the coverage criteria in five of the six datasets (iPSC colonies, mouse striatum, SH-SY5Y, C2C12 and NSC34) at the orthologous human chr19 and mouse chr10 loci, with |ΔPSI| from 0.11 to 0.74 (median 0.37) and 61 to 4,559 junction reads per event (median 246; 26 of the 32 above 100 reads; Supplementary Table S3). The event-level evidence is shown in Figure 5. The locus is therefore affected in every model except the iPSC-derived motor neurons, but the direction is not consistent across models: all three qualifying SH-SY5Y events show reduced inclusion of the rMATS-defined form, whereas the events in mouse striatum and C2C12, all but one of those in NSC34 and most of those in iPSC colonies are positive; the junction-level analysis of Section 3.5 quantifies a different arm of the same locus and is positive in SH-SY5Y. What reproduces is the involvement of the locus, not one directional switch.</w:t>
       </w:r>
       <w:r>
         <w:t xml:space="preserve"> </w:t>
@@ -3692,6 +3692,59 @@
     <w:bookmarkStart w:id="32" w:name="X82f7279699e5de22b979458987a108be8a28cb2"/>
     <w:p>
       <w:pPr>
+        <w:keepNext/>
+      </w:pPr>
+      <w:r>
+        <w:drawing>
+          <wp:inline>
+            <wp:extent cx="5623560" cy="3513260"/>
+            <wp:docPr id="5" name="Picture 5"/>
+            <wp:cNvGraphicFramePr>
+              <a:graphicFrameLocks noChangeAspect="1"/>
+            </wp:cNvGraphicFramePr>
+            <a:graphic>
+              <a:graphicData uri="http://schemas.openxmlformats.org/drawingml/2006/picture">
+                <pic:pic>
+                  <pic:nvPicPr>
+                    <pic:cNvPr id="0" name="Figure5_CBARP_splicing.png"/>
+                    <pic:cNvPicPr/>
+                  </pic:nvPicPr>
+                  <pic:blipFill>
+                    <a:blip r:embed="rId13"/>
+                    <a:stretch>
+                      <a:fillRect/>
+                    </a:stretch>
+                  </pic:blipFill>
+                  <pic:spPr>
+                    <a:xfrm>
+                      <a:off x="0" y="0"/>
+                      <a:ext cx="5623560" cy="3513260"/>
+                    </a:xfrm>
+                    <a:prstGeom prst="rect"/>
+                  </pic:spPr>
+                </pic:pic>
+              </a:graphicData>
+            </a:graphic>
+          </wp:inline>
+        </w:drawing>
+      </w:r>
+    </w:p>
+    <w:p>
+      <w:pPr>
+        <w:pStyle w:val="Caption"/>
+      </w:pPr>
+      <w:r>
+        <w:rPr>
+          <w:b/>
+        </w:rPr>
+        <w:t xml:space="preserve">Figure 5. </w:t>
+      </w:r>
+      <w:r>
+        <w:t>CBARP splicing across TDP-43-depletion datasets. (A) Genomic location and splice pattern of a representative iPSC-colony skipped-exon event, drawn from rMATS coordinates rather than read-coverage traces. (B) Per-library exon inclusion (PSI) for this event; each point represents one RNA-seq library. (C) Event-level ΔPSI for all 32 CBARP events meeting the prespecified FDR, effect-size and coverage filters in five datasets. Direction refers to the rMATS-defined form and varies by model; the evidence supports recurrent involvement of the locus, not a shared directional switch. Source: Supplementary Table S3.</w:t>
+      </w:r>
+    </w:p>
+    <w:p>
+      <w:pPr>
         <w:pStyle w:val="Heading3"/>
         <w:rPr>
           <w:b w:val="1"/>
@@ -3984,7 +4037,7 @@
         <w:jc w:val="both"/>
       </w:pPr>
       <w:r>
-        <w:t xml:space="preserve">The null test also sets the limits of interpretation. It could be run in the three datasets with four control replicates: for every real call the split-control null produced 0.64 calls in iPSC colonies, 2.17 in K562 total RNA and 0.83 in mouse striatum (high-confidence definition; Supplementary Table S14). These ratios are not calibrated false-discovery rates; they are the ratio of two call counts from analyses with different sample sizes and different numbers of tests, but they show that call counts are not interpretable on their own. In the remaining eight comparisons (the two SH-SY5Y doses, the three iPSC-derived motor neuron comparisons, K562 poly(A)+ mRNA, C2C12 and NSC34), the controls could not be split, and positive-control recovery is the only available check. Across the eleven comparisons the burden of high-confidence unannotated splicing changes ranged from 12 to 477 events, and of the three datasets with a null, the one with the largest burden also had the largest null.</w:t>
+        <w:t xml:space="preserve">The null test also sets the limits of interpretation. Under the permissive rule, the null-to-real call ratios were 0.98 in iPSC colonies and 2.01 in K562 total RNA (Supplementary Table S14). The high-confidence null could be run in the three datasets with four control replicates: for every real call the split-control null produced 0.64 calls in iPSC colonies, 2.17 in K562 total RNA and 0.83 in mouse striatum (high-confidence definition; Supplementary Table S14). These ratios are not calibrated false-discovery rates; they are the ratio of two call counts from analyses with different sample sizes and different numbers of tests, but they show that call counts are not interpretable on their own. In the remaining eight comparisons (the two SH-SY5Y doses, the three iPSC-derived motor neuron comparisons, K562 poly(A)+ mRNA, C2C12 and NSC34), the controls could not be split, and positive-control recovery is the only available check. Across the eleven comparisons the burden of high-confidence unannotated splicing changes ranged from 12 to 477 events, and of the three datasets with a null, the one with the largest burden also had the largest null.</w:t>
       </w:r>
     </w:p>
     <w:p>
@@ -4138,130 +4191,130 @@
         <w:t xml:space="preserve"> </w:t>
       </w:r>
       <w:r>
-        <w:t xml:space="preserve">and the SERCA and mitochondrial uptake genes carried none in any comparison. Under the permissive definition, SH-SY5Y additionally showed events in</w:t>
-      </w:r>
-      <w:r>
-        <w:t xml:space="preserve"> </w:t>
+        <w:t xml:space="preserve">and the SERCA and mitochondrial uptake genes carried none in any comparison. Permissive-tier and annotated-site events are detailed in Supplementary Table S7 and Figure S4B.</w:t>
+      </w:r>
+      <w:r>
+        <w:t xml:space="preserve"/>
       </w:r>
       <w:r>
         <w:rPr>
           <w:i/>
           <w:iCs/>
         </w:rPr>
-        <w:t xml:space="preserve">PLCD4</w:t>
-      </w:r>
-      <w:r>
-        <w:t xml:space="preserve"> </w:t>
-      </w:r>
-      <w:r>
-        <w:t xml:space="preserve">and in six genes of the expanded Ca²⁺ panel (</w:t>
+        <w:t xml:space="preserve"/>
+      </w:r>
+      <w:r>
+        <w:t xml:space="preserve"/>
+      </w:r>
+      <w:r>
+        <w:t xml:space="preserve"/>
       </w:r>
       <w:r>
         <w:rPr>
           <w:i/>
           <w:iCs/>
         </w:rPr>
-        <w:t xml:space="preserve">ADCY1</w:t>
-      </w:r>
-      <w:r>
-        <w:t xml:space="preserve">,</w:t>
-      </w:r>
-      <w:r>
-        <w:t xml:space="preserve"> </w:t>
+        <w:t xml:space="preserve"/>
+      </w:r>
+      <w:r>
+        <w:t xml:space="preserve"/>
+      </w:r>
+      <w:r>
+        <w:t xml:space="preserve"/>
       </w:r>
       <w:r>
         <w:rPr>
           <w:i/>
           <w:iCs/>
         </w:rPr>
-        <w:t xml:space="preserve">SYT7</w:t>
-      </w:r>
-      <w:r>
-        <w:t xml:space="preserve">,</w:t>
-      </w:r>
-      <w:r>
-        <w:t xml:space="preserve"> </w:t>
+        <w:t xml:space="preserve"/>
+      </w:r>
+      <w:r>
+        <w:t xml:space="preserve"/>
+      </w:r>
+      <w:r>
+        <w:t xml:space="preserve"/>
       </w:r>
       <w:r>
         <w:rPr>
           <w:i/>
           <w:iCs/>
         </w:rPr>
-        <w:t xml:space="preserve">PDE3B</w:t>
-      </w:r>
-      <w:r>
-        <w:t xml:space="preserve">,</w:t>
-      </w:r>
-      <w:r>
-        <w:t xml:space="preserve"> </w:t>
+        <w:t xml:space="preserve"/>
+      </w:r>
+      <w:r>
+        <w:t xml:space="preserve"/>
+      </w:r>
+      <w:r>
+        <w:t xml:space="preserve"/>
       </w:r>
       <w:r>
         <w:rPr>
           <w:i/>
           <w:iCs/>
         </w:rPr>
-        <w:t xml:space="preserve">AKT3</w:t>
-      </w:r>
-      <w:r>
-        <w:t xml:space="preserve">,</w:t>
-      </w:r>
-      <w:r>
-        <w:t xml:space="preserve"> </w:t>
+        <w:t xml:space="preserve"/>
+      </w:r>
+      <w:r>
+        <w:t xml:space="preserve"/>
+      </w:r>
+      <w:r>
+        <w:t xml:space="preserve"/>
       </w:r>
       <w:r>
         <w:rPr>
           <w:i/>
           <w:iCs/>
         </w:rPr>
-        <w:t xml:space="preserve">PIK3CB</w:t>
-      </w:r>
-      <w:r>
-        <w:t xml:space="preserve">,</w:t>
-      </w:r>
-      <w:r>
-        <w:t xml:space="preserve"> </w:t>
+        <w:t xml:space="preserve"/>
+      </w:r>
+      <w:r>
+        <w:t xml:space="preserve"/>
+      </w:r>
+      <w:r>
+        <w:t xml:space="preserve"/>
       </w:r>
       <w:r>
         <w:rPr>
           <w:i/>
           <w:iCs/>
         </w:rPr>
-        <w:t xml:space="preserve">PPP2R5C</w:t>
-      </w:r>
-      <w:r>
-        <w:t xml:space="preserve">), and novel combinations of annotated splice sites appeared in</w:t>
-      </w:r>
-      <w:r>
-        <w:t xml:space="preserve"> </w:t>
+        <w:t xml:space="preserve"/>
+      </w:r>
+      <w:r>
+        <w:t xml:space="preserve"/>
+      </w:r>
+      <w:r>
+        <w:t xml:space="preserve"/>
       </w:r>
       <w:r>
         <w:rPr>
           <w:i/>
           <w:iCs/>
         </w:rPr>
-        <w:t xml:space="preserve">ATP2A3</w:t>
-      </w:r>
-      <w:r>
-        <w:t xml:space="preserve"> </w:t>
-      </w:r>
-      <w:r>
-        <w:t xml:space="preserve">(both doses, ΔPSI +0.16 and +0.20) and</w:t>
-      </w:r>
-      <w:r>
-        <w:t xml:space="preserve"> </w:t>
+        <w:t xml:space="preserve"/>
+      </w:r>
+      <w:r>
+        <w:t xml:space="preserve"/>
+      </w:r>
+      <w:r>
+        <w:t xml:space="preserve"/>
+      </w:r>
+      <w:r>
+        <w:t xml:space="preserve"/>
       </w:r>
       <w:r>
         <w:rPr>
           <w:i/>
           <w:iCs/>
         </w:rPr>
-        <w:t xml:space="preserve">MCUB</w:t>
-      </w:r>
-      <w:r>
-        <w:t xml:space="preserve"> </w:t>
-      </w:r>
-      <w:r>
-        <w:t xml:space="preserve">(iPSC colonies, +0.27) (Supplementary Figure S4B). Within the coverage, models and calling criteria used here, we did not detect high-confidence unannotated splicing changes in the store-operated entry machinery. This finding does not exclude lower-abundance or context-specific events, but it provides no support for a cryptic-splicing switch as the explanation for the observed SOCE phenotype.</w:t>
+        <w:t xml:space="preserve"/>
+      </w:r>
+      <w:r>
+        <w:t xml:space="preserve"/>
+      </w:r>
+      <w:r>
+        <w:t xml:space="preserve"> Within the coverage, models and calling criteria used here, we did not detect high-confidence unannotated splicing changes in the store-operated entry machinery. This finding does not exclude lower-abundance or context-specific events, but it provides no support for a cryptic-splicing switch as the explanation for the observed SOCE phenotype.</w:t>
       </w:r>
     </w:p>
     <w:p>
@@ -4362,7 +4415,7 @@
         <w:t xml:space="preserve">ORAI2</w:t>
       </w:r>
       <w:r>
-        <w:t xml:space="preserve">, the most abundant ORAI-family gene in the transcript estimates, showed a change of +0.16 (q = 1.9 × 10⁻³) in the mapping-quality-filtered set and +0.15 (q = 0.087) in the unfiltered set; we report it as supported but not established.</w:t>
+        <w:t xml:space="preserve">, the most abundant ORAI-family gene in the transcript estimates, showed a change of +0.16 (q = 1.9 × 10⁻³) in the mapping-quality-filtered set and +0.15 (q = 0.087) in the unfiltered set; the two extraction methods therefore provide unequal support.</w:t>
       </w:r>
     </w:p>
     <w:p>
@@ -4591,7 +4644,7 @@
         <w:jc w:val="both"/>
       </w:pPr>
       <w:r>
-        <w:t xml:space="preserve">In the primary SH-SY5Y model the positive control shifted only moderately: using all six libraries, the</w:t>
+        <w:t xml:space="preserve">Excluding CIGAR reference skips affected this positive control: including them would have changed the STMN2 intron 2 index difference from +0.145 to +0.489. In the primary SH-SY5Y model, the skip-excluded index shifted only moderately: using all six libraries, the</w:t>
       </w:r>
       <w:r>
         <w:t xml:space="preserve"> </w:t>
@@ -5631,21 +5684,6 @@
     <w:bookmarkStart w:id="37" w:name="X5df77ab589002e665ed1956bf6a0a512b2ed6b0"/>
     <w:p>
       <w:pPr>
-        <w:pStyle w:val="Heading3"/>
-        <w:rPr>
-          <w:b w:val="1"/>
-        </w:rPr>
-        <w:jc w:val="left"/>
-      </w:pPr>
-      <w:r>
-        <w:rPr>
-          <w:b/>
-        </w:rPr>
-        <w:t xml:space="preserve">3.10 Exploratory analysis of ALS regional transcript patterns</w:t>
-      </w:r>
-    </w:p>
-    <w:p>
-      <w:pPr>
         <w:pStyle w:val="FirstParagraph"/>
         <w:jc w:val="both"/>
       </w:pPr>
@@ -5997,7 +6035,7 @@
         <w:t xml:space="preserve">CBARP, TRPC1 and junctional regulators. </w:t>
       </w:r>
       <w:r>
-        <w:t xml:space="preserve">CBARP is the strongest recurrent RNA-processing candidate: it was affected in five of six datasets across two species, had a median |ΔPSI| of 0.37 and a median of 246 junction reads per event, was independently supported by the annotation-free analysis and showed the largest expression change among the SOCE-regulatory genes. BARP, the CBARP product, binds CaVβ subunits and suppresses voltage-gated Ca²⁺ channel activity and Ca²⁺-evoked exocytosis </w:t>
+        <w:t xml:space="preserve">CBARP is the strongest recurrent RNA-processing candidate: it was affected in five of six datasets across two species, was independently supported by the annotation-free analysis and showed the largest expression change among the SOCE-regulatory genes (Figure 5). BARP, the CBARP product, binds CaVβ subunits and suppresses voltage-gated Ca²⁺ channel activity and Ca²⁺-evoked exocytosis </w:t>
       </w:r>
       <w:r>
         <w:fldChar w:fldCharType="begin"/>
@@ -6066,7 +6104,7 @@
         <w:fldChar w:fldCharType="end"/>
       </w:r>
       <w:r>
-        <w:t xml:space="preserve">, but the pooled effect was negligible (ΔPSI +0.0013, 95% CI −0.022 to +0.024; p = 0.914). A shared STIM2.1 switch therefore cannot explain the functional decrease. STIMATE is mechanistically attractive because it promotes the conformational transition that activates STIM1 at ER–plasma-membrane junctions </w:t>
+        <w:t xml:space="preserve">, but the pooled effect was negligible (Supplementary Table S15). A shared STIM2.1 switch therefore cannot explain the functional decrease. STIMATE is mechanistically attractive because it promotes the conformational transition that activates STIM1 at ER–plasma-membrane junctions </w:t>
       </w:r>
       <w:r>
         <w:fldChar w:fldCharType="begin"/>
@@ -6099,7 +6137,7 @@
         <w:t xml:space="preserve">Relevance to disease tissue. </w:t>
       </w:r>
       <w:r>
-        <w:t xml:space="preserve">TRPC1 and SARAF increased and CBARP decreased in six of seven ALS brain regions, matching the direction observed in the public SH-SY5Y model. TRPC1 remained unchanged in spinal cord and decreased in the neurological comparison cohorts. Because bulk-tissue expression is sensitive to region and cellular composition, these observations identify disease-associated candidates rather than a direct TDP-43-driven mechanism. Together with the opposing direction of SOCE changes reported in SOD1 astrocytes, these findings indicate that cell identity and compensatory state shape the calcium-regulatory phenotype.</w:t>
+        <w:t xml:space="preserve">TRPC1 and SARAF increased and CBARP decreased in six ALS brain regions, matching the direction observed in the public SH-SY5Y model. TRPC1 remained unchanged in the well-powered cervical and lumbar spinal-cord comparisons and decreased in the neurological comparison cohorts. Among the disease cohorts surveyed, ALS alone showed a significant TRPC1 increase, concentrated in brain regions. Because bulk-tissue expression is sensitive to region and cellular composition, these observations identify disease-associated candidates rather than a direct TDP-43-driven mechanism. Together with the opposing direction of SOCE changes reported in SOD1 astrocytes, these findings indicate that cell identity and compensatory state shape the calcium-regulatory phenotype.</w:t>
       </w:r>
     </w:p>
     <w:p>
@@ -6150,7 +6188,210 @@
         <w:fldChar w:fldCharType="end"/>
       </w:r>
       <w:r>
-        <w:t>. The present findings extend this framework to the plasma-membrane replenishment phase. A coherent model is that TDP-43 loss reduces metabolic and ER-refilling capacity while simultaneously changing the composition and feedback control of the entry machinery; recurrent CBARP processing may add a parallel effect on voltage-gated entry and exocytosis. This model makes discriminating predictions. Correcting ATP2A2 or cellular bioenergetics should improve both ER release and readdition, whereas reducing SARAF or restoring the ORAI balance should preferentially improve the readdition phase. An isoform-specific CBARP perturbation should have a larger effect on depolarization-evoked Ca²⁺ entry or secretion than on CPA-triggered SOCE. These outcomes would distinguish store, channel-composition and broader calcium-network mechanisms and place the functional phenotype within a directly testable neurochemical framework.</w:t>
+        <w:t>. The present findings extend this framework to the plasma-membrane replenishment phase. The working model in Figure 6 is that TDP-43 loss reduces metabolic and ER-refilling capacity while simultaneously changing the composition and feedback control of the entry machinery; recurrent CBARP processing may add a parallel effect on voltage-gated entry and exocytosis. This model makes discriminating predictions. Correcting ATP2A2 or cellular bioenergetics should improve both ER release and readdition, whereas reducing SARAF or restoring the ORAI balance should preferentially improve the readdition phase. An isoform-specific CBARP perturbation should have a larger effect on depolarisation-evoked Ca²⁺ entry or secretion than on CPA-triggered SOCE. These outcomes would distinguish store, channel-composition and broader calcium-network mechanisms and place the functional phenotype within a directly testable neurochemical framework.</w:t>
+      </w:r>
+    </w:p>
+    <w:p>
+      <w:pPr>
+        <w:keepNext/>
+      </w:pPr>
+      <w:r>
+        <w:drawing>
+          <wp:inline>
+            <wp:extent cx="5623560" cy="2903317"/>
+            <wp:docPr id="6" name="Picture 6"/>
+            <wp:cNvGraphicFramePr>
+              <a:graphicFrameLocks noChangeAspect="1"/>
+            </wp:cNvGraphicFramePr>
+            <a:graphic>
+              <a:graphicData uri="http://schemas.openxmlformats.org/drawingml/2006/picture">
+                <pic:pic>
+                  <pic:nvPicPr>
+                    <pic:cNvPr id="0" name="Figure6_working_model.png"/>
+                    <pic:cNvPicPr/>
+                  </pic:nvPicPr>
+                  <pic:blipFill>
+                    <a:blip r:embed="rId14"/>
+                    <a:stretch>
+                      <a:fillRect/>
+                    </a:stretch>
+                  </pic:blipFill>
+                  <pic:spPr>
+                    <a:xfrm>
+                      <a:off x="0" y="0"/>
+                      <a:ext cx="5623560" cy="2903317"/>
+                    </a:xfrm>
+                    <a:prstGeom prst="rect"/>
+                  </pic:spPr>
+                </pic:pic>
+              </a:graphicData>
+            </a:graphic>
+          </wp:inline>
+        </w:drawing>
+      </w:r>
+    </w:p>
+    <w:p>
+      <w:pPr>
+        <w:pStyle w:val="Caption"/>
+      </w:pPr>
+      <w:r>
+        <w:rPr>
+          <w:b/>
+        </w:rPr>
+        <w:t xml:space="preserve">Figure 6. </w:t>
+      </w:r>
+      <w:r>
+        <w:t>Working model of the observed calcium phenotype and candidate RNA changes. The laboratory Fura-2 assay found a smaller readdition amplitude after TARDBP knockdown in SH-SY5Y cells. Public knockdown RNA-seq identified changes in calcium-regulatory transcripts and recurrent CBARP splicing. ATP2A2, ORAI-family composition and SARAF are potential contributors to store filling, entry and feedback; CBARP is placed on a parallel voltage-gated channel branch. Arrows indicate hypotheses for future perturbation, not demonstrated causal links.</w:t>
+      </w:r>
+    </w:p>
+    <w:p>
+      <w:pPr>
+        <w:pStyle w:val="Heading3"/>
+      </w:pPr>
+      <w:r>
+        <w:t>Limitations</w:t>
+      </w:r>
+    </w:p>
+    <w:p>
+      <w:r>
+        <w:t>TARDBP depletion was verified by RT-qPCR but not at the protein level, and one TDP-43-targeting shRNA was used without a rescue experiment. The Fura-2 (n = 3) and 48-h WST-1 (n = 4) results are descriptive. The laboratory assay used undifferentiated SH-SY5Y cells, whereas the public SH-SY5Y RNA-seq study used an inducible model and the motor-neuron datasets did not include matched Ca²⁺ measurements. Cuvette Fura-2 ratios report net cytosolic accumulation and do not separate influx from extrusion or reuptake.</w:t>
+      </w:r>
+    </w:p>
+    <w:p>
+      <w:r>
+        <w:t>Bulk post-mortem expression can reflect cell composition, and age, RNA integrity and post-mortem interval were not modelled as covariates. The NMD dataset confounds TDP-43 status with sequencing batch, so its interaction results are exploratory.</w:t>
+      </w:r>
+    </w:p>
+    <w:bookmarkEnd w:id="39"/>
+    <w:bookmarkStart w:id="40" w:name="conclusion"/>
+    <w:p>
+      <w:pPr>
+        <w:pStyle w:val="Heading2"/>
+        <w:rPr>
+          <w:b w:val="1"/>
+        </w:rPr>
+        <w:jc w:val="left"/>
+      </w:pPr>
+      <w:r>
+        <w:rPr>
+          <w:b w:val="1"/>
+        </w:rPr>
+        <w:t xml:space="preserve">5. Conclusion</w:t>
+      </w:r>
+    </w:p>
+    <w:p>
+      <w:pPr>
+        <w:pStyle w:val="FirstParagraph"/>
+        <w:jc w:val="both"/>
+      </w:pPr>
+      <w:r>
+        <w:t xml:space="preserve">TDP-43 depletion in SH-SY5Y cells was associated with a large reduction in Fura-2-measured SOCE and with altered expression and splicing of calcium-regulatory genes. Transcript-family summaries and reproducible </w:t>
+      </w:r>
+      <w:r>
+        <w:rPr>
+          <w:i/>
+          <w:iCs/>
+        </w:rPr>
+        <w:t xml:space="preserve">CBARP</w:t>
+      </w:r>
+      <w:r>
+        <w:t xml:space="preserve"> splicing identify candidate explanations, but they do not establish protein stoichiometry or a single causal RNA switch. Coverage-based APA and conservative NMD analyses do not provide confirmatory evidence that SOCE-machinery genes are direct targets of those pathways. In ALS tissue, </w:t>
+      </w:r>
+      <w:r>
+        <w:rPr>
+          <w:i/>
+          <w:iCs/>
+        </w:rPr>
+        <w:t xml:space="preserve">TRPC1</w:t>
+      </w:r>
+      <w:r>
+        <w:t xml:space="preserve">, </w:t>
+      </w:r>
+      <w:r>
+        <w:rPr>
+          <w:i/>
+          <w:iCs/>
+        </w:rPr>
+        <w:t xml:space="preserve">SARAF</w:t>
+      </w:r>
+      <w:r>
+        <w:t xml:space="preserve"> and </w:t>
+      </w:r>
+      <w:r>
+        <w:rPr>
+          <w:i/>
+          <w:iCs/>
+        </w:rPr>
+        <w:t xml:space="preserve">CBARP</w:t>
+      </w:r>
+      <w:r>
+        <w:t xml:space="preserve"> showed region-dependent expression differences. </w:t>
+      </w:r>
+      <w:r>
+        <w:rPr>
+          <w:i/>
+          <w:iCs/>
+        </w:rPr>
+        <w:t xml:space="preserve">CBARP</w:t>
+      </w:r>
+      <w:r>
+        <w:t xml:space="preserve">, </w:t>
+      </w:r>
+      <w:r>
+        <w:rPr>
+          <w:i/>
+          <w:iCs/>
+        </w:rPr>
+        <w:t xml:space="preserve">SARAF</w:t>
+      </w:r>
+      <w:r>
+        <w:t xml:space="preserve"> and </w:t>
+      </w:r>
+      <w:r>
+        <w:rPr>
+          <w:i/>
+          <w:iCs/>
+        </w:rPr>
+        <w:t xml:space="preserve">TRPC1</w:t>
+      </w:r>
+      <w:r>
+        <w:t xml:space="preserve"> are therefore priorities for targeted protein-level and functional follow-up.</w:t>
+      </w:r>
+    </w:p>
+    <w:bookmarkEnd w:id="40"/>
+    <w:bookmarkStart w:id="41" w:name="declarations"/>
+    <w:p>
+      <w:pPr>
+        <w:pStyle w:val="Heading2"/>
+        <w:rPr>
+          <w:b w:val="1"/>
+        </w:rPr>
+        <w:jc w:val="left"/>
+      </w:pPr>
+      <w:r>
+        <w:rPr>
+          <w:b w:val="1"/>
+        </w:rPr>
+        <w:t xml:space="preserve">Declarations</w:t>
+      </w:r>
+    </w:p>
+    <w:p>
+      <w:pPr>
+        <w:pStyle w:val="FirstParagraph"/>
+        <w:jc w:val="both"/>
+      </w:pPr>
+      <w:r>
+        <w:rPr>
+          <w:b/>
+          <w:bCs/>
+        </w:rPr>
+        <w:t xml:space="preserve">Ethics approval.</w:t>
+      </w:r>
+      <w:r>
+        <w:t xml:space="preserve"> </w:t>
+      </w:r>
+      <w:r>
+        <w:t xml:space="preserve">No new human or animal material was collected for this study. All RNA-seq datasets are publicly available and were reanalysed under the terms of the repositories that host them. The laboratory experiments used an established cell line (SH-SY5Y) and no human participants or animals. Lentiviral work was carried out under the institutional biosafety rules of Ege University.</w:t>
       </w:r>
     </w:p>
     <w:p>
@@ -6159,139 +6400,17 @@
         <w:jc w:val="both"/>
       </w:pPr>
       <w:r>
-        <w:t xml:space="preserve">The laboratory assay used undifferentiated, proliferative SH-SY5Y cells; the public iPSC-derived motor-neuron datasets extend the RNA comparisons but do not provide a matched functional measurement in motor neurons.</w:t>
-      </w:r>
-    </w:p>
-    <w:bookmarkEnd w:id="39"/>
-    <w:bookmarkStart w:id="40" w:name="conclusion"/>
-    <w:p>
-      <w:pPr>
-        <w:pStyle w:val="Heading2"/>
-        <w:rPr>
-          <w:b w:val="1"/>
-        </w:rPr>
-        <w:jc w:val="left"/>
-      </w:pPr>
-      <w:r>
-        <w:rPr>
-          <w:b w:val="1"/>
-        </w:rPr>
-        <w:t xml:space="preserve">5. Conclusion</w:t>
-      </w:r>
-    </w:p>
-    <w:p>
-      <w:pPr>
-        <w:pStyle w:val="FirstParagraph"/>
-        <w:jc w:val="both"/>
-      </w:pPr>
-      <w:r>
-        <w:t xml:space="preserve">TDP-43 depletion in SH-SY5Y cells was associated with a large reduction in Fura-2-measured SOCE and with altered expression and splicing of calcium-regulatory genes. Transcript-family summaries and reproducible </w:t>
-      </w:r>
-      <w:r>
-        <w:rPr>
-          <w:i/>
-          <w:iCs/>
-        </w:rPr>
-        <w:t xml:space="preserve">CBARP</w:t>
-      </w:r>
-      <w:r>
-        <w:t xml:space="preserve"> splicing identify candidate explanations, but they do not establish protein stoichiometry or a single causal RNA switch. Coverage-based APA and conservative NMD analyses do not provide confirmatory evidence that SOCE-machinery genes are direct targets of those pathways. In ALS tissue, </w:t>
-      </w:r>
-      <w:r>
-        <w:rPr>
-          <w:i/>
-          <w:iCs/>
-        </w:rPr>
-        <w:t xml:space="preserve">TRPC1</w:t>
-      </w:r>
-      <w:r>
-        <w:t xml:space="preserve">, </w:t>
-      </w:r>
-      <w:r>
-        <w:rPr>
-          <w:i/>
-          <w:iCs/>
-        </w:rPr>
-        <w:t xml:space="preserve">SARAF</w:t>
-      </w:r>
-      <w:r>
-        <w:t xml:space="preserve"> and </w:t>
-      </w:r>
-      <w:r>
-        <w:rPr>
-          <w:i/>
-          <w:iCs/>
-        </w:rPr>
-        <w:t xml:space="preserve">CBARP</w:t>
-      </w:r>
-      <w:r>
-        <w:t xml:space="preserve"> showed region-dependent expression differences. </w:t>
-      </w:r>
-      <w:r>
-        <w:rPr>
-          <w:i/>
-          <w:iCs/>
-        </w:rPr>
-        <w:t xml:space="preserve">CBARP</w:t>
-      </w:r>
-      <w:r>
-        <w:t xml:space="preserve">, </w:t>
-      </w:r>
-      <w:r>
-        <w:rPr>
-          <w:i/>
-          <w:iCs/>
-        </w:rPr>
-        <w:t xml:space="preserve">SARAF</w:t>
-      </w:r>
-      <w:r>
-        <w:t xml:space="preserve"> and </w:t>
-      </w:r>
-      <w:r>
-        <w:rPr>
-          <w:i/>
-          <w:iCs/>
-        </w:rPr>
-        <w:t xml:space="preserve">TRPC1</w:t>
-      </w:r>
-      <w:r>
-        <w:t xml:space="preserve"> are therefore priorities for targeted protein-level and functional follow-up.</w:t>
-      </w:r>
-    </w:p>
-    <w:bookmarkEnd w:id="40"/>
-    <w:bookmarkStart w:id="41" w:name="declarations"/>
-    <w:p>
-      <w:pPr>
-        <w:pStyle w:val="Heading2"/>
-        <w:rPr>
-          <w:b w:val="1"/>
-        </w:rPr>
-        <w:jc w:val="left"/>
-      </w:pPr>
-      <w:r>
-        <w:rPr>
-          <w:b w:val="1"/>
-        </w:rPr>
-        <w:t xml:space="preserve">Declarations</w:t>
-      </w:r>
-    </w:p>
-    <w:p>
-      <w:pPr>
-        <w:pStyle w:val="FirstParagraph"/>
-        <w:jc w:val="both"/>
-      </w:pPr>
-      <w:r>
         <w:rPr>
           <w:b/>
           <w:bCs/>
         </w:rPr>
-        <w:t xml:space="preserve">Ethics approval.</w:t>
-      </w:r>
-      <w:r>
-        <w:t xml:space="preserve"> </w:t>
-      </w:r>
-      <w:r>
-        <w:t xml:space="preserve">No new human or animal material was collected for this study. All RNA-seq datasets are publicly available and were reanalysed under the terms of the repositories that host them. The laboratory experiments used an established cell line (SH-SY5Y) and no human participants or animals. Lentiviral work was carried out under the institutional biosafety rules of Ege University.</w:t>
+        <w:t xml:space="preserve">Funding.</w:t>
+      </w:r>
+      <w:r>
+        <w:t xml:space="preserve"> </w:t>
+      </w:r>
+      <w:r>
+        <w:t xml:space="preserve">This work was supported by the Ege University Scientific Research Projects Coordination Unit (BAP), project 31901.</w:t>
       </w:r>
     </w:p>
     <w:p>
@@ -6304,13 +6423,13 @@
           <w:b/>
           <w:bCs/>
         </w:rPr>
-        <w:t xml:space="preserve">Funding.</w:t>
-      </w:r>
-      <w:r>
-        <w:t xml:space="preserve"> </w:t>
-      </w:r>
-      <w:r>
-        <w:t xml:space="preserve">This work was supported by the Ege University Scientific Research Projects Coordination Unit (BAP), project 31901.</w:t>
+        <w:t xml:space="preserve">Author contributions (CRediT).</w:t>
+      </w:r>
+      <w:r>
+        <w:t xml:space="preserve"> </w:t>
+      </w:r>
+      <w:r>
+        <w:t xml:space="preserve">Elmasnur Yılmaz: Investigation, Formal analysis, Software, Visualization, Writing – original draft. Yasemin Eraç: Conceptualization, Methodology, Resources, Funding acquisition, Supervision, Writing – review &amp; editing. Both authors read and approved the final manuscript.</w:t>
       </w:r>
     </w:p>
     <w:p>
@@ -6323,13 +6442,13 @@
           <w:b/>
           <w:bCs/>
         </w:rPr>
-        <w:t xml:space="preserve">Author contributions (CRediT).</w:t>
-      </w:r>
-      <w:r>
-        <w:t xml:space="preserve"> </w:t>
-      </w:r>
-      <w:r>
-        <w:t xml:space="preserve">Elmasnur Yılmaz: Investigation, Formal analysis, Software, Visualization, Writing – original draft. Yasemin Eraç: Conceptualization, Methodology, Resources, Funding acquisition, Supervision, Writing – review &amp; editing. Both authors read and approved the final manuscript.</w:t>
+        <w:t xml:space="preserve">Declaration of competing interests.</w:t>
+      </w:r>
+      <w:r>
+        <w:t xml:space="preserve"> </w:t>
+      </w:r>
+      <w:r>
+        <w:t xml:space="preserve">The authors declare no competing interests.</w:t>
       </w:r>
     </w:p>
     <w:p>
@@ -6342,45 +6461,26 @@
           <w:b/>
           <w:bCs/>
         </w:rPr>
-        <w:t xml:space="preserve">Declaration of competing interests.</w:t>
-      </w:r>
-      <w:r>
-        <w:t xml:space="preserve"> </w:t>
-      </w:r>
-      <w:r>
-        <w:t xml:space="preserve">The authors declare no competing interests.</w:t>
-      </w:r>
-    </w:p>
-    <w:p>
-      <w:pPr>
-        <w:pStyle w:val="BodyText"/>
-        <w:jc w:val="both"/>
-      </w:pPr>
+        <w:t xml:space="preserve">Data availability.</w:t>
+      </w:r>
+      <w:r>
+        <w:t xml:space="preserve"> </w:t>
+      </w:r>
+      <w:r>
+        <w:t xml:space="preserve">All RNA-seq datasets analysed are public and none were generated for this study; accessions are listed in Supplementary Table S17. The publicly accessible analysis package is deposited at</w:t>
+      </w:r>
+      <w:r>
+        <w:t xml:space="preserve"> </w:t>
+      </w:r>
       <w:r>
         <w:rPr>
           <w:b/>
           <w:bCs/>
         </w:rPr>
-        <w:t xml:space="preserve">Data availability.</w:t>
-      </w:r>
-      <w:r>
-        <w:t xml:space="preserve"> </w:t>
-      </w:r>
-      <w:r>
-        <w:t xml:space="preserve">All RNA-seq datasets analysed are public and none were generated for this study; accessions are listed in Supplementary Table S17. The publicly accessible analysis package is deposited at</w:t>
-      </w:r>
-      <w:r>
-        <w:t xml:space="preserve"> </w:t>
-      </w:r>
-      <w:r>
-        <w:rPr>
-          <w:b/>
-          <w:bCs/>
-        </w:rPr>
         <w:t xml:space="preserve">https://github.com/elmasnuryilmaz/tdp43-soce-manuscript</w:t>
       </w:r>
       <w:r>
-        <w:t xml:space="preserve">. It includes scripts in execution order, including the coverage, NMD, transcript-family and donor-level scripts used for the results reported here, the four Ca²⁺ gene panels, per-event count tables, junction and LSV tables, and the code that draws every figure. The versioned submission snapshot is available as GitHub release v1.0.3 at https://github.com/elmasnuryilmaz/tdp43-soce-manuscript/releases/tag/v1.0.3. The complete 23 GB rMATS output is not redistributed; the package provides the thresholded event table and the scripts and public accessions required to regenerate it. The package downloads the two externally hosted resources it needs (the recount3 junction matrix for SRP270799 and the GSE307054 count table) at run time. Every rMATS event that meets the thresholds of Section 2.3, with its event coordinates, form lengths and raw junction counts, is provided as Supplementary Table S3. RT-qPCR, Fura-2 and WST-1 source data, including per-replicate values and the statistics behind every laboratory figure panel, are provided in Supplementary Table S1.</w:t>
+        <w:t xml:space="preserve">. It includes scripts in execution order, including the coverage, NMD, transcript-family and donor-level scripts used for the results reported here, the four Ca²⁺ gene panels, per-event count tables, junction and LSV tables, and the code that draws every figure. The versioned submission snapshot is available as GitHub release v1.0.4 at https://github.com/elmasnuryilmaz/tdp43-soce-manuscript/releases/tag/v1.0.4. The complete 23 GB rMATS output is not redistributed; the package provides the thresholded event table and the scripts and public accessions required to regenerate it. The package downloads the two externally hosted resources it needs (the recount3 junction matrix for SRP270799 and the GSE307054 count table) at run time. Every rMATS event that meets the thresholds of Section 2.3, with its event coordinates, form lengths and raw junction counts, is provided as Supplementary Table S3. RT-qPCR, Fura-2 and WST-1 source data, including per-replicate values and the statistics behind every laboratory figure panel, are provided in Supplementary Table S1.</w:t>
       </w:r>
     </w:p>
     <w:bookmarkEnd w:id="41"/>
@@ -18357,13 +18457,13 @@
           <w:b/>
           <w:bCs/>
         </w:rPr>
-        <w:t xml:space="preserve">Table 3.</w:t>
-      </w:r>
-      <w:r>
-        <w:t xml:space="preserve"> </w:t>
-      </w:r>
-      <w:r>
-        <w:t xml:space="preserve">Robust splicing events in the primary SH-SY5Y model among the twelve SOCE-machinery genes examined event by event (Methods 2.3), with bootstrap confidence intervals; all four are skipped-exon events.</w:t>
+        <w:t xml:space="preserve">Table 3. Splicing events assessed for robustness</w:t>
+      </w:r>
+      <w:r>
+        <w:t xml:space="preserve"/>
+      </w:r>
+      <w:r>
+        <w:t xml:space="preserve"> in the primary SH-SY5Y model among the twelve SOCE-machinery genes examined event by event (Methods 2.3), with bootstrap confidence intervals; all four are skipped-exon events.</w:t>
       </w:r>
       <w:r>
         <w:t xml:space="preserve"> </w:t>
@@ -19785,7 +19885,7 @@
           <w:sz w:val="18"/>
           <w:szCs w:val="18"/>
         </w:rPr>
-        <w:t xml:space="preserve">SH-SY5Y, 0 versus 75 ng/mL doxycycline, three libraries per group. ΔPSI is knockdown minus control from rMATS junction counts; the confidence interval is a replicate-level bootstrap (10,000 resamples). Coordinates are 1-based and inclusive. CI, confidence interval; FDR, false discovery rate; PSI, percent spliced in.</w:t>
+        <w:t xml:space="preserve">SH-SY5Y, 0 versus 75 ng/mL doxycycline, three libraries per group. ΔPSI is knockdown minus control from rMATS junction counts; the confidence interval is a replicate-level bootstrap (10,000 resamples). Coordinates are 1-based and inclusive. The STIM1 interval crosses zero; that event is included for context and is not counted among the three interval-supported events. CI, confidence interval; FDR, false discovery rate; PSI, percent spliced in.</w:t>
       </w:r>
     </w:p>
     <w:p>

</xml_diff>

<commit_message>
Condense the body text and refocus the highlights
- Sections 3.2, 3.5, 3.7, 3.9 and the Discussion lose 296 words of repetition: the same
  caveat stated two or three times, consecutive paragraphs closing on the same
  qualification, and two sentences carrying one fact. No result, number, gene symbol or
  supplementary pointer is dropped.
- The highlight on CBARP splicing is replaced by the paper's own negative finding, that
  no RNA-processing event in the SOCE machinery explained the functional change.
- The Section 3.7 caveat now covers both the STIM1 and the STIM2 unit, so the QA guard
  follows the wider sentence.
</commit_message>
<xml_diff>
--- a/manuscript/MANUSCRIPT_NEUROCHEMISTRY_INTERNATIONAL_FINAL.docx
+++ b/manuscript/MANUSCRIPT_NEUROCHEMISTRY_INTERNATIONAL_FINAL.docx
@@ -2848,312 +2848,208 @@
         <w:jc w:val="both"/>
       </w:pPr>
       <w:r>
-        <w:t xml:space="preserve">In control cells</w:t>
-      </w:r>
-      <w:r>
-        <w:t xml:space="preserve"> </w:t>
+        <w:rPr/>
+        <w:t xml:space="preserve">In control cells </w:t>
       </w:r>
       <w:r>
         <w:rPr>
           <w:i/>
-          <w:iCs/>
-        </w:rPr>
-        <w:t xml:space="preserve">ORAI2</w:t>
-      </w:r>
-      <w:r>
-        <w:t xml:space="preserve"> </w:t>
-      </w:r>
-      <w:r>
-        <w:t xml:space="preserve">and</w:t>
-      </w:r>
-      <w:r>
-        <w:t xml:space="preserve"> </w:t>
+        </w:rPr>
+        <w:t>ORAI2</w:t>
+      </w:r>
+      <w:r>
+        <w:rPr/>
+        <w:t xml:space="preserve"> and </w:t>
       </w:r>
       <w:r>
         <w:rPr>
           <w:i/>
-          <w:iCs/>
-        </w:rPr>
-        <w:t xml:space="preserve">ATP2A2</w:t>
-      </w:r>
-      <w:r>
-        <w:t xml:space="preserve"> </w:t>
-      </w:r>
-      <w:r>
-        <w:t xml:space="preserve">are the dominant members of their families (77% and 98% of the family total), whereas</w:t>
-      </w:r>
-      <w:r>
-        <w:t xml:space="preserve"> </w:t>
+        </w:rPr>
+        <w:t>ATP2A2</w:t>
+      </w:r>
+      <w:r>
+        <w:rPr/>
+        <w:t xml:space="preserve"> are the dominant members of their families (77% and 98% of the family total), whereas </w:t>
       </w:r>
       <w:r>
         <w:rPr>
           <w:i/>
-          <w:iCs/>
-        </w:rPr>
-        <w:t xml:space="preserve">ORAI1</w:t>
-      </w:r>
-      <w:r>
-        <w:t xml:space="preserve"> </w:t>
-      </w:r>
-      <w:r>
-        <w:t xml:space="preserve">and</w:t>
-      </w:r>
-      <w:r>
-        <w:t xml:space="preserve"> </w:t>
+        </w:rPr>
+        <w:t>ORAI1</w:t>
+      </w:r>
+      <w:r>
+        <w:rPr/>
+        <w:t xml:space="preserve"> and </w:t>
       </w:r>
       <w:r>
         <w:rPr>
           <w:i/>
-          <w:iCs/>
-        </w:rPr>
-        <w:t xml:space="preserve">ATP2A3</w:t>
-      </w:r>
-      <w:r>
-        <w:t xml:space="preserve"> </w:t>
-      </w:r>
-      <w:r>
-        <w:t xml:space="preserve">are minor members (15% and 1.5%);</w:t>
-      </w:r>
-      <w:r>
-        <w:t xml:space="preserve"> </w:t>
+        </w:rPr>
+        <w:t>ATP2A3</w:t>
+      </w:r>
+      <w:r>
+        <w:rPr/>
+        <w:t xml:space="preserve"> are minor members (15% and 1.5%); </w:t>
       </w:r>
       <w:r>
         <w:rPr>
           <w:i/>
-          <w:iCs/>
-        </w:rPr>
-        <w:t xml:space="preserve">STIM1</w:t>
-      </w:r>
-      <w:r>
-        <w:t xml:space="preserve"> </w:t>
-      </w:r>
-      <w:r>
-        <w:t xml:space="preserve">and</w:t>
-      </w:r>
-      <w:r>
-        <w:t xml:space="preserve"> </w:t>
+        </w:rPr>
+        <w:t>STIM1</w:t>
+      </w:r>
+      <w:r>
+        <w:rPr/>
+        <w:t xml:space="preserve"> and </w:t>
       </w:r>
       <w:r>
         <w:rPr>
           <w:i/>
-          <w:iCs/>
-        </w:rPr>
-        <w:t xml:space="preserve">TRPC1</w:t>
-      </w:r>
-      <w:r>
-        <w:t xml:space="preserve"> </w:t>
-      </w:r>
-      <w:r>
-        <w:t xml:space="preserve">dominate their families (64% and 98%), and</w:t>
-      </w:r>
-      <w:r>
-        <w:t xml:space="preserve"> </w:t>
+        </w:rPr>
+        <w:t>TRPC1</w:t>
+      </w:r>
+      <w:r>
+        <w:rPr/>
+        <w:t xml:space="preserve"> dominate their families (64% and 98%), and </w:t>
       </w:r>
       <w:r>
         <w:rPr>
           <w:i/>
-          <w:iCs/>
-        </w:rPr>
-        <w:t xml:space="preserve">SARAF</w:t>
-      </w:r>
-      <w:r>
-        <w:t xml:space="preserve"> </w:t>
-      </w:r>
-      <w:r>
-        <w:t xml:space="preserve">accounts for 82% of the SOCE-regulator pool. In knockdown the dominant</w:t>
-      </w:r>
-      <w:r>
-        <w:t xml:space="preserve"> </w:t>
+        </w:rPr>
+        <w:t>SARAF</w:t>
+      </w:r>
+      <w:r>
+        <w:rPr/>
+        <w:t xml:space="preserve"> accounts for 82% of the SOCE-regulator pool. In knockdown the dominant </w:t>
       </w:r>
       <w:r>
         <w:rPr>
           <w:i/>
-          <w:iCs/>
-        </w:rPr>
-        <w:t xml:space="preserve">ORAI2</w:t>
-      </w:r>
-      <w:r>
-        <w:t xml:space="preserve"> </w:t>
-      </w:r>
-      <w:r>
-        <w:t xml:space="preserve">and</w:t>
-      </w:r>
-      <w:r>
-        <w:t xml:space="preserve"> </w:t>
+        </w:rPr>
+        <w:t>ORAI2</w:t>
+      </w:r>
+      <w:r>
+        <w:rPr/>
+        <w:t xml:space="preserve"> and </w:t>
       </w:r>
       <w:r>
         <w:rPr>
           <w:i/>
-          <w:iCs/>
-        </w:rPr>
-        <w:t xml:space="preserve">ATP2A2</w:t>
-      </w:r>
-      <w:r>
-        <w:t xml:space="preserve"> </w:t>
-      </w:r>
-      <w:r>
-        <w:t xml:space="preserve">transcripts fell modestly (DESeq2 log2FC −0.17 and −0.25; p_adj = 2.2 × 10⁻³ and 8.7 × 10⁻⁹), while</w:t>
-      </w:r>
-      <w:r>
-        <w:t xml:space="preserve"> </w:t>
+        </w:rPr>
+        <w:t>ATP2A2</w:t>
+      </w:r>
+      <w:r>
+        <w:rPr/>
+        <w:t xml:space="preserve"> transcripts fell modestly (DESeq2 log2FC −0.17 and −0.25; p_adj = 2.2 × 10⁻³ and 8.7 × 10⁻⁹), while </w:t>
       </w:r>
       <w:r>
         <w:rPr>
           <w:i/>
-          <w:iCs/>
-        </w:rPr>
-        <w:t xml:space="preserve">ORAI1</w:t>
-      </w:r>
-      <w:r>
-        <w:t xml:space="preserve">,</w:t>
-      </w:r>
-      <w:r>
-        <w:t xml:space="preserve"> </w:t>
+        </w:rPr>
+        <w:t>ORAI1</w:t>
+      </w:r>
+      <w:r>
+        <w:rPr/>
+        <w:t xml:space="preserve">, </w:t>
       </w:r>
       <w:r>
         <w:rPr>
           <w:i/>
-          <w:iCs/>
-        </w:rPr>
-        <w:t xml:space="preserve">ATP2A3</w:t>
-      </w:r>
-      <w:r>
-        <w:t xml:space="preserve">,</w:t>
-      </w:r>
-      <w:r>
-        <w:t xml:space="preserve"> </w:t>
+        </w:rPr>
+        <w:t>ATP2A3</w:t>
+      </w:r>
+      <w:r>
+        <w:rPr/>
+        <w:t xml:space="preserve">, </w:t>
       </w:r>
       <w:r>
         <w:rPr>
           <w:i/>
-          <w:iCs/>
-        </w:rPr>
-        <w:t xml:space="preserve">STIM1</w:t>
-      </w:r>
-      <w:r>
-        <w:t xml:space="preserve">,</w:t>
-      </w:r>
-      <w:r>
-        <w:t xml:space="preserve"> </w:t>
+        </w:rPr>
+        <w:t>STIM1</w:t>
+      </w:r>
+      <w:r>
+        <w:rPr/>
+        <w:t xml:space="preserve">, </w:t>
       </w:r>
       <w:r>
         <w:rPr>
           <w:i/>
-          <w:iCs/>
-        </w:rPr>
-        <w:t xml:space="preserve">TRPC1</w:t>
-      </w:r>
-      <w:r>
-        <w:t xml:space="preserve"> </w:t>
-      </w:r>
-      <w:r>
-        <w:t xml:space="preserve">and</w:t>
-      </w:r>
-      <w:r>
-        <w:t xml:space="preserve"> </w:t>
+        </w:rPr>
+        <w:t>TRPC1</w:t>
+      </w:r>
+      <w:r>
+        <w:rPr/>
+        <w:t xml:space="preserve"> and </w:t>
       </w:r>
       <w:r>
         <w:rPr>
           <w:i/>
-          <w:iCs/>
-        </w:rPr>
-        <w:t xml:space="preserve">SARAF</w:t>
-      </w:r>
-      <w:r>
-        <w:t xml:space="preserve"> </w:t>
-      </w:r>
-      <w:r>
-        <w:t xml:space="preserve">rose and</w:t>
-      </w:r>
-      <w:r>
-        <w:t xml:space="preserve"> </w:t>
+        </w:rPr>
+        <w:t>SARAF</w:t>
+      </w:r>
+      <w:r>
+        <w:rPr/>
+        <w:t xml:space="preserve"> rose and </w:t>
       </w:r>
       <w:r>
         <w:rPr>
           <w:i/>
-          <w:iCs/>
-        </w:rPr>
-        <w:t xml:space="preserve">ORAI3</w:t>
-      </w:r>
-      <w:r>
-        <w:t xml:space="preserve"> </w:t>
-      </w:r>
-      <w:r>
-        <w:t xml:space="preserve">rose about fivefold in adjusted TPM (DESeq2 log2FC 2.06; p_adj = 2.3 × 10⁻⁶⁴). At family level the ORAI pool therefore grew (+27%) and changed in composition:</w:t>
-      </w:r>
-      <w:r>
-        <w:t xml:space="preserve"> </w:t>
+        </w:rPr>
+        <w:t>ORAI3</w:t>
+      </w:r>
+      <w:r>
+        <w:rPr/>
+        <w:t xml:space="preserve"> rose about fivefold in adjusted TPM (DESeq2 log2FC 2.06; p_adj = 2.3 × 10⁻⁶⁴). At family level the ORAI pool therefore grew (+27%) and changed in composition: </w:t>
       </w:r>
       <w:r>
         <w:rPr>
           <w:i/>
-          <w:iCs/>
-        </w:rPr>
-        <w:t xml:space="preserve">ORAI3</w:t>
-      </w:r>
-      <w:r>
-        <w:t xml:space="preserve"> </w:t>
-      </w:r>
-      <w:r>
-        <w:t xml:space="preserve">went from 8% to 30% of ORAI transcripts and</w:t>
-      </w:r>
-      <w:r>
-        <w:t xml:space="preserve"> </w:t>
+        </w:rPr>
+        <w:t>ORAI3</w:t>
+      </w:r>
+      <w:r>
+        <w:rPr/>
+        <w:t xml:space="preserve"> went from 8% to 30% of ORAI transcripts and </w:t>
       </w:r>
       <w:r>
         <w:rPr>
           <w:i/>
-          <w:iCs/>
-        </w:rPr>
-        <w:t xml:space="preserve">ORAI2</w:t>
-      </w:r>
-      <w:r>
-        <w:t xml:space="preserve"> </w:t>
-      </w:r>
-      <w:r>
-        <w:t xml:space="preserve">from 77% to 53%. The STIM (+48%) and SOCE-regulator (+30%) pools also rose, whereas the SERCA and mitochondrial-uptake pools fell (−12% and −25%), the latter mainly through</w:t>
-      </w:r>
-      <w:r>
-        <w:t xml:space="preserve"> </w:t>
+        </w:rPr>
+        <w:t>ORAI2</w:t>
+      </w:r>
+      <w:r>
+        <w:rPr/>
+        <w:t xml:space="preserve"> from 77% to 53%. The STIM (+48%) and SOCE-regulator (+30%) pools also rose, whereas the SERCA and mitochondrial-uptake pools fell (−12% and −25%), the latter mainly through </w:t>
       </w:r>
       <w:r>
         <w:rPr>
           <w:i/>
-          <w:iCs/>
-        </w:rPr>
-        <w:t xml:space="preserve">MCU</w:t>
-      </w:r>
-      <w:r>
-        <w:t xml:space="preserve">,</w:t>
-      </w:r>
-      <w:r>
-        <w:t xml:space="preserve"> </w:t>
+        </w:rPr>
+        <w:t>MCU</w:t>
+      </w:r>
+      <w:r>
+        <w:rPr/>
+        <w:t xml:space="preserve">, </w:t>
       </w:r>
       <w:r>
         <w:rPr>
           <w:i/>
-          <w:iCs/>
-        </w:rPr>
-        <w:t xml:space="preserve">MICU2</w:t>
-      </w:r>
-      <w:r>
-        <w:t xml:space="preserve"> </w:t>
-      </w:r>
-      <w:r>
-        <w:t xml:space="preserve">and</w:t>
-      </w:r>
-      <w:r>
-        <w:t xml:space="preserve"> </w:t>
+        </w:rPr>
+        <w:t>MICU2</w:t>
+      </w:r>
+      <w:r>
+        <w:rPr/>
+        <w:t xml:space="preserve"> and </w:t>
       </w:r>
       <w:r>
         <w:rPr>
           <w:i/>
-          <w:iCs/>
-        </w:rPr>
-        <w:t xml:space="preserve">MCUB</w:t>
-      </w:r>
-      <w:r>
-        <w:t xml:space="preserve">. These are descriptive summaries of transcript abundance and cannot be converted directly into protein-complex stoichiometry.</w:t>
+        </w:rPr>
+        <w:t>MCUB</w:t>
+      </w:r>
+      <w:r>
+        <w:rPr/>
+        <w:t>.</w:t>
       </w:r>
     </w:p>
     <w:p>
@@ -3764,7 +3660,8 @@
         <w:jc w:val="both"/>
       </w:pPr>
       <w:r>
-        <w:t xml:space="preserve">rMATS and LeafCutter both constrain what can be found: the first by the event classes and annotation it works from, the second by clustering rules that discard sparse junctions. To remove those constraints we extracted splice junctions directly from the alignments and tested local splicing variations with a beta-binomial model, across eleven comparisons; the primary SH-SY5Y comparison was additionally repeated on a second, independently produced junction set (Methods 2.5).</w:t>
+        <w:rPr/>
+        <w:t>rMATS and LeafCutter both constrain what can be found, the first by the event classes and annotation it works from, the second by clustering rules that discard sparse junctions. To remove those constraints we extracted splice junctions directly from the alignments and tested local splicing variations with a beta-binomial model across eleven comparisons, repeating the primary SH-SY5Y comparison on a second, independently produced junction set (Methods 2.5).</w:t>
       </w:r>
     </w:p>
     <w:p>
@@ -3989,46 +3886,28 @@
         <w:jc w:val="both"/>
       </w:pPr>
       <w:r>
-        <w:t xml:space="preserve">Specificity was tested by running the same analysis on FUS and TAF15 knockdown in the same iPSC-derived motor neurons, at the same depth and with the same design (Supplementary Figure S4C). Under the permissive definition the three comparisons produced call counts of the same order (141 for TDP-43, 124 for FUS and 126 for TAF15); TDP-43 knockdown recovered two of the sixteen positive-control genes (</w:t>
+        <w:rPr/>
+        <w:t>Specificity was tested by running the same analysis on FUS and TAF15 knockdown in the same iPSC-derived motor neurons, at the same depth and with the same design (Supplementary Figure S4C). Under the permissive definition the three comparisons produced call counts of the same order (141 for TDP-43, 124 for FUS and 126 for TAF15), but only TDP-43 knockdown recovered positive controls, two of the sixteen (</w:t>
       </w:r>
       <w:r>
         <w:rPr>
           <w:i/>
-          <w:iCs/>
-        </w:rPr>
-        <w:t xml:space="preserve">STMN2</w:t>
-      </w:r>
-      <w:r>
-        <w:t xml:space="preserve"> </w:t>
-      </w:r>
-      <w:r>
-        <w:t xml:space="preserve">and</w:t>
-      </w:r>
-      <w:r>
-        <w:t xml:space="preserve"> </w:t>
+        </w:rPr>
+        <w:t>STMN2</w:t>
+      </w:r>
+      <w:r>
+        <w:rPr/>
+        <w:t xml:space="preserve"> and </w:t>
       </w:r>
       <w:r>
         <w:rPr>
           <w:i/>
-          <w:iCs/>
-        </w:rPr>
-        <w:t xml:space="preserve">KALRN</w:t>
-      </w:r>
-      <w:r>
-        <w:t xml:space="preserve">) and FUS and TAF15 knockdown recovered</w:t>
-      </w:r>
-      <w:r>
-        <w:t xml:space="preserve"> </w:t>
-      </w:r>
-      <w:r>
-        <w:rPr>
-          <w:b/>
-          <w:bCs/>
-        </w:rPr>
-        <w:t xml:space="preserve">none</w:t>
-      </w:r>
-      <w:r>
-        <w:t xml:space="preserve">. This dataset is too shallow for the high-confidence threshold to recover a positive control in any of the three comparisons (18, 26 and 23 events, none of them a control gene), so the within-dataset contrast rests on the permissive definition. Two controls against none is not by itself a significant difference (Fisher's exact test p = 0.48), so the specificity of the procedure rests on the deeper comparisons, in which the same permissive analysis recovered thirteen of sixteen positive controls in SH-SY5Y and fifteen in iPSC colonies. The background call rate is therefore not specific to TDP-43, whereas the genes the analysis identifies are.</w:t>
+        </w:rPr>
+        <w:t>KALRN</w:t>
+      </w:r>
+      <w:r>
+        <w:rPr/>
+        <w:t>). This dataset is too shallow for the high-confidence threshold to recover a control in any of the three comparisons (18, 26 and 23 events, none of them a control gene), and two controls against none is not by itself a significant difference (Fisher’s exact test p = 0.48), so the specificity of the procedure rests on the deeper comparisons, in which the same permissive analysis recovered thirteen of sixteen positive controls in SH-SY5Y and fifteen in iPSC colonies. The background call rate is therefore not specific to TDP-43, whereas the genes the analysis identifies are.</w:t>
       </w:r>
     </w:p>
     <w:p>
@@ -4037,7 +3916,8 @@
         <w:jc w:val="both"/>
       </w:pPr>
       <w:r>
-        <w:t xml:space="preserve">The null test also sets the limits of interpretation. Under the permissive rule, the null-to-real call ratios were 0.98 in iPSC colonies and 2.01 in K562 total RNA (Supplementary Table S14). The high-confidence null could be run in the three datasets with four control replicates: for every real call the split-control null produced 0.64 calls in iPSC colonies, 2.17 in K562 total RNA and 0.83 in mouse striatum (high-confidence definition; Supplementary Table S14). These ratios are not calibrated false-discovery rates; they are the ratio of two call counts from analyses with different sample sizes and different numbers of tests, but they show that call counts are not interpretable on their own. In the remaining eight comparisons (the two SH-SY5Y doses, the three iPSC-derived motor neuron comparisons, K562 poly(A)+ mRNA, C2C12 and NSC34), the controls could not be split, and positive-control recovery is the only available check. Across the eleven comparisons the burden of high-confidence unannotated splicing changes ranged from 12 to 477 events, and of the three datasets with a null, the one with the largest burden also had the largest null.</w:t>
+        <w:rPr/>
+        <w:t>The null test also sets the limits of interpretation. Under the permissive rule, the null-to-real call ratios were 0.98 in iPSC colonies and 2.01 in K562 total RNA (Supplementary Table S14). The high-confidence null could be run in the three datasets with four control replicates: for every real call the split-control null produced 0.64 calls in iPSC colonies, 2.17 in K562 total RNA and 0.83 in mouse striatum (Supplementary Table S14). These ratios are not calibrated false-discovery rates, because the two analyses differ in sample size and in the number of tests, but they show that call counts are not interpretable on their own. In the remaining eight comparisons the controls could not be split, and positive-control recovery is the only available check. Across the eleven comparisons the burden of high-confidence unannotated splicing changes ranged from 12 to 477 events, and of the three datasets with a null, the one with the largest burden also had the largest null.</w:t>
       </w:r>
     </w:p>
     <w:p>
@@ -4046,275 +3926,98 @@
         <w:jc w:val="both"/>
       </w:pPr>
       <w:r>
-        <w:t xml:space="preserve">Applied to the Ca²⁺ panels, the analysis returned an almost complete negative (Supplementary Table S7).</w:t>
-      </w:r>
-      <w:r>
-        <w:t xml:space="preserve"> </w:t>
-      </w:r>
-      <w:r>
-        <w:rPr>
-          <w:b/>
-          <w:bCs/>
-        </w:rPr>
-        <w:t xml:space="preserve">No gene of the core SOCE/TRP panel (Tier 1, n = 51) carried a high-confidence unannotated splicing change in any comparison except iPSC colonies.</w:t>
-      </w:r>
-      <w:r>
-        <w:t xml:space="preserve"> </w:t>
-      </w:r>
-      <w:r>
-        <w:t xml:space="preserve">The negative is informative where the analysis demonstrably worked: in SH-SY5Y at both doses and in K562 poly(A)+ mRNA, where positive controls were recovered at the high-confidence threshold, and less strongly in the TDP-43 knockdown of iPSC-derived motor neurons, where two were recovered under the permissive definition only. In K562 total RNA no positive control was recovered, and the three mouse comparisons have no conserved control, so the absence of calls there carries little information. The single exception was iPSC colonies, where</w:t>
-      </w:r>
-      <w:r>
-        <w:t xml:space="preserve"> </w:t>
+        <w:rPr/>
+        <w:t xml:space="preserve">Applied to the Ca²⁺ panels, the analysis returned an almost complete negative (Supplementary Table S7). The negative is informative where the analysis demonstrably worked: in SH-SY5Y at both doses and in K562 poly(A)+ mRNA, where positive controls were recovered at the high-confidence threshold, and less strongly in the TDP-43 knockdown of iPSC-derived motor neurons, where two were recovered under the permissive definition only. In K562 total RNA no positive control was recovered, and the three mouse comparisons have no conserved control, so the absence of calls there carries little information. Within the coverage, models and calling criteria used here, the only high-confidence unannotated change anywhere in the SOCE panel was the </w:t>
       </w:r>
       <w:r>
         <w:rPr>
           <w:i/>
-          <w:iCs/>
-        </w:rPr>
-        <w:t xml:space="preserve">CBARP</w:t>
-      </w:r>
-      <w:r>
-        <w:t xml:space="preserve"> </w:t>
-      </w:r>
-      <w:r>
-        <w:t xml:space="preserve">and</w:t>
-      </w:r>
-      <w:r>
-        <w:t xml:space="preserve"> </w:t>
+        </w:rPr>
+        <w:t>CBARP</w:t>
+      </w:r>
+      <w:r>
+        <w:rPr/>
+        <w:t xml:space="preserve"> junction in iPSC colonies, called there together with </w:t>
       </w:r>
       <w:r>
         <w:rPr>
           <w:i/>
-          <w:iCs/>
-        </w:rPr>
-        <w:t xml:space="preserve">TRPM3</w:t>
-      </w:r>
-      <w:r>
-        <w:t xml:space="preserve"> </w:t>
-      </w:r>
-      <w:r>
-        <w:t xml:space="preserve">were called. This was the dataset whose null test produced 0.64 calls for every real call, so a lone call there is not evidence, although the</w:t>
-      </w:r>
-      <w:r>
-        <w:t xml:space="preserve"> </w:t>
+        </w:rPr>
+        <w:t>TRPM3</w:t>
+      </w:r>
+      <w:r>
+        <w:rPr/>
+        <w:t xml:space="preserve">; </w:t>
       </w:r>
       <w:r>
         <w:rPr>
           <w:i/>
-          <w:iCs/>
-        </w:rPr>
-        <w:t xml:space="preserve">CBARP</w:t>
-      </w:r>
-      <w:r>
-        <w:t xml:space="preserve"> </w:t>
-      </w:r>
-      <w:r>
-        <w:t xml:space="preserve">junction is corroborated elsewhere (below).</w:t>
-      </w:r>
-      <w:r>
-        <w:t xml:space="preserve"> </w:t>
+        </w:rPr>
+        <w:t>STIM1</w:t>
+      </w:r>
+      <w:r>
+        <w:rPr/>
+        <w:t xml:space="preserve">, </w:t>
       </w:r>
       <w:r>
         <w:rPr>
           <w:i/>
-          <w:iCs/>
-        </w:rPr>
-        <w:t xml:space="preserve">STIM1</w:t>
-      </w:r>
-      <w:r>
-        <w:t xml:space="preserve">,</w:t>
-      </w:r>
-      <w:r>
-        <w:t xml:space="preserve"> </w:t>
+        </w:rPr>
+        <w:t>STIM2</w:t>
+      </w:r>
+      <w:r>
+        <w:rPr/>
+        <w:t xml:space="preserve">, </w:t>
       </w:r>
       <w:r>
         <w:rPr>
           <w:i/>
-          <w:iCs/>
-        </w:rPr>
-        <w:t xml:space="preserve">STIM2</w:t>
-      </w:r>
-      <w:r>
-        <w:t xml:space="preserve">,</w:t>
-      </w:r>
-      <w:r>
-        <w:t xml:space="preserve"> </w:t>
+        </w:rPr>
+        <w:t>ORAI1</w:t>
+      </w:r>
+      <w:r>
+        <w:rPr/>
+        <w:t xml:space="preserve">–3, </w:t>
       </w:r>
       <w:r>
         <w:rPr>
           <w:i/>
-          <w:iCs/>
-        </w:rPr>
-        <w:t xml:space="preserve">ORAI1–3</w:t>
-      </w:r>
-      <w:r>
-        <w:t xml:space="preserve">,</w:t>
-      </w:r>
-      <w:r>
-        <w:t xml:space="preserve"> </w:t>
+        </w:rPr>
+        <w:t>TRPC1</w:t>
+      </w:r>
+      <w:r>
+        <w:rPr/>
+        <w:t xml:space="preserve">, </w:t>
       </w:r>
       <w:r>
         <w:rPr>
           <w:i/>
-          <w:iCs/>
-        </w:rPr>
-        <w:t xml:space="preserve">TRPC1</w:t>
-      </w:r>
-      <w:r>
-        <w:t xml:space="preserve">,</w:t>
-      </w:r>
-      <w:r>
-        <w:t xml:space="preserve"> </w:t>
+        </w:rPr>
+        <w:t>SARAF</w:t>
+      </w:r>
+      <w:r>
+        <w:rPr/>
+        <w:t xml:space="preserve">, </w:t>
       </w:r>
       <w:r>
         <w:rPr>
           <w:i/>
-          <w:iCs/>
-        </w:rPr>
-        <w:t xml:space="preserve">SARAF</w:t>
-      </w:r>
-      <w:r>
-        <w:t xml:space="preserve">,</w:t>
-      </w:r>
-      <w:r>
-        <w:t xml:space="preserve"> </w:t>
+        </w:rPr>
+        <w:t>STIMATE</w:t>
+      </w:r>
+      <w:r>
+        <w:rPr/>
+        <w:t xml:space="preserve"> and the SERCA and mitochondrial uptake genes carried none in any comparison. That single call comes from the dataset whose null test produced 0.64 calls for every real call, so it is not evidence on its own, although the </w:t>
       </w:r>
       <w:r>
         <w:rPr>
           <w:i/>
-          <w:iCs/>
-        </w:rPr>
-        <w:t xml:space="preserve">STIMATE</w:t>
-      </w:r>
-      <w:r>
-        <w:t xml:space="preserve"> </w:t>
-      </w:r>
-      <w:r>
-        <w:t xml:space="preserve">and the SERCA and mitochondrial uptake genes carried none in any comparison. Permissive-tier and annotated-site events are detailed in Supplementary Table S7 and Figure S4B.</w:t>
-      </w:r>
-      <w:r>
-        <w:t xml:space="preserve"/>
-      </w:r>
-      <w:r>
-        <w:rPr>
-          <w:i/>
-          <w:iCs/>
-        </w:rPr>
-        <w:t xml:space="preserve"/>
-      </w:r>
-      <w:r>
-        <w:t xml:space="preserve"/>
-      </w:r>
-      <w:r>
-        <w:t xml:space="preserve"/>
-      </w:r>
-      <w:r>
-        <w:rPr>
-          <w:i/>
-          <w:iCs/>
-        </w:rPr>
-        <w:t xml:space="preserve"/>
-      </w:r>
-      <w:r>
-        <w:t xml:space="preserve"/>
-      </w:r>
-      <w:r>
-        <w:t xml:space="preserve"/>
-      </w:r>
-      <w:r>
-        <w:rPr>
-          <w:i/>
-          <w:iCs/>
-        </w:rPr>
-        <w:t xml:space="preserve"/>
-      </w:r>
-      <w:r>
-        <w:t xml:space="preserve"/>
-      </w:r>
-      <w:r>
-        <w:t xml:space="preserve"/>
-      </w:r>
-      <w:r>
-        <w:rPr>
-          <w:i/>
-          <w:iCs/>
-        </w:rPr>
-        <w:t xml:space="preserve"/>
-      </w:r>
-      <w:r>
-        <w:t xml:space="preserve"/>
-      </w:r>
-      <w:r>
-        <w:t xml:space="preserve"/>
-      </w:r>
-      <w:r>
-        <w:rPr>
-          <w:i/>
-          <w:iCs/>
-        </w:rPr>
-        <w:t xml:space="preserve"/>
-      </w:r>
-      <w:r>
-        <w:t xml:space="preserve"/>
-      </w:r>
-      <w:r>
-        <w:t xml:space="preserve"/>
-      </w:r>
-      <w:r>
-        <w:rPr>
-          <w:i/>
-          <w:iCs/>
-        </w:rPr>
-        <w:t xml:space="preserve"/>
-      </w:r>
-      <w:r>
-        <w:t xml:space="preserve"/>
-      </w:r>
-      <w:r>
-        <w:t xml:space="preserve"/>
-      </w:r>
-      <w:r>
-        <w:rPr>
-          <w:i/>
-          <w:iCs/>
-        </w:rPr>
-        <w:t xml:space="preserve"/>
-      </w:r>
-      <w:r>
-        <w:t xml:space="preserve"/>
-      </w:r>
-      <w:r>
-        <w:t xml:space="preserve"/>
-      </w:r>
-      <w:r>
-        <w:rPr>
-          <w:i/>
-          <w:iCs/>
-        </w:rPr>
-        <w:t xml:space="preserve"/>
-      </w:r>
-      <w:r>
-        <w:t xml:space="preserve"/>
-      </w:r>
-      <w:r>
-        <w:t xml:space="preserve"/>
-      </w:r>
-      <w:r>
-        <w:t xml:space="preserve"/>
-      </w:r>
-      <w:r>
-        <w:rPr>
-          <w:i/>
-          <w:iCs/>
-        </w:rPr>
-        <w:t xml:space="preserve"/>
-      </w:r>
-      <w:r>
-        <w:t xml:space="preserve"/>
-      </w:r>
-      <w:r>
-        <w:t xml:space="preserve"> Within the coverage, models and calling criteria used here, the only high-confidence unannotated change anywhere in the SOCE panel was the CBARP junction in iPSC colonies, and none of the core entry components carried one in any comparison. This finding does not exclude lower-abundance or context-specific events, but it provides no support for a cryptic-splicing switch as the explanation for the observed SOCE phenotype.</w:t>
+        </w:rPr>
+        <w:t>CBARP</w:t>
+      </w:r>
+      <w:r>
+        <w:rPr/>
+        <w:t xml:space="preserve"> junction is corroborated below. Permissive-tier and annotated-site events are detailed in Supplementary Table S7 and Figure S4B. This finding does not exclude lower-abundance or context-specific events, but it provides no support for a cryptic-splicing switch as the explanation for the observed SOCE phenotype.</w:t>
       </w:r>
     </w:p>
     <w:p>
@@ -4442,7 +4145,7 @@
         <w:fldChar w:fldCharType="end"/>
       </w:r>
       <w:r>
-        <w:t>, so increased inclusion upon TDP-43 loss would be a simple route to reduced entry. Measured as an rMATS event, inclusion of the exon was higher in knockdown in five of six datasets, but the fixed-effect meta-analysis estimate was negligible (pooled ΔPSI +0.0013, 95% CI −0.022 to +0.024; p = 0.914; Figure 4B; Supplementary Table S15). The three mouse datasets carry 86% of the weight, but the human datasets alone give the same answer (+0.031, 95% CI −0.030 to +0.091; p = 0.32), and the estimates are not heterogeneous (Cochran’s Q = 4.84, 5 df, p = 0.44; I² = 0%). At junction level, inclusion of the SOAR exon (chr4:27,007,983–27,008,006) was positive in direction in all five TDP-43 comparisons in which it was measurable, but the effect was small and inconsistent. ΔPSI was +0.149 in SH-SY5Y at 75 ng/mL (q = 0.033, 20 versus 3 reads), +0.116 at 25 ng/mL (q = 0.14) and +0.020 in iPSC colonies (q = 0.82), the best-powered comparison with 441 versus 281 reads (Supplementary Table S13). The junction-level estimate is larger than the rMATS estimate for the same exon in the same libraries (+0.149 versus +0.059; Supplementary Table S15) because the two are not the same quantity. rMATS combines both flanking junctions and normalises by effective length. The junction-level PSI is the share of the single downstream junction among all junctions leaving that donor, which makes it the more sensitive and the noisier measure for a lowly used exon. On either measure the direction is reproducible and the magnitude is too small to support an isoform switch, and the negative conclusion of the meta-analysis stands.</w:t>
+        <w:t>, so increased inclusion upon TDP-43 loss would be a simple route to reduced entry. Measured as an rMATS event, inclusion was higher in knockdown in five of six datasets, but the fixed-effect meta-analysis estimate was negligible (pooled ΔPSI +0.0013, 95% CI −0.022 to +0.024; p = 0.914; Figure 4B; Supplementary Table S15). The three mouse datasets carry 86% of the weight, but the human datasets alone give the same answer (+0.031, 95% CI −0.030 to +0.091; p = 0.32), and the estimates are not heterogeneous (Cochran’s Q = 4.84, 5 df, p = 0.44; I² = 0%). At junction level the exon (chr4:27,007,983–27,008,006) was positive in direction in all five TDP-43 comparisons in which it was measurable, but small and inconsistent: ΔPSI +0.149 in SH-SY5Y at 75 ng/mL (q = 0.033, 20 versus 3 reads), +0.116 at 25 ng/mL (q = 0.14) and +0.020 in iPSC colonies (q = 0.82), the best-powered comparison with 441 versus 281 reads (Supplementary Table S13). The junction-level estimate is larger than the rMATS estimate for the same exon in the same libraries (+0.149 versus +0.059; Supplementary Table S15) because rMATS combines both flanking junctions and normalises by effective length, whereas the junction-level PSI is the share of the single downstream junction among all junctions leaving that donor, the more sensitive and the noisier measure for a lowly used exon. On either measure the magnitude is too small to support an isoform switch, and the negative conclusion of the meta-analysis stands.</w:t>
       </w:r>
     </w:p>
     <w:p>
@@ -4451,7 +4154,8 @@
         <w:jc w:val="both"/>
       </w:pPr>
       <w:r>
-        <w:t xml:space="preserve">FRASER, run on the nine-sample doxycycline series, returned no genome-wide significant outlier and no difference in per-sample outlier burden between depleted and control libraries (4.8 versus 2.3 events at p &lt; 10⁻⁵; p = 0.35). This is the expected behaviour of an outlier method applied to a cohort in which the aberrant state is the majority, and we report it as a limit of that approach at this cohort size rather than as evidence against aberrant splicing.</w:t>
+        <w:rPr/>
+        <w:t>FRASER, run on the nine-sample doxycycline series, returned no genome-wide significant outlier and no difference in per-sample outlier burden between depleted and control libraries (4.8 versus 2.3 events at p &lt; 10⁻⁵; p = 0.35). This is the expected behaviour of an outlier method in a cohort where the aberrant state is the majority, and we report it as a limit of that approach at this cohort size rather than as evidence against aberrant splicing.</w:t>
       </w:r>
     </w:p>
     <w:bookmarkEnd w:id="32"/>
@@ -4644,39 +4348,38 @@
         <w:jc w:val="both"/>
       </w:pPr>
       <w:r>
-        <w:t xml:space="preserve">Excluding CIGAR reference skips affected this positive control: including them would have changed the STMN2 intron 2 index difference from +0.145 to +0.489. In the primary SH-SY5Y model, the skip-excluded index shifted only moderately: using all six libraries, the</w:t>
-      </w:r>
-      <w:r>
-        <w:t xml:space="preserve"> </w:t>
+        <w:rPr/>
+        <w:t xml:space="preserve">Excluding CIGAR reference skips matters for this positive control: including them would have changed the </w:t>
       </w:r>
       <w:r>
         <w:rPr>
           <w:i/>
-          <w:iCs/>
-        </w:rPr>
-        <w:t xml:space="preserve">STMN2</w:t>
-      </w:r>
-      <w:r>
-        <w:t xml:space="preserve"> </w:t>
-      </w:r>
-      <w:r>
-        <w:t xml:space="preserve">intronic index gave a group difference of +0.145 (bootstrap 95% CI +0.085 to +0.205).</w:t>
-      </w:r>
-      <w:r>
-        <w:t xml:space="preserve"> </w:t>
+        </w:rPr>
+        <w:t>STMN2</w:t>
+      </w:r>
+      <w:r>
+        <w:rPr/>
+        <w:t xml:space="preserve"> intron 2 index difference from +0.145 to +0.489. With skips excluded, the </w:t>
       </w:r>
       <w:r>
         <w:rPr>
           <w:i/>
-          <w:iCs/>
-        </w:rPr>
-        <w:t xml:space="preserve">STMN2</w:t>
-      </w:r>
-      <w:r>
-        <w:t xml:space="preserve"> </w:t>
-      </w:r>
-      <w:r>
-        <w:t xml:space="preserve">falls outside the depth-filtered summary table because one control library has a summed two-window depth of 2.97, just below the pre-specified threshold of 3; one knockdown library has a measured coverage of zero in the 3′ window, which by the definition of the index contributes a value of 1.0 rather than missing data, and excluding that library gives +0.121 (+0.068 to +0.173) (Supplementary Figure S6B).</w:t>
+        </w:rPr>
+        <w:t>STMN2</w:t>
+      </w:r>
+      <w:r>
+        <w:rPr/>
+        <w:t xml:space="preserve"> intronic index shifted only moderately in the primary SH-SY5Y model, by +0.145 over all six libraries (bootstrap 95% CI +0.085 to +0.205). </w:t>
+      </w:r>
+      <w:r>
+        <w:rPr>
+          <w:i/>
+        </w:rPr>
+        <w:t>STMN2</w:t>
+      </w:r>
+      <w:r>
+        <w:rPr/>
+        <w:t xml:space="preserve"> falls outside the depth-filtered summary table because one control library has a summed two-window depth of 2.97, just below the pre-specified threshold of 3; one knockdown library has zero measured coverage in the 3′ window, which by the definition of the index contributes a value of 1.0 rather than missing data, and excluding that library gives +0.121 (+0.068 to +0.173) (Supplementary Figure S6B).</w:t>
       </w:r>
     </w:p>
     <w:p>
@@ -4685,100 +4388,68 @@
         <w:jc w:val="both"/>
       </w:pPr>
       <w:r>
-        <w:t xml:space="preserve">Among the depth-qualified units of the SOCE machinery in the full-panel analysis, two intronic units showed moderate decreases (</w:t>
+        <w:rPr/>
+        <w:t>Among the depth-qualified units of the SOCE machinery in the full-panel analysis, two intronic units showed moderate decreases (</w:t>
       </w:r>
       <w:r>
         <w:rPr>
           <w:i/>
-          <w:iCs/>
-        </w:rPr>
-        <w:t xml:space="preserve">STIM1</w:t>
-      </w:r>
-      <w:r>
-        <w:t xml:space="preserve"> </w:t>
-      </w:r>
-      <w:r>
-        <w:t xml:space="preserve">intron 17, Δ = −0.173, bootstrap 95% CI −0.233 to −0.123;</w:t>
-      </w:r>
-      <w:r>
-        <w:t xml:space="preserve"> </w:t>
+        </w:rPr>
+        <w:t>STIM1</w:t>
+      </w:r>
+      <w:r>
+        <w:rPr/>
+        <w:t xml:space="preserve"> intron 17, Δ = −0.173, bootstrap 95% CI −0.233 to −0.123; </w:t>
       </w:r>
       <w:r>
         <w:rPr>
           <w:i/>
-          <w:iCs/>
-        </w:rPr>
-        <w:t xml:space="preserve">STIM2</w:t>
-      </w:r>
-      <w:r>
-        <w:t xml:space="preserve"> </w:t>
-      </w:r>
-      <w:r>
-        <w:t xml:space="preserve">intron 13, Δ = −0.156, −0.239 to −0.037). The</w:t>
-      </w:r>
-      <w:r>
-        <w:t xml:space="preserve"> </w:t>
+        </w:rPr>
+        <w:t>STIM2</w:t>
+      </w:r>
+      <w:r>
+        <w:rPr/>
+        <w:t xml:space="preserve"> intron 13, Δ = −0.156, −0.239 to −0.037). Neither is independent of the splicing results: the 5′ window of the </w:t>
       </w:r>
       <w:r>
         <w:rPr>
           <w:i/>
-          <w:iCs/>
-        </w:rPr>
-        <w:t xml:space="preserve">STIM2</w:t>
-      </w:r>
-      <w:r>
-        <w:t xml:space="preserve"> </w:t>
-      </w:r>
-      <w:r>
-        <w:t xml:space="preserve">unit is not an independent observation: its 5′ window contains the alternatively spliced</w:t>
-      </w:r>
-      <w:r>
-        <w:t xml:space="preserve"> </w:t>
+        </w:rPr>
+        <w:t>STIM2</w:t>
+      </w:r>
+      <w:r>
+        <w:rPr/>
+        <w:t xml:space="preserve"> unit contains the alternatively spliced </w:t>
       </w:r>
       <w:r>
         <w:rPr>
           <w:i/>
-          <w:iCs/>
-        </w:rPr>
-        <w:t xml:space="preserve">STIM2</w:t>
-      </w:r>
-      <w:r>
-        <w:t xml:space="preserve"> </w:t>
-      </w:r>
-      <w:r>
-        <w:t xml:space="preserve">exon of Table 3 (chr4:27,021,494–27,021,612), whose inclusion falls in knockdown, and exon reads dominate that window (control index 0.96), so the decrease reports that splicing change. The</w:t>
-      </w:r>
-      <w:r>
-        <w:t xml:space="preserve"> </w:t>
+        </w:rPr>
+        <w:t>STIM2</w:t>
+      </w:r>
+      <w:r>
+        <w:rPr/>
+        <w:t xml:space="preserve"> exon of Table 3 (chr4:27,021,494–27,021,612), whose inclusion falls in knockdown and whose exon reads dominate that window (control index 0.96), so the decrease reports that splicing change, and the </w:t>
       </w:r>
       <w:r>
         <w:rPr>
           <w:i/>
-          <w:iCs/>
-        </w:rPr>
-        <w:t xml:space="preserve">STIM1</w:t>
-      </w:r>
-      <w:r>
-        <w:t xml:space="preserve"> </w:t>
-      </w:r>
-      <w:r>
-        <w:t xml:space="preserve">unit is the intron immediately upstream of the alternatively included</w:t>
-      </w:r>
-      <w:r>
-        <w:t xml:space="preserve"> </w:t>
+        </w:rPr>
+        <w:t>STIM1</w:t>
+      </w:r>
+      <w:r>
+        <w:rPr/>
+        <w:t xml:space="preserve"> unit is the intron immediately upstream of the alternatively included </w:t>
       </w:r>
       <w:r>
         <w:rPr>
           <w:i/>
-          <w:iCs/>
-        </w:rPr>
-        <w:t xml:space="preserve">STIM1</w:t>
-      </w:r>
-      <w:r>
-        <w:t xml:space="preserve"> </w:t>
-      </w:r>
-      <w:r>
-        <w:t xml:space="preserve">exon of Table 3 (its 3′ window ends 50 bp before that exon) and may be influenced by it as well. Both are candidate coverage gradients rather than localised poly(A) sites. Sparse intronic windows produced unstable point estimates and were excluded by the pre-specified depth filter.</w:t>
+        </w:rPr>
+        <w:t>STIM1</w:t>
+      </w:r>
+      <w:r>
+        <w:rPr/>
+        <w:t xml:space="preserve"> exon of Table 3, ending 50 bp before it. Both are candidate coverage gradients rather than localised poly(A) sites. Sparse intronic windows produced unstable point estimates and were excluded by the pre-specified depth filter.</w:t>
       </w:r>
     </w:p>
     <w:p>
@@ -4918,7 +4589,7 @@
       </w:r>
       <w:r>
         <w:rPr/>
-        <w:t xml:space="preserve"> intron 2 unit most of all (−0.267), which is the expected behaviour of the assay in this model. Because the positive control responded only moderately in this model, absence of a signal should not be interpreted as evidence that these genes are definitively spared.</w:t>
+        <w:t xml:space="preserve"> intron 2 unit most of all (−0.267), which is how the assay is expected to behave in this model. Because the positive control responded only moderately here, absence of a signal is not evidence that these genes are spared.</w:t>
       </w:r>
     </w:p>
     <w:p>
@@ -4927,116 +4598,78 @@
         <w:jc w:val="both"/>
       </w:pPr>
       <w:r>
-        <w:t xml:space="preserve">We therefore repeated the analysis in the iPSC-derived motor neurons, where 59 units in 29 genes passed the same depth filter. Here the assay’s positive control behaved as intended: the index of</w:t>
-      </w:r>
-      <w:r>
-        <w:t xml:space="preserve"> </w:t>
+        <w:rPr/>
+        <w:t xml:space="preserve">We therefore repeated the analysis in the iPSC-derived motor neurons, where 59 units in 29 genes passed the same depth filter and the positive control behaved as intended: the index of </w:t>
       </w:r>
       <w:r>
         <w:rPr>
           <w:i/>
-          <w:iCs/>
-        </w:rPr>
-        <w:t xml:space="preserve">STMN2</w:t>
-      </w:r>
-      <w:r>
-        <w:t xml:space="preserve"> </w:t>
-      </w:r>
-      <w:r>
-        <w:t xml:space="preserve">intron 2, which contains cryptic exon 2a, rose from 0.570 in controls to 0.819 in knockdown (Δ = +0.249, interval +0.208 to +0.290). Against that working positive control, the SOCE-machinery genes again showed only small shifts: the largest were</w:t>
-      </w:r>
-      <w:r>
-        <w:t xml:space="preserve"> </w:t>
+        </w:rPr>
+        <w:t>STMN2</w:t>
+      </w:r>
+      <w:r>
+        <w:rPr/>
+        <w:t xml:space="preserve"> intron 2, which contains cryptic exon 2a, rose from 0.570 in controls to 0.819 in knockdown (Δ = +0.249, interval +0.208 to +0.290). Against it the SOCE-machinery genes again showed only small shifts, the largest being </w:t>
       </w:r>
       <w:r>
         <w:rPr>
           <w:i/>
-          <w:iCs/>
-        </w:rPr>
-        <w:t xml:space="preserve">ATP2A2</w:t>
-      </w:r>
-      <w:r>
-        <w:t xml:space="preserve"> </w:t>
-      </w:r>
-      <w:r>
-        <w:t xml:space="preserve">intron 3 (−0.164) and, below 0.10,</w:t>
-      </w:r>
-      <w:r>
-        <w:t xml:space="preserve"> </w:t>
+        </w:rPr>
+        <w:t>ATP2A2</w:t>
+      </w:r>
+      <w:r>
+        <w:rPr/>
+        <w:t xml:space="preserve"> intron 3 (−0.164) and, below 0.10, </w:t>
       </w:r>
       <w:r>
         <w:rPr>
           <w:i/>
-          <w:iCs/>
-        </w:rPr>
-        <w:t xml:space="preserve">SARAF</w:t>
-      </w:r>
-      <w:r>
-        <w:t xml:space="preserve"> </w:t>
-      </w:r>
-      <w:r>
-        <w:t xml:space="preserve">intron 5 (+0.097),</w:t>
-      </w:r>
-      <w:r>
-        <w:t xml:space="preserve"> </w:t>
+        </w:rPr>
+        <w:t>SARAF</w:t>
+      </w:r>
+      <w:r>
+        <w:rPr/>
+        <w:t xml:space="preserve"> intron 5 (+0.097), </w:t>
       </w:r>
       <w:r>
         <w:rPr>
           <w:i/>
-          <w:iCs/>
-        </w:rPr>
-        <w:t xml:space="preserve">TRPC1</w:t>
-      </w:r>
-      <w:r>
-        <w:t xml:space="preserve"> </w:t>
-      </w:r>
-      <w:r>
-        <w:t xml:space="preserve">intron 1 (+0.083) and the</w:t>
-      </w:r>
-      <w:r>
-        <w:t xml:space="preserve"> </w:t>
+        </w:rPr>
+        <w:t>TRPC1</w:t>
+      </w:r>
+      <w:r>
+        <w:rPr/>
+        <w:t xml:space="preserve"> intron 1 (+0.083) and the </w:t>
       </w:r>
       <w:r>
         <w:rPr>
           <w:i/>
-          <w:iCs/>
-        </w:rPr>
-        <w:t xml:space="preserve">STIM2</w:t>
-      </w:r>
-      <w:r>
-        <w:t xml:space="preserve"> </w:t>
-      </w:r>
-      <w:r>
-        <w:t xml:space="preserve">terminal exon (−0.074). The SH-SY5Y</w:t>
-      </w:r>
-      <w:r>
-        <w:t xml:space="preserve"> </w:t>
+        </w:rPr>
+        <w:t>STIM2</w:t>
+      </w:r>
+      <w:r>
+        <w:rPr/>
+        <w:t xml:space="preserve"> terminal exon (−0.074). The SH-SY5Y </w:t>
       </w:r>
       <w:r>
         <w:rPr>
           <w:i/>
-          <w:iCs/>
-        </w:rPr>
-        <w:t xml:space="preserve">STIM1</w:t>
-      </w:r>
-      <w:r>
-        <w:t xml:space="preserve"> </w:t>
-      </w:r>
-      <w:r>
-        <w:t xml:space="preserve">intron 17 unit did not reach the depth filter in this shallower dataset (</w:t>
+        </w:rPr>
+        <w:t>STIM1</w:t>
+      </w:r>
+      <w:r>
+        <w:rPr/>
+        <w:t xml:space="preserve"> intron 17 unit did not reach the depth filter here (</w:t>
       </w:r>
       <w:r>
         <w:rPr>
           <w:i/>
-          <w:iCs/>
-        </w:rPr>
-        <w:t xml:space="preserve">STIM2</w:t>
-      </w:r>
-      <w:r>
-        <w:t xml:space="preserve"> </w:t>
-      </w:r>
-      <w:r>
-        <w:t xml:space="preserve">intron 13 gave −0.024, interval spanning zero). For this comparison, n = 2, so the enumerated bootstrap has sixteen draws and its intervals are coarse; the point estimates, not the intervals, carry the information.</w:t>
+        </w:rPr>
+        <w:t>STIM2</w:t>
+      </w:r>
+      <w:r>
+        <w:rPr/>
+        <w:t xml:space="preserve"> intron 13 gave −0.024, interval spanning zero). Here n = 2, so the enumerated bootstrap has sixteen draws and its intervals are coarse, and the point estimates carry the information.</w:t>
       </w:r>
     </w:p>
     <w:p>
@@ -5045,10 +4678,10 @@
         <w:jc w:val="both"/>
       </w:pPr>
       <w:r>
-        <w:t xml:space="preserve">The two mouse lines gave 74 qualifying units in C2C12 and 131 in NSC34. Neither has a positive control for this assay: the</w:t>
-      </w:r>
-      <w:r>
-        <w:t xml:space="preserve"> </w:t>
+        <w:t xml:space="preserve">The two mouse lines gave 74 qualifying units in C2C12 and 131 in NSC34, neither with a positive control for this assay, because the </w:t>
+      </w:r>
+      <w:r>
+        <w:t xml:space="preserve"/>
       </w:r>
       <w:r>
         <w:rPr>
@@ -5156,7 +4789,7 @@
         <w:t xml:space="preserve"> </w:t>
       </w:r>
       <w:r>
-        <w:t xml:space="preserve">intron 5 index in NSC34 (+0.204), while in SH-SY5Y the same unit is uninformative (0.000, interval −0.264 to +0.241). We record it as a candidate rather than a finding: the NSC34 interval is wide, the myoblast line shows nothing there, the human and mouse units are matched by number rather than by sequence alignment, and a coverage gradient is not a poly(A) site.</w:t>
+        <w:t xml:space="preserve">intron 5 index in NSC34 (+0.204), while in SH-SY5Y the same unit is uninformative (0.000, interval −0.264 to +0.241). We record it as a candidate rather than a finding: the NSC34 interval is wide, the myoblast line shows nothing there, the units are matched by number rather than by sequence alignment, and a coverage gradient is not a poly(A) site.</w:t>
       </w:r>
     </w:p>
     <w:p>
@@ -5478,7 +5111,7 @@
         <w:t xml:space="preserve"> </w:t>
       </w:r>
       <w:r>
-        <w:t xml:space="preserve">was decreased at donor level across all sampled lesion types (δ = −0.840; q = 0.038) and in lesions at sample level (δ = −0.594; q = 1.3 × 10⁻⁴); in the second multiple sclerosis cohort the direction was the same but the study was underpowered (five regions pooled, δ = −0.226; q = 0.49). Because TRPC1 contributes to SOCE in oligodendrocyte precursor cells </w:t>
+        <w:t xml:space="preserve">was decreased at donor level across all sampled lesion types (δ = −0.840; q = 0.038) and in lesions at sample level (δ = −0.594; q = 1.3 × 10⁻⁴); the direction was the same in the second multiple sclerosis cohort, which was underpowered (five regions pooled, δ = −0.226; q = 0.49). Because TRPC1 contributes to SOCE in oligodendrocyte precursor cells </w:t>
       </w:r>
       <w:r>
         <w:fldChar w:fldCharType="begin"/>
@@ -5512,7 +5145,7 @@
         <w:t xml:space="preserve"> </w:t>
       </w:r>
       <w:r>
-        <w:t xml:space="preserve">was lower at sample level (δ = −0.482, p = 0.005), although not after Benjamini–Hochberg correction (q = 0.10). Because several samples come from the same donor, we repeated the test with the donor as the unit of inference, which gave a larger difference (seven of ten multiple sclerosis donors with NAWM samples versus five control donors, δ = −0.771, uncorrected p = 0.030). In the full GSE138614 comparison, regression of TRPC1 on MBP, PLP1 and GFAP attenuated the difference at both levels: from δ = −0.562 to Cliff’s δ of −0.418 on the residuals at sample level (p = 0.002), and from δ = −0.840 to −0.640 at donor level, where the adjusted difference did not reach significance (p = 0.055).</w:t>
+        <w:t xml:space="preserve">was lower at sample level (δ = −0.482, p = 0.005), although not after Benjamini–Hochberg correction (q = 0.10), and lower again with the donor as the unit of inference (seven of ten multiple sclerosis donors with NAWM samples versus five control donors, δ = −0.771, uncorrected p = 0.030). In the full GSE138614 comparison, regression of TRPC1 on MBP, PLP1 and GFAP attenuated the difference at both levels: from δ = −0.562 to Cliff’s δ of −0.418 on the residuals at sample level (p = 0.002), and from δ = −0.840 to −0.640 at donor level, where the adjusted difference did not reach significance (p = 0.055).</w:t>
       </w:r>
       <w:r>
         <w:t xml:space="preserve"> </w:t>
@@ -5528,7 +5161,7 @@
         <w:t xml:space="preserve"> </w:t>
       </w:r>
       <w:r>
-        <w:t xml:space="preserve">was lower in every lesion type, including remyelinating and inactive lesions (donor-level δ = −1.000 for both). Multiple sclerosis showed marked astrogliosis (GFAP δ = +0.84 to +0.96), again with</w:t>
+        <w:t xml:space="preserve">was lower in every lesion type, including remyelinating and inactive lesions (donor-level δ = −1.000 for both), and multiple sclerosis showed marked astrogliosis (GFAP δ = +0.84 to +0.96), again with</w:t>
       </w:r>
       <w:r>
         <w:t xml:space="preserve"> </w:t>
@@ -5790,7 +5423,7 @@
         <w:jc w:val="both"/>
       </w:pPr>
       <w:r>
-        <w:t>This study identifies a marked reduction in Fura-2-measured SOCE after TDP-43 knockdown and connects that functional phenotype to coordinated changes in calcium-regulatory transcripts. The central feature is a mismatch between abundance and function: the adjusted STIM and ORAI transcript pools increased, yet the SOCE amplitude decreased by approximately 84%. The transcript data do not show a simple loss of core SOCE mRNAs; they do not establish protein abundance. Channel composition, feedback inhibition, ER refilling and cellular bioenergetics remain possible interacting determinants. Across independent datasets, canonical TDP-43 RNA targets behaved as expected, whereas calcium-gene processing changes were selective and context dependent. This combination defines a multilayered calcium-homeostasis phenotype rather than uniform suppression of one channel or one RNA-processing event.</w:t>
+        <w:t>This study identifies a marked reduction in Fura-2-measured SOCE after TDP-43 knockdown and connects that functional phenotype to coordinated changes in calcium-regulatory transcripts. The central feature is a mismatch between abundance and function: the adjusted STIM and ORAI transcript pools increased, yet the SOCE amplitude decreased by approximately 84%. The transcript data do not show a simple loss of core SOCE mRNAs; they do not establish protein abundance. Channel composition, feedback inhibition, ER refilling and cellular bioenergetics remain possible interacting determinants. This combination defines a multilayered calcium-homeostasis phenotype rather than uniform suppression of one channel or one RNA-processing event.</w:t>
       </w:r>
     </w:p>
     <w:p>
@@ -5901,7 +5534,7 @@
         <w:fldChar w:fldCharType="end"/>
       </w:r>
       <w:r>
-        <w:t>. These comparisons make the observed transcript pattern mechanistically informative without assigning the phenotype to one component: the likely variable is the assembled channel and its feedback kinetics in this cellular background.</w:t>
+        <w:t>.</w:t>
       </w:r>
     </w:p>
     <w:p>
@@ -5952,7 +5585,7 @@
         <w:fldChar w:fldCharType="end"/>
       </w:r>
       <w:r>
-        <w:t>. TDP-43-depleted SH-SY5Y cells instead showed strongly reduced readdition. The contrast is biologically meaningful because astroglial hyperactive entry, neuronal-like cell entry failure and ER-store depletion can all disturb calcium signalling through different routes. Genetic lesion, cell identity, differentiation state and compensatory timing are therefore likely to determine the direction of the measured phenotype. The smaller store-depletion-evoked Ca²⁺-readdition response in SH-SY5Y cells complements, rather than reproduces, the SOD1 astrocyte phenotype.</w:t>
+        <w:t>. TDP-43-depleted SH-SY5Y cells instead showed strongly reduced readdition. Genetic lesion, cell identity, differentiation state and compensatory timing are therefore likely to determine the direction of the measured phenotype. The smaller store-depletion-evoked Ca²⁺-readdition response in SH-SY5Y cells complements, rather than reproduces, the SOD1 astrocyte phenotype.</w:t>
       </w:r>
     </w:p>
     <w:p>
@@ -6003,7 +5636,7 @@
         <w:fldChar w:fldCharType="end"/>
       </w:r>
       <w:r>
-        <w:t>. It nevertheless links the WST-1 phenotype to a broader bioenergetic and calcium-buffering response. Reduced ATP supply could impair SERCA-dependent store refilling, while altered mitochondrial uptake could change local cytosolic Ca²⁺ clearance near ER and plasma-membrane junctions. This provides a mechanistic route by which cell state, ER release and readdition can decline together without requiring every change to arise from the same channel subunit.</w:t>
+        <w:t>. Reduced ATP supply could impair SERCA-dependent store refilling, while altered mitochondrial uptake could change local cytosolic Ca²⁺ clearance near ER and plasma-membrane junctions. This provides a mechanistic route by which cell state, ER release and readdition can decline together without requiring every change to arise from the same channel subunit.</w:t>
       </w:r>
     </w:p>
     <w:p>
@@ -6138,7 +5771,7 @@
         <w:fldChar w:fldCharType="end"/>
       </w:r>
       <w:r>
-        <w:t>, while the ORAI3 event and ORAI-family redistribution could alter channel assembly in the primary model. Read-support and matched-background analyses were decisive here: they removed isolated events and apparent panel enrichment while retaining CBARP and a small number of model-specific candidates. The resulting hierarchy is stronger than a long candidate list because it distinguishes recurrent signals from coverage-sensitive observations.</w:t>
+        <w:t>, while the ORAI3 event and ORAI-family redistribution could alter channel assembly in the primary model. Read-support and matched-background analyses were decisive here: they removed isolated events and apparent panel enrichment while retaining CBARP and a small number of model-specific candidates.</w:t>
       </w:r>
     </w:p>
     <w:p>
@@ -6153,7 +5786,7 @@
         <w:t xml:space="preserve">Relevance to disease tissue. </w:t>
       </w:r>
       <w:r>
-        <w:t xml:space="preserve">TRPC1 and SARAF increased and CBARP decreased in six ALS brain regions, matching the direction observed in the public SH-SY5Y model. TRPC1 remained unchanged in the well-powered cervical and lumbar spinal-cord comparisons and decreased in the neurological comparison cohorts. Among the disease cohorts surveyed, ALS alone showed a significant TRPC1 increase, concentrated in brain regions. Because bulk-tissue expression is sensitive to region and cellular composition, these observations identify disease-associated candidates rather than a direct TDP-43-driven mechanism. Together with the opposing direction of SOCE changes reported in SOD1 astrocytes, these findings indicate that cell identity and compensatory state shape the calcium-regulatory phenotype.</w:t>
+        <w:t xml:space="preserve">TRPC1 and SARAF increased and CBARP decreased in six ALS brain regions, matching the direction observed in the public SH-SY5Y model. TRPC1 remained unchanged in the well-powered cervical and lumbar spinal-cord comparisons and decreased in the neurological comparison cohorts. Among the disease cohorts surveyed, ALS alone showed a significant TRPC1 increase, concentrated in brain regions. Because bulk-tissue expression is sensitive to region and cellular composition, these observations identify disease-associated candidates rather than a direct TDP-43-driven mechanism.</w:t>
       </w:r>
     </w:p>
     <w:p>

</xml_diff>

<commit_message>
Report effect sizes and name the Fura-2 traces as the original recordings
- The two Fura-2 comparisons and the per-culture ratio now carry Hedges' g with its
  interval, so the result does not rest on the p value alone; Methods 2.16 says what the
  statistic is and that at three samples per group the interval is wide.
- The Figure 2 caption states that panels A and B are the original Prism recordings
  reproduced unchanged, and that panel E is the same two recordings drawn on common axes
  from the exported values, with nothing smoothed or rescaled.
- The Figure 1C caption calls the WST-1 wells technical replicates of one experiment.
- The RNA-processing block ends by calling the NMD and APA screens hypothesis-generating.
- QA: 434 checks.
</commit_message>
<xml_diff>
--- a/manuscript/MANUSCRIPT_NEUROCHEMISTRY_INTERNATIONAL_FINAL.docx
+++ b/manuscript/MANUSCRIPT_NEUROCHEMISTRY_INTERNATIONAL_FINAL.docx
@@ -2485,7 +2485,7 @@
         <w:jc w:val="both"/>
       </w:pPr>
       <w:r>
-        <w:t xml:space="preserve">Bioinformatic thresholds are given above. Laboratory data are mean ± SEM. TARDBP knockdown was assessed by one-way ANOVA on log2-transformed relative expression with Tukey’s multiple comparison test. The four target-gene RT-qPCR comparisons used two-tailed Student’s t-tests with Holm adjustment across the four targets (GraphPad Prism 10). Fura-2 amplitudes from three independent cultures per group were compared with Welch’s two-tailed t-test (SciPy v1.12.0), which does not assume equal variances, and are reported with the difference in means and its 95% confidence interval; these two pre-specified comparisons were not adjusted for multiplicity. With three samples per group the smallest two-sided p value attainable by a rank or permutation test is 0.10, so these comparisons rest on the parametric assumption of Welch’s test rather than on a distribution-free one. The readdition-to-release ratio of each culture was summarised descriptively. The 48-h WST-1 wells (n = 4) come from one experiment and were summarised descriptively, because wells within an experiment are not independent replicates. Significance was set at p &lt; 0.05, Holm-adjusted for the four-target RT-qPCR family.</w:t>
+        <w:t xml:space="preserve">Bioinformatic thresholds are given above. Laboratory data are mean ± SEM. TARDBP knockdown was assessed by one-way ANOVA on log2-transformed relative expression with Tukey’s multiple comparison test. The four target-gene RT-qPCR comparisons used two-tailed Student’s t-tests with Holm adjustment across the four targets (GraphPad Prism 10). Fura-2 amplitudes from three independent cultures per group were compared with Welch’s two-tailed t-test (SciPy v1.12.0), which does not assume equal variances, and are reported with the difference in means and its 95% confidence interval; these two pre-specified comparisons were not adjusted for multiplicity. Effect sizes are Hedges’ g, the small-sample-corrected standardised mean difference, with the interval of Hedges and Olkin; at three samples per group the point estimate is large but its interval is correspondingly wide, so it describes the size of the difference rather than establishing it. With three samples per group the smallest two-sided p value attainable by a rank or permutation test is 0.10, so these comparisons rest on the parametric assumption of Welch’s test rather than on a distribution-free one. The readdition-to-release ratio of each culture was summarised descriptively. The 48-h WST-1 wells (n = 4) come from one experiment and were summarised descriptively, because wells within an experiment are not independent replicates. Significance was set at p &lt; 0.05, Holm-adjusted for the four-target RT-qPCR family.</w:t>
       </w:r>
     </w:p>
     <w:bookmarkEnd w:id="26"/>
@@ -2721,7 +2721,7 @@
           <w:rFonts w:ascii="Times New Roman" w:hAnsi="Times New Roman"/>
           <w:sz w:val="19"/>
         </w:rPr>
-        <w:t xml:space="preserve"> TDP-43 knockdown, calcium-related mRNAs and WST-1 signal in SH-SY5Y cells. (A) TARDBP mRNA in untransduced cells (“No virus”), non-targeting shRNA controls and shTDP-43 cells (n = 4; one-way ANOVA on log2 values with Tukey’s test; **** p &lt; 0.0001 for the indicated pair). (B) Relative mRNA of TRPC1, STIM1, ORAI1 and ATP2A3 (n = 4; two-tailed t-tests with Holm adjustment across the four targets; ** adjusted p &lt; 0.01, *** adjusted p &lt; 0.001). (C) WST-1 metabolic signal at 48 h (n = 4; descriptive summary only). Bars represent means ± SEM; dots are individual measurements.</w:t>
+        <w:t xml:space="preserve"> TDP-43 knockdown, calcium-related mRNAs and WST-1 signal in SH-SY5Y cells. (A) TARDBP mRNA in untransduced cells (“No virus”), non-targeting shRNA controls and shTDP-43 cells (n = 4; one-way ANOVA on log2 values with Tukey’s test; **** p &lt; 0.0001 for the indicated pair). (B) Relative mRNA of TRPC1, STIM1, ORAI1 and ATP2A3 (n = 4; two-tailed t-tests with Holm adjustment across the four targets; ** adjusted p &lt; 0.01, *** adjusted p &lt; 0.001). (C) WST-1 metabolic signal at 48 h (n = 4 wells of a single experiment, that is technical replicates; summarised descriptively and not tested). Bars represent means ± SEM; dots are individual measurements.</w:t>
       </w:r>
     </w:p>
     <w:p>
@@ -2730,7 +2730,7 @@
         <w:jc w:val="both"/>
       </w:pPr>
       <w:r>
-        <w:t xml:space="preserve">The Fura-2 Ca²⁺-readdition amplitude was markedly lower in shTDP-43 cells (Figure 2). The readdition amplitude fell from 1.542 ± 0.282 to 0.245 ± 0.083 Δ(F340/F380) (mean ± SEM, n = 3 independent cultures per group; difference −1.30, 95% CI −2.40 to −0.19; Welch’s t-test p = 0.035). ER Ca²⁺ release fell less and not significantly, from 0.268 ± 0.042 to 0.180 ± 0.061 (difference −0.09, 95% CI −0.30 to +0.13; p = 0.31). Because both phases come from the same recording, readdition was also expressed relative to each culture’s own release. This ratio was 5.88 ± 1.10 in controls and 1.36 ± 0.01 after knockdown, 77% lower, and every shTDP-43 culture had a lower ratio than every control culture (Supplementary Table S1). A smaller releasable store therefore does not account for most of the decrease. Plotted on common axes, the two representative recordings had similar baselines before readdition (Figure 2E). At 48 h, the WST-1 signal was 61.5 ± 0.8% of control, a 38.5% decrease (n = 4 wells; descriptive; Figure 1C).</w:t>
+        <w:t xml:space="preserve">The Fura-2 Ca²⁺-readdition amplitude was markedly lower in shTDP-43 cells (Figure 2). The readdition amplitude fell from 1.542 ± 0.282 to 0.245 ± 0.083 Δ(F340/F380) (mean ± SEM, n = 3 independent cultures per group; difference −1.30, 95% CI −2.40 to −0.19; Welch’s t-test p = 0.035; Hedges’ g = −2.9, 95% CI −5.3 to −0.5). ER Ca²⁺ release fell less and not significantly, from 0.268 ± 0.042 to 0.180 ± 0.061 (difference −0.09, 95% CI −0.30 to +0.13; p = 0.31; Hedges’ g = −0.8, 95% CI −2.2 to +0.6). Because both phases come from the same recording, readdition was also expressed relative to each culture’s own release. This ratio was 5.88 ± 1.10 in controls and 1.36 ± 0.01 after knockdown, 77% lower (Hedges’ g = −2.7, 95% CI −4.9 to −0.4), and every shTDP-43 culture had a lower ratio than every control culture (Supplementary Table S1). A smaller releasable store therefore does not account for most of the decrease. Plotted on common axes, the two representative recordings had similar baselines before readdition (Figure 2E). At 48 h, the WST-1 signal was 61.5 ± 0.8% of control, a 38.5% decrease (n = 4 wells; descriptive; Figure 1C).</w:t>
       </w:r>
     </w:p>
     <w:p>
@@ -2804,7 +2804,7 @@
           <w:rFonts w:ascii="Times New Roman" w:hAnsi="Times New Roman"/>
           <w:sz w:val="19"/>
         </w:rPr>
-        <w:t xml:space="preserve"> Fura-2 calcium measurements following TDP-43 knockdown in SH-SY5Y cells. (A, B) Original representative traces from non-targeting shRNA control and shTDP-43 cells, each shown at the axis range of its own recording: the y axis spans 0–3 in A and 0.5–1.5 in B, and the time windows differ, so the two panels are not directly comparable by eye; panel E replots them on common axes. CPA (10 µM) and CaCl₂ (nominally 1.5 mM) additions are indicated. (C) ER Ca²⁺ release after CPA. (D) Ca²⁺-readdition amplitude. Panels C and D show the three independent cultures per group and mean ± SEM (readdition, Welch’s t-test p = 0.035; ER release, p = 0.31). (E) The recordings in A and B replotted from their exported ratio values on common axes, with time aligned to the steepest point of the readdition rise. The traces illustrate individual recordings; group amplitudes were calculated from the original Prism measurements.</w:t>
+        <w:t xml:space="preserve"> Fura-2 calcium measurements following TDP-43 knockdown in SH-SY5Y cells. (A, B) The original recordings, exported from the GraphPad Prism trace project and reproduced here unchanged, from non-targeting shRNA control and shTDP-43 cells, each shown at the axis range of its own recording: the y axis spans 0–3 in A and 0.5–1.5 in B, and the time windows differ, so the two panels are not directly comparable by eye; panel E replots them on common axes. CPA (10 µM) and CaCl₂ (nominally 1.5 mM) additions are indicated. (C) ER Ca²⁺ release after CPA. (D) Ca²⁺-readdition amplitude. Panels C and D show the three independent cultures per group and mean ± SEM (readdition, Welch’s t-test p = 0.035; ER release, p = 0.31). (E) The same two recordings as in A and B, that is the same measured F340/F380 values exported from that Prism project, drawn on common axes so that the two can be compared directly; time is aligned to the steepest point of the readdition rise and no value is smoothed or rescaled. The traces illustrate individual recordings; group amplitudes were calculated from the original Prism measurements.</w:t>
       </w:r>
     </w:p>
     <w:bookmarkEnd w:id="28"/>
@@ -4798,7 +4798,7 @@
         <w:jc w:val="both"/>
       </w:pPr>
       <w:r>
-        <w:t xml:space="preserve">Taken together, these analyses support altered calcium-related RNA profiles but do not establish whether any SOCE-machinery gene is a direct target of cryptic splicing, APA or NMD-coupled degradation.</w:t>
+        <w:t xml:space="preserve">Taken together, these analyses support altered calcium-related RNA profiles but do not establish whether any SOCE-machinery gene is a direct target of cryptic splicing, APA or NMD-coupled degradation. The NMD and APA screens are hypothesis-generating: the first because batch is confounded with TDP-43 status, the second because it measures coverage gradients rather than poly(A) sites.</w:t>
       </w:r>
     </w:p>
     <w:bookmarkEnd w:id="34"/>

</xml_diff>

<commit_message>
Correct RT-qPCR to four biological replicates and recalculate inference
</commit_message>
<xml_diff>
--- a/manuscript/MANUSCRIPT_NEUROCHEMISTRY_INTERNATIONAL_FINAL.docx
+++ b/manuscript/MANUSCRIPT_NEUROCHEMISTRY_INTERNATIONAL_FINAL.docx
@@ -134,7 +134,7 @@
         <w:rPr>
           <w:i w:val="0"/>
         </w:rPr>
-        <w:t xml:space="preserve"> mRNA measurements were 1.7- to 3.2-fold higher (four technical RT-qPCR repeats per group; descriptive), while the Fura-2 Ca²⁺-readdition amplitude was 84% lower in the knockdown wells of one culture plate (three wells per group; descriptive). ER Ca²⁺ release was 33% lower, and readdition normalised to each well’s own release was 77% lower. At 48 h, the WST-1 signal was 38.5% lower in four wells from one of three experiments (descriptive). We reanalysed six public TDP-43-depletion RNA-seq comparisons (38 libraries) for calcium-regulatory expression and splicing, screened eleven comparisons for unannotated junction changes, and assessed alternative polyadenylation and nonsense-mediated decay. </w:t>
+        <w:t xml:space="preserve"> mRNA measurements were 1.7- to 3.2-fold higher (four biological RT-qPCR replicates per group), while the Fura-2 Ca²⁺-readdition amplitude was 84% lower in the knockdown wells of one culture plate (three wells per group; descriptive). ER Ca²⁺ release was 33% lower, and readdition normalised to each well’s own release was 77% lower. At 48 h, the WST-1 signal was 38.5% lower in four wells from one of three experiments (descriptive). We reanalysed six public TDP-43-depletion RNA-seq comparisons (38 libraries) for calcium-regulatory expression and splicing, screened eleven comparisons for unannotated junction changes, and assessed alternative polyadenylation and nonsense-mediated decay. </w:t>
       </w:r>
       <w:r>
         <w:rPr>
@@ -242,7 +242,7 @@
         <w:rPr>
           <w:i w:val="0"/>
         </w:rPr>
-        <w:t xml:space="preserve"> changed in the same direction in cervical and lumbar cord, but these tissue associations could not be attributed to TDP-43 loss. The laboratory observations require independent biological replication; the RNA analyses identify candidate calcium-regulatory changes without establishing a causal link to that response.</w:t>
+        <w:t xml:space="preserve"> changed in the same direction in cervical and lumbar cord, but these tissue associations could not be attributed to TDP-43 loss. The Fura-2 and WST-1 observations require independent biological replication; the RNA analyses identify candidate calcium-regulatory changes without establishing a causal link to that response.</w:t>
       </w:r>
     </w:p>
     <w:p>
@@ -3197,7 +3197,7 @@
         <w:rPr>
           <w:i w:val="0"/>
         </w:rPr>
-        <w:t xml:space="preserve"> and the non-targeting shRNA control for the target genes (four technical measurements of the same biological sample per group). </w:t>
+        <w:t xml:space="preserve"> and the non-targeting shRNA control for the target genes (four biological replicates per group). </w:t>
       </w:r>
       <w:r>
         <w:rPr>
@@ -3209,7 +3209,7 @@
         <w:rPr>
           <w:i w:val="0"/>
         </w:rPr>
-        <w:t xml:space="preserve"> and the target genes were measured on separate RNA sets; recorded assay dates were 14 April – 21 May 2026 and 3 June – 10 July 2026, respectively. These dates do not identify independent cultures or RNA isolations. Primer sequences, product sizes, annealing temperatures and the thermal cycling profile are given in Supplementary Table S1.</w:t>
+        <w:t xml:space="preserve"> and the target genes were measured on separate RNA sets; recorded assay dates were 14 April – 21 May 2026 and 3 June – 10 July 2026, respectively. Primer sequences, product sizes, annealing temperatures and the thermal cycling profile are given in Supplementary Table S1.</w:t>
       </w:r>
     </w:p>
     <w:p>
@@ -3380,19 +3380,19 @@
         <w:rPr>
           <w:i w:val="0"/>
         </w:rPr>
-        <w:t xml:space="preserve">Bioinformatic thresholds and correction families are specified above. All laboratory comparisons are descriptive. RT-qPCR comprises four technical measurements of the same biological sample per group; the </w:t>
-      </w:r>
-      <w:r>
-        <w:rPr>
-          <w:i/>
-        </w:rPr>
-        <w:t>TARDBP</w:t>
-      </w:r>
-      <w:r>
-        <w:rPr>
-          <w:i w:val="0"/>
-        </w:rPr>
-        <w:t xml:space="preserve"> and target-gene assays used separate RNA sets. Fura-2 comprises three wells per group from one culture plate. WST-1 comprises four wells from one of three experiments; the other two experiments are not available in the package. We report means, technical-repeat or well-to-well SEM, and observed differences without inferential p values, biological confidence intervals or standardised effect sizes. These measurements do not estimate between-experiment variability. The Fura-2 readdition-to-release ratio is also summarised per well.</w:t>
+        <w:t xml:space="preserve">Bioinformatic thresholds and correction families are specified above. RT-qPCR used four biological replicates per group, with separate RNA sets for TARDBP and the target genes. Two-sided Welch tests on ΔCt were Holm-adjusted across the four targets and, separately, the two TARDBP knockdown-versus-control comparisons; adjusted p &lt; 0.05 was significant. Plots show relative-expression means and SEM across biological replicates. Fura-2 comprised three wells per group on one plate; WST-1 comprised four wells from one of three experiments, with the other two experiments unavailable. Fura-2 and WST-1 means, well-to-well SEM and differences are descriptive, without inferential tests or estimates of between-experiment variability. The Fura-2 readdition-to-release ratio is summarised per well.</w:t>
+      </w:r>
+      <w:r>
+        <w:rPr>
+          <w:i/>
+        </w:rPr>
+        <w:t/>
+      </w:r>
+      <w:r>
+        <w:rPr>
+          <w:i w:val="0"/>
+        </w:rPr>
+        <w:t xml:space="preserve"/>
       </w:r>
     </w:p>
     <w:bookmarkEnd w:id="26"/>
@@ -3435,19 +3435,19 @@
         <w:rPr>
           <w:i w:val="0"/>
         </w:rPr>
-        <w:t xml:space="preserve">Mean </w:t>
-      </w:r>
-      <w:r>
-        <w:rPr>
-          <w:i/>
-        </w:rPr>
-        <w:t>TARDBP</w:t>
-      </w:r>
-      <w:r>
-        <w:rPr>
-          <w:i w:val="0"/>
-        </w:rPr>
-        <w:t xml:space="preserve"> mRNA was 94.4% lower in the shTDP-43 sample than in the non-targeting shRNA sample and 94.8% lower than in the non-transduced sample (four technical RT-qPCR measurements per group; descriptive; Figure 1A).</w:t>
+        <w:t xml:space="preserve">Mean TARDBP mRNA was 94.4% lower in shTDP-43 cells than in non-targeting shRNA controls and 94.8% lower than in non-transduced controls (four biological replicates per group; Holm-adjusted p = 8.3 × 10⁻¹¹ and 3.2 × 10⁻¹⁰, respectively; Figure 1A).</w:t>
+      </w:r>
+      <w:r>
+        <w:rPr>
+          <w:i/>
+        </w:rPr>
+        <w:t/>
+      </w:r>
+      <w:r>
+        <w:rPr>
+          <w:i w:val="0"/>
+        </w:rPr>
+        <w:t xml:space="preserve"/>
       </w:r>
     </w:p>
     <w:p>
@@ -3459,7 +3459,7 @@
         <w:rPr>
           <w:i w:val="0"/>
         </w:rPr>
-        <w:t xml:space="preserve">Relative to the non-targeting shRNA sample, mean measurements of four SOCE-associated mRNAs were higher: </w:t>
+        <w:t xml:space="preserve">Relative to the non-targeting shRNA controls, mean measurements of four SOCE-associated mRNAs were higher: </w:t>
       </w:r>
       <w:r>
         <w:rPr>
@@ -3507,7 +3507,7 @@
         <w:rPr>
           <w:i w:val="0"/>
         </w:rPr>
-        <w:t>/SERCA3 ≈ 3.2-fold (four technical measurements per group; Figure 1B). These descriptive differences require biological replication.</w:t>
+        <w:t>/SERCA3 ≈ 3.2-fold (four biological replicates per group; Figure 1B). All four increases were significant in ΔCt tests after Holm correction (adjusted p = 0.0040, 0.0040, 0.0026 and 6.8 × 10⁻⁵, respectively).</w:t>
       </w:r>
       <w:r>
         <w:t xml:space="preserve"/>
@@ -3724,7 +3724,7 @@
           <w:i/>
           <w:sz w:val="19"/>
         </w:rPr>
-        <w:t>Figure 1.</w:t>
+        <w:t>Figure 1. Laboratory measurements</w:t>
       </w:r>
       <w:r>
         <w:rPr>
@@ -3733,7 +3733,7 @@
           <w:i/>
           <w:sz w:val="19"/>
         </w:rPr>
-        <w:t xml:space="preserve"> Descriptive laboratory measurements in SH-SY5Y cells. (A) </w:t>
+        <w:t xml:space="preserve"> in SH-SY5Y cells. (A) </w:t>
       </w:r>
       <w:r>
         <w:rPr>
@@ -3823,7 +3823,7 @@
           <w:i/>
           <w:sz w:val="19"/>
         </w:rPr>
-        <w:t xml:space="preserve"> mRNA. Each RT-qPCR group comprises four technical measurements of the same biological sample; panels A and B use separate RNA sets. (C) WST-1 signal at 48 h, four wells from one experiment. Bars show means with technical-repeat or well-to-well SEM; dots show individual measurements. No inferential significance tests are assigned to these comparisons.</w:t>
+        <w:t xml:space="preserve"> mRNA. Each RT-qPCR group comprises four biological replicates; panels A and B use separate RNA sets. (C) WST-1 signal at 48 h, four wells from one experiment. Bars show means with SEM across biological replicates in A and B and across wells in C; dots show individual measurements. RT-qPCR comparisons use two-sided Welch tests on ΔCt with Holm correction (Methods 2.16; Supplementary Table S1); WST-1 is descriptive.</w:t>
       </w:r>
       <w:r>
         <w:rPr>
@@ -8028,7 +8028,7 @@
         <w:rPr>
           <w:i/>
         </w:rPr>
-        <w:t xml:space="preserve"> mRNA and, in three wells per group on one culture plate, lower mean Ca²⁺-readdition and ER-release amplitudes. RT-qPCR comprises four technical measurements per group; both the qPCR and Fura-2 comparisons are descriptive. Orange boxes are candidate mechanisms suggested by the public RNA-seq data; dashed arrows mark hypotheses for future perturbation, not demonstrated causal links. </w:t>
+        <w:t xml:space="preserve"> mRNA and, in three wells per group on one culture plate, lower mean Ca²⁺-readdition and ER-release amplitudes. RT-qPCR comprises four biological replicates per group; the Fura-2 comparison is descriptive. Orange boxes are candidate mechanisms suggested by the public RNA-seq data; dashed arrows mark hypotheses for future perturbation, not demonstrated causal links. </w:t>
       </w:r>
       <w:r>
         <w:rPr>
@@ -8068,7 +8068,7 @@
         <w:rPr>
           <w:i w:val="0"/>
         </w:rPr>
-        <w:t xml:space="preserve"> mRNA was measured by RT-qPCR but depletion was not verified at the protein level, and one TDP-43-targeting shRNA was used without a rescue experiment. The Fura-2 comparison rests on three wells per group from one culture plate, rather than independent biological experiments. Its 84% lower mean is a descriptive within-plate observation; it does not estimate between-experiment variability. Independent culture experiments are required to estimate biological variability and test whether the response replicates. The readdition signal was not characterised pharmacologically, for example with a store-operated channel blocker such as BTP2, Synta66 or Gd³⁺, so it is defined by the depletion–readdition protocol rather than by pharmacology. The WST-1 signal is reported at 48 h only, from four wells of one experiment; it is not a cell count and cannot separate fewer cells from lower metabolic activity per cell. Because the WST-1 signal was 38.5% lower, a smaller or less healthy cell population could contribute to the smaller Fura-2 signal; the ratiometric readout is in principle independent of cell number, but neither cell number nor maximum response was measured in the cuvettes. RT-qPCR used four technical measurements of the same biological sample per group and therefore does not provide independent biological confirmation of the RNA-seq changes. It was normalised to a single reference gene, </w:t>
+        <w:t xml:space="preserve"> mRNA was measured by RT-qPCR but depletion was not verified at the protein level, and one TDP-43-targeting shRNA was used without a rescue experiment. The Fura-2 comparison rests on three wells per group from one culture plate, rather than independent biological experiments. Its 84% lower mean is a descriptive within-plate observation; it does not estimate between-experiment variability. Independent culture experiments are required to estimate biological variability and test whether the response replicates. The readdition signal was not characterised pharmacologically, for example with a store-operated channel blocker such as BTP2, Synta66 or Gd³⁺, so it is defined by the depletion–readdition protocol rather than by pharmacology. The WST-1 signal is reported at 48 h only, from four wells of one experiment; it is not a cell count and cannot separate fewer cells from lower metabolic activity per cell. Because the WST-1 signal was 38.5% lower, a smaller or less healthy cell population could contribute to the smaller Fura-2 signal; the ratiometric readout is in principle independent of cell number, but neither cell number nor maximum response was measured in the cuvettes. RT-qPCR used four biological replicates per group and supported the direction of the four target-gene changes in an independent RNA sample set. It was normalised to a single reference gene, </w:t>
       </w:r>
       <w:r>
         <w:rPr>
@@ -8389,7 +8389,7 @@
         <w:rPr>
           <w:i w:val="0"/>
         </w:rPr>
-        <w:t>. It includes scripts in execution order, including the coverage, NMD, transcript-family and donor-level scripts used for the results reported here, the four Ca²⁺ gene panels, per-event count tables, junction and LSV tables, and the code that draws every figure. The versioned submission snapshot is available as GitHub release v1.0.6 at https://github.com/elmasnuryilmaz/tdp43-soce-manuscript/releases/tag/v1.0.6. The complete 23 GB rMATS output is not redistributed; the package provides the thresholded event table and the scripts and public accessions required to regenerate it. The package downloads the two externally hosted resources it needs (the recount3 junction matrix for SRP270799 and the GSE307054 count table) at run time. Every rMATS event that meets the thresholds of Section 2.3, with its event coordinates, form lengths and raw junction counts, is provided as Supplementary Table S3. RT-qPCR, Fura-2 and WST-1 source data, including technical-repeat values and the descriptive summaries behind every laboratory figure panel, are provided in Supplementary Table S1.</w:t>
+        <w:t>. It includes scripts in execution order, including the coverage, NMD, transcript-family and donor-level scripts used for the results reported here, the four Ca²⁺ gene panels, per-event count tables, junction and LSV tables, and the code that draws every figure. The versioned submission snapshot is available as GitHub release v1.0.7 at https://github.com/elmasnuryilmaz/tdp43-soce-manuscript/releases/tag/v1.0.7. The complete 23 GB rMATS output is not redistributed; the package provides the thresholded event table and the scripts and public accessions required to regenerate it. The package downloads the two externally hosted resources it needs (the recount3 junction matrix for SRP270799 and the GSE307054 count table) at run time. Every rMATS event that meets the thresholds of Section 2.3, with its event coordinates, form lengths and raw junction counts, is provided as Supplementary Table S3. RT-qPCR, Fura-2 and WST-1 source data, including biological-replicate RT-qPCR values, well-level Fura-2 and WST-1 values, and the summaries behind every laboratory figure panel, are provided in Supplementary Table S1.</w:t>
       </w:r>
     </w:p>
     <w:bookmarkEnd w:id="41"/>
@@ -10048,7 +10048,14 @@
           <w:b w:val="0"/>
           <w:bCs/>
         </w:rPr>
-        <w:t xml:space="preserve"> Laboratory source data: raw Ct and relative expression from four technical RT-qPCR measurements per group, Fura-2 amplitudes from three wells per group on one culture plate, WST-1 values from four wells of one experiment, primers and thermal profile. All laboratory summaries are descriptive.</w:t>
+        <w:t xml:space="preserve"> Laboratory source data: raw Ct and relative expression for four biological RT-qPCR replicates per group, Fura-2 amplitudes from three wells per group on one plate, WST-1 values from four wells of one experiment, primers and thermal profile. RT-qPCR includes Holm-adjusted ΔCt tests; Fura-2 and WST-1 are descriptive.</w:t>
+      </w:r>
+      <w:r>
+        <w:rPr>
+          <w:b w:val="0"/>
+          <w:bCs/>
+        </w:rPr>
+        <w:t xml:space="preserve"/>
       </w:r>
       <w:r>
         <w:rPr>

</xml_diff>